<commit_message>
Basics of Krama paatam article
</commit_message>
<xml_diff>
--- a/TS Jatai Ghanam Project/TS 1.1/TS 1.1 Introduction Notes.docx
+++ b/TS Jatai Ghanam Project/TS 1.1/TS 1.1 Introduction Notes.docx
@@ -1,6 +1,6 @@
 
 <file path=word/document.xml><?xml version="1.0" encoding="utf-8"?>
-<w:document xmlns:wpc="http://schemas.microsoft.com/office/word/2010/wordprocessingCanvas" xmlns:cx="http://schemas.microsoft.com/office/drawing/2014/chartex" xmlns:cx1="http://schemas.microsoft.com/office/drawing/2015/9/8/chartex" xmlns:cx2="http://schemas.microsoft.com/office/drawing/2015/10/21/chartex" xmlns:cx3="http://schemas.microsoft.com/office/drawing/2016/5/9/chartex" xmlns:cx4="http://schemas.microsoft.com/office/drawing/2016/5/10/chartex" xmlns:cx5="http://schemas.microsoft.com/office/drawing/2016/5/11/chartex" xmlns:cx6="http://schemas.microsoft.com/office/drawing/2016/5/12/chartex" xmlns:cx7="http://schemas.microsoft.com/office/drawing/2016/5/13/chartex" xmlns:cx8="http://schemas.microsoft.com/office/drawing/2016/5/14/chartex" xmlns:mc="http://schemas.openxmlformats.org/markup-compatibility/2006" xmlns:aink="http://schemas.microsoft.com/office/drawing/2016/ink" xmlns:am3d="http://schemas.microsoft.com/office/drawing/2017/model3d" xmlns:o="urn:schemas-microsoft-com:office:office" xmlns:oel="http://schemas.microsoft.com/office/2019/extlst" xmlns:r="http://schemas.openxmlformats.org/officeDocument/2006/relationships" xmlns:m="http://schemas.openxmlformats.org/officeDocument/2006/math" xmlns:v="urn:schemas-microsoft-com:vml" xmlns:wp14="http://schemas.microsoft.com/office/word/2010/wordprocessingDrawing" xmlns:wp="http://schemas.openxmlformats.org/drawingml/2006/wordprocessingDrawing" xmlns:w10="urn:schemas-microsoft-com:office:word" xmlns:w="http://schemas.openxmlformats.org/wordprocessingml/2006/main" xmlns:w14="http://schemas.microsoft.com/office/word/2010/wordml" xmlns:w15="http://schemas.microsoft.com/office/word/2012/wordml" xmlns:w16cex="http://schemas.microsoft.com/office/word/2018/wordml/cex" xmlns:w16cid="http://schemas.microsoft.com/office/word/2016/wordml/cid" xmlns:w16="http://schemas.microsoft.com/office/word/2018/wordml" xmlns:w16sdtdh="http://schemas.microsoft.com/office/word/2020/wordml/sdtdatahash" xmlns:w16se="http://schemas.microsoft.com/office/word/2015/wordml/symex" xmlns:wpg="http://schemas.microsoft.com/office/word/2010/wordprocessingGroup" xmlns:wpi="http://schemas.microsoft.com/office/word/2010/wordprocessingInk" xmlns:wne="http://schemas.microsoft.com/office/word/2006/wordml" xmlns:wps="http://schemas.microsoft.com/office/word/2010/wordprocessingShape" mc:Ignorable="w14 w15 w16se w16cid w16 w16cex w16sdtdh wp14">
+<w:document xmlns:wpc="http://schemas.microsoft.com/office/word/2010/wordprocessingCanvas" xmlns:cx="http://schemas.microsoft.com/office/drawing/2014/chartex" xmlns:cx1="http://schemas.microsoft.com/office/drawing/2015/9/8/chartex" xmlns:cx2="http://schemas.microsoft.com/office/drawing/2015/10/21/chartex" xmlns:cx3="http://schemas.microsoft.com/office/drawing/2016/5/9/chartex" xmlns:cx4="http://schemas.microsoft.com/office/drawing/2016/5/10/chartex" xmlns:cx5="http://schemas.microsoft.com/office/drawing/2016/5/11/chartex" xmlns:cx6="http://schemas.microsoft.com/office/drawing/2016/5/12/chartex" xmlns:cx7="http://schemas.microsoft.com/office/drawing/2016/5/13/chartex" xmlns:cx8="http://schemas.microsoft.com/office/drawing/2016/5/14/chartex" xmlns:mc="http://schemas.openxmlformats.org/markup-compatibility/2006" xmlns:aink="http://schemas.microsoft.com/office/drawing/2016/ink" xmlns:am3d="http://schemas.microsoft.com/office/drawing/2017/model3d" xmlns:o="urn:schemas-microsoft-com:office:office" xmlns:oel="http://schemas.microsoft.com/office/2019/extlst" xmlns:r="http://schemas.openxmlformats.org/officeDocument/2006/relationships" xmlns:m="http://schemas.openxmlformats.org/officeDocument/2006/math" xmlns:v="urn:schemas-microsoft-com:vml" xmlns:wp14="http://schemas.microsoft.com/office/word/2010/wordprocessingDrawing" xmlns:wp="http://schemas.openxmlformats.org/drawingml/2006/wordprocessingDrawing" xmlns:w10="urn:schemas-microsoft-com:office:word" xmlns:w="http://schemas.openxmlformats.org/wordprocessingml/2006/main" xmlns:w14="http://schemas.microsoft.com/office/word/2010/wordml" xmlns:w15="http://schemas.microsoft.com/office/word/2012/wordml" xmlns:w16cex="http://schemas.microsoft.com/office/word/2018/wordml/cex" xmlns:w16cid="http://schemas.microsoft.com/office/word/2016/wordml/cid" xmlns:w16="http://schemas.microsoft.com/office/word/2018/wordml" xmlns:w16du="http://schemas.microsoft.com/office/word/2023/wordml/word16du" xmlns:w16sdtdh="http://schemas.microsoft.com/office/word/2020/wordml/sdtdatahash" xmlns:w16sdtfl="http://schemas.microsoft.com/office/word/2024/wordml/sdtformatlock" xmlns:w16se="http://schemas.microsoft.com/office/word/2015/wordml/symex" xmlns:wpg="http://schemas.microsoft.com/office/word/2010/wordprocessingGroup" xmlns:wpi="http://schemas.microsoft.com/office/word/2010/wordprocessingInk" xmlns:wne="http://schemas.microsoft.com/office/word/2006/wordml" xmlns:wps="http://schemas.microsoft.com/office/word/2010/wordprocessingShape" mc:Ignorable="w14 w15 w16se w16cid w16 w16cex w16sdtdh w16sdtfl w16du wp14">
   <w:body>
     <w:p>
       <w:pPr>
@@ -172,7 +172,25 @@
           <w:sz w:val="28"/>
           <w:szCs w:val="28"/>
         </w:rPr>
-        <w:t>We intend to make only sample JatA/Ghana documents of sample Prasnas in Sanskrit, Tamil and Malayalam languages.</w:t>
+        <w:t xml:space="preserve">We intend to make only sample JatA/Ghana documents of sample </w:t>
+      </w:r>
+      <w:r>
+        <w:rPr>
+          <w:rFonts w:ascii="Arial" w:hAnsi="Arial" w:cs="Arial"/>
+          <w:color w:val="000000"/>
+          <w:sz w:val="28"/>
+          <w:szCs w:val="28"/>
+        </w:rPr>
+        <w:t>PraSnas</w:t>
+      </w:r>
+      <w:r>
+        <w:rPr>
+          <w:rFonts w:ascii="Arial" w:hAnsi="Arial" w:cs="Arial"/>
+          <w:color w:val="000000"/>
+          <w:sz w:val="28"/>
+          <w:szCs w:val="28"/>
+        </w:rPr>
+        <w:t xml:space="preserve"> in Sanskrit, Tamil and Malayalam languages.</w:t>
       </w:r>
     </w:p>
     <w:p>
@@ -553,7 +571,23 @@
           <w:sz w:val="28"/>
           <w:szCs w:val="28"/>
         </w:rPr>
-        <w:t>We have tried to refer to SIkSha materials like PratiSakyam (PS), JatA MaNi (JM), JatA DarpaNam (JD), Ghana DarpaNam (GD) and Ghana Sandhi (GS).</w:t>
+        <w:t xml:space="preserve">We have tried to refer to SIkSha materials like </w:t>
+      </w:r>
+      <w:r>
+        <w:rPr>
+          <w:rFonts w:ascii="Arial" w:hAnsi="Arial" w:cs="Arial"/>
+          <w:sz w:val="28"/>
+          <w:szCs w:val="28"/>
+        </w:rPr>
+        <w:t>PrAtiSAkyam</w:t>
+      </w:r>
+      <w:r>
+        <w:rPr>
+          <w:rFonts w:ascii="Arial" w:hAnsi="Arial" w:cs="Arial"/>
+          <w:sz w:val="28"/>
+          <w:szCs w:val="28"/>
+        </w:rPr>
+        <w:t xml:space="preserve"> (PS), JatA MaNi (JM), JatA DarpaNam (JD), Ghana DarpaNam (GD) and Ghana Sandhi (GS).</w:t>
       </w:r>
     </w:p>
     <w:p>
@@ -746,6 +780,7 @@
           <w:u w:val="single"/>
         </w:rPr>
       </w:pPr>
+      <w:proofErr w:type="spellStart"/>
       <w:r>
         <w:rPr>
           <w:rFonts w:ascii="Arial" w:hAnsi="Arial" w:cs="Arial"/>
@@ -756,7 +791,20 @@
           <w:szCs w:val="32"/>
           <w:u w:val="single"/>
         </w:rPr>
-        <w:t>Addtitional Reference to SIkShA materials</w:t>
+        <w:t>Addtitional</w:t>
+      </w:r>
+      <w:proofErr w:type="spellEnd"/>
+      <w:r>
+        <w:rPr>
+          <w:rFonts w:ascii="Arial" w:hAnsi="Arial" w:cs="Arial"/>
+          <w:b/>
+          <w:bCs/>
+          <w:color w:val="000000"/>
+          <w:sz w:val="32"/>
+          <w:szCs w:val="32"/>
+          <w:u w:val="single"/>
+        </w:rPr>
+        <w:t xml:space="preserve"> Reference to SIkShA materials</w:t>
       </w:r>
       <w:r>
         <w:rPr>
@@ -815,7 +863,43 @@
           <w:sz w:val="28"/>
           <w:szCs w:val="28"/>
         </w:rPr>
-        <w:t xml:space="preserve">Reference of SikShA materials like Ghana Sandhi (GS), PratiSakyam (PS), JatA Mani (JM), Jata DarpaNam (JD), Ghana DarpaNam (GD) have been given in the brackets to the best of our reference. This should help students to understand the specific Siksha that is being applied. </w:t>
+        <w:t xml:space="preserve">Reference of </w:t>
+      </w:r>
+      <w:r>
+        <w:rPr>
+          <w:rFonts w:ascii="Arial" w:hAnsi="Arial" w:cs="Arial"/>
+          <w:color w:val="000000"/>
+          <w:sz w:val="28"/>
+          <w:szCs w:val="28"/>
+        </w:rPr>
+        <w:t>SIkShA</w:t>
+      </w:r>
+      <w:r>
+        <w:rPr>
+          <w:rFonts w:ascii="Arial" w:hAnsi="Arial" w:cs="Arial"/>
+          <w:color w:val="000000"/>
+          <w:sz w:val="28"/>
+          <w:szCs w:val="28"/>
+        </w:rPr>
+        <w:t xml:space="preserve"> materials like Ghana Sandhi (GS), </w:t>
+      </w:r>
+      <w:r>
+        <w:rPr>
+          <w:rFonts w:ascii="Arial" w:hAnsi="Arial" w:cs="Arial"/>
+          <w:color w:val="000000"/>
+          <w:sz w:val="28"/>
+          <w:szCs w:val="28"/>
+        </w:rPr>
+        <w:t>PrAtiSAkyam</w:t>
+      </w:r>
+      <w:r>
+        <w:rPr>
+          <w:rFonts w:ascii="Arial" w:hAnsi="Arial" w:cs="Arial"/>
+          <w:color w:val="000000"/>
+          <w:sz w:val="28"/>
+          <w:szCs w:val="28"/>
+        </w:rPr>
+        <w:t xml:space="preserve"> (PS), JatA Mani (JM), Jata DarpaNam (JD), Ghana DarpaNam (GD) have been given in the brackets to the best of our reference. This should help students to understand the specific Siksha that is being applied. </w:t>
       </w:r>
     </w:p>
     <w:p>
@@ -844,7 +928,54 @@
           <w:sz w:val="28"/>
           <w:szCs w:val="28"/>
         </w:rPr>
-        <w:t xml:space="preserve">We have not given Paata-bhedhams arising out of different SikShAs as we have not completed our analysis. We would cover it over a period of time and </w:t>
+        <w:t xml:space="preserve">We have not given Paata-bhedhams arising out of different </w:t>
+      </w:r>
+      <w:r>
+        <w:rPr>
+          <w:rFonts w:ascii="Arial" w:hAnsi="Arial" w:cs="Arial"/>
+          <w:color w:val="000000"/>
+          <w:sz w:val="28"/>
+          <w:szCs w:val="28"/>
+        </w:rPr>
+        <w:t>SIkShAs</w:t>
+      </w:r>
+      <w:r>
+        <w:rPr>
+          <w:rFonts w:ascii="Arial" w:hAnsi="Arial" w:cs="Arial"/>
+          <w:color w:val="000000"/>
+          <w:sz w:val="28"/>
+          <w:szCs w:val="28"/>
+        </w:rPr>
+        <w:t xml:space="preserve"> </w:t>
+      </w:r>
+    </w:p>
+    <w:p>
+      <w:pPr>
+        <w:pStyle w:val="ListParagraph"/>
+        <w:widowControl w:val="0"/>
+        <w:numPr>
+          <w:ilvl w:val="0"/>
+          <w:numId w:val="14"/>
+        </w:numPr>
+        <w:autoSpaceDE w:val="0"/>
+        <w:autoSpaceDN w:val="0"/>
+        <w:adjustRightInd w:val="0"/>
+        <w:spacing w:after="0" w:line="240" w:lineRule="auto"/>
+        <w:rPr>
+          <w:rFonts w:ascii="Arial" w:hAnsi="Arial" w:cs="Arial"/>
+          <w:color w:val="000000"/>
+          <w:sz w:val="28"/>
+          <w:szCs w:val="28"/>
+        </w:rPr>
+      </w:pPr>
+      <w:r>
+        <w:rPr>
+          <w:rFonts w:ascii="Arial" w:hAnsi="Arial" w:cs="Arial"/>
+          <w:color w:val="000000"/>
+          <w:sz w:val="28"/>
+          <w:szCs w:val="28"/>
+        </w:rPr>
+        <w:t xml:space="preserve"> as we have not completed our analysis. We would cover it over a period of time and </w:t>
       </w:r>
       <w:r>
         <w:rPr>
@@ -1007,7 +1138,31 @@
           <w:sz w:val="32"/>
           <w:szCs w:val="40"/>
         </w:rPr>
-        <w:t>(aqÉç)</w:t>
+        <w:t>(</w:t>
+      </w:r>
+      <w:proofErr w:type="spellStart"/>
+      <w:r>
+        <w:rPr>
+          <w:rFonts w:ascii="BRH Devanagari Extra" w:hAnsi="BRH Devanagari Extra" w:cs="BRH Devanagari Extra"/>
+          <w:b/>
+          <w:bCs/>
+          <w:color w:val="000000"/>
+          <w:sz w:val="32"/>
+          <w:szCs w:val="40"/>
+        </w:rPr>
+        <w:t>aqÉç</w:t>
+      </w:r>
+      <w:proofErr w:type="spellEnd"/>
+      <w:r>
+        <w:rPr>
+          <w:rFonts w:ascii="BRH Devanagari Extra" w:hAnsi="BRH Devanagari Extra" w:cs="BRH Devanagari Extra"/>
+          <w:b/>
+          <w:bCs/>
+          <w:color w:val="000000"/>
+          <w:sz w:val="32"/>
+          <w:szCs w:val="40"/>
+        </w:rPr>
+        <w:t>)</w:t>
       </w:r>
       <w:r>
         <w:rPr>
@@ -1040,7 +1195,31 @@
           <w:sz w:val="32"/>
           <w:szCs w:val="40"/>
         </w:rPr>
-        <w:t>(aaÉç)</w:t>
+        <w:t>(</w:t>
+      </w:r>
+      <w:proofErr w:type="spellStart"/>
+      <w:r>
+        <w:rPr>
+          <w:rFonts w:ascii="BRH Devanagari Extra" w:hAnsi="BRH Devanagari Extra" w:cs="BRH Devanagari Extra"/>
+          <w:b/>
+          <w:bCs/>
+          <w:color w:val="000000"/>
+          <w:sz w:val="32"/>
+          <w:szCs w:val="40"/>
+        </w:rPr>
+        <w:t>aaÉç</w:t>
+      </w:r>
+      <w:proofErr w:type="spellEnd"/>
+      <w:r>
+        <w:rPr>
+          <w:rFonts w:ascii="BRH Devanagari Extra" w:hAnsi="BRH Devanagari Extra" w:cs="BRH Devanagari Extra"/>
+          <w:b/>
+          <w:bCs/>
+          <w:color w:val="000000"/>
+          <w:sz w:val="32"/>
+          <w:szCs w:val="40"/>
+        </w:rPr>
+        <w:t>)</w:t>
       </w:r>
       <w:r>
         <w:rPr>
@@ -1150,7 +1329,47 @@
           <w:sz w:val="28"/>
           <w:szCs w:val="28"/>
         </w:rPr>
-        <w:t>pATha bedhams are indicated in brackets below the respective jata and ghana vAkyams. (added)</w:t>
+        <w:t xml:space="preserve">pATha bedhams are indicated in brackets below the respective </w:t>
+      </w:r>
+      <w:r>
+        <w:rPr>
+          <w:rFonts w:ascii="Arial" w:hAnsi="Arial" w:cs="Arial"/>
+          <w:b/>
+          <w:bCs/>
+          <w:sz w:val="28"/>
+          <w:szCs w:val="28"/>
+        </w:rPr>
+        <w:t>J</w:t>
+      </w:r>
+      <w:r>
+        <w:rPr>
+          <w:rFonts w:ascii="Arial" w:hAnsi="Arial" w:cs="Arial"/>
+          <w:b/>
+          <w:bCs/>
+          <w:sz w:val="28"/>
+          <w:szCs w:val="28"/>
+        </w:rPr>
+        <w:t xml:space="preserve">ata and </w:t>
+      </w:r>
+      <w:r>
+        <w:rPr>
+          <w:rFonts w:ascii="Arial" w:hAnsi="Arial" w:cs="Arial"/>
+          <w:b/>
+          <w:bCs/>
+          <w:sz w:val="28"/>
+          <w:szCs w:val="28"/>
+        </w:rPr>
+        <w:t>G</w:t>
+      </w:r>
+      <w:r>
+        <w:rPr>
+          <w:rFonts w:ascii="Arial" w:hAnsi="Arial" w:cs="Arial"/>
+          <w:b/>
+          <w:bCs/>
+          <w:sz w:val="28"/>
+          <w:szCs w:val="28"/>
+        </w:rPr>
+        <w:t xml:space="preserve">hana vAkyams. </w:t>
       </w:r>
       <w:bookmarkEnd w:id="1"/>
       <w:r>
@@ -1241,7 +1460,29 @@
           <w:sz w:val="28"/>
           <w:szCs w:val="28"/>
         </w:rPr>
-        <w:t>doesnot</w:t>
+        <w:t>does</w:t>
+      </w:r>
+      <w:r>
+        <w:rPr>
+          <w:rFonts w:ascii="Arial" w:hAnsi="Arial" w:cs="Arial"/>
+          <w:b/>
+          <w:bCs/>
+          <w:color w:val="000000"/>
+          <w:sz w:val="28"/>
+          <w:szCs w:val="28"/>
+        </w:rPr>
+        <w:t xml:space="preserve"> </w:t>
+      </w:r>
+      <w:r>
+        <w:rPr>
+          <w:rFonts w:ascii="Arial" w:hAnsi="Arial" w:cs="Arial"/>
+          <w:b/>
+          <w:bCs/>
+          <w:color w:val="000000"/>
+          <w:sz w:val="28"/>
+          <w:szCs w:val="28"/>
+        </w:rPr>
+        <w:t>not</w:t>
       </w:r>
       <w:r>
         <w:rPr>
@@ -1270,7 +1511,247 @@
           <w:sz w:val="28"/>
           <w:szCs w:val="28"/>
         </w:rPr>
-        <w:t xml:space="preserve">any Padam with Padam split with iti (like ganapatimiti gaNa – patim, bAhuByAmiti bAhu - byAm) or a Pragraha. (Like, uqtO iti#, athOq iti#). </w:t>
+        <w:t xml:space="preserve">any Padam with Padam split with </w:t>
+      </w:r>
+      <w:proofErr w:type="spellStart"/>
+      <w:r>
+        <w:rPr>
+          <w:rFonts w:ascii="Arial" w:hAnsi="Arial" w:cs="Arial"/>
+          <w:color w:val="000000"/>
+          <w:sz w:val="28"/>
+          <w:szCs w:val="28"/>
+        </w:rPr>
+        <w:t>iti</w:t>
+      </w:r>
+      <w:proofErr w:type="spellEnd"/>
+      <w:r>
+        <w:rPr>
+          <w:rFonts w:ascii="Arial" w:hAnsi="Arial" w:cs="Arial"/>
+          <w:color w:val="000000"/>
+          <w:sz w:val="28"/>
+          <w:szCs w:val="28"/>
+        </w:rPr>
+        <w:t xml:space="preserve"> (like </w:t>
+      </w:r>
+      <w:proofErr w:type="spellStart"/>
+      <w:r>
+        <w:rPr>
+          <w:rFonts w:ascii="Arial" w:hAnsi="Arial" w:cs="Arial"/>
+          <w:color w:val="000000"/>
+          <w:sz w:val="28"/>
+          <w:szCs w:val="28"/>
+        </w:rPr>
+        <w:t>ganapatimiti</w:t>
+      </w:r>
+      <w:proofErr w:type="spellEnd"/>
+      <w:r>
+        <w:rPr>
+          <w:rFonts w:ascii="Arial" w:hAnsi="Arial" w:cs="Arial"/>
+          <w:color w:val="000000"/>
+          <w:sz w:val="28"/>
+          <w:szCs w:val="28"/>
+        </w:rPr>
+        <w:t xml:space="preserve"> </w:t>
+      </w:r>
+      <w:proofErr w:type="spellStart"/>
+      <w:r>
+        <w:rPr>
+          <w:rFonts w:ascii="Arial" w:hAnsi="Arial" w:cs="Arial"/>
+          <w:color w:val="000000"/>
+          <w:sz w:val="28"/>
+          <w:szCs w:val="28"/>
+        </w:rPr>
+        <w:t>gaNa</w:t>
+      </w:r>
+      <w:proofErr w:type="spellEnd"/>
+      <w:r>
+        <w:rPr>
+          <w:rFonts w:ascii="Arial" w:hAnsi="Arial" w:cs="Arial"/>
+          <w:color w:val="000000"/>
+          <w:sz w:val="28"/>
+          <w:szCs w:val="28"/>
+        </w:rPr>
+        <w:t xml:space="preserve"> – </w:t>
+      </w:r>
+      <w:proofErr w:type="spellStart"/>
+      <w:r>
+        <w:rPr>
+          <w:rFonts w:ascii="Arial" w:hAnsi="Arial" w:cs="Arial"/>
+          <w:color w:val="000000"/>
+          <w:sz w:val="28"/>
+          <w:szCs w:val="28"/>
+        </w:rPr>
+        <w:t>patim</w:t>
+      </w:r>
+      <w:proofErr w:type="spellEnd"/>
+      <w:r>
+        <w:rPr>
+          <w:rFonts w:ascii="Arial" w:hAnsi="Arial" w:cs="Arial"/>
+          <w:color w:val="000000"/>
+          <w:sz w:val="28"/>
+          <w:szCs w:val="28"/>
+        </w:rPr>
+        <w:t xml:space="preserve">, </w:t>
+      </w:r>
+      <w:proofErr w:type="spellStart"/>
+      <w:r>
+        <w:rPr>
+          <w:rFonts w:ascii="Arial" w:hAnsi="Arial" w:cs="Arial"/>
+          <w:color w:val="000000"/>
+          <w:sz w:val="28"/>
+          <w:szCs w:val="28"/>
+        </w:rPr>
+        <w:t>bAhuByAmiti</w:t>
+      </w:r>
+      <w:proofErr w:type="spellEnd"/>
+      <w:r>
+        <w:rPr>
+          <w:rFonts w:ascii="Arial" w:hAnsi="Arial" w:cs="Arial"/>
+          <w:color w:val="000000"/>
+          <w:sz w:val="28"/>
+          <w:szCs w:val="28"/>
+        </w:rPr>
+        <w:t xml:space="preserve"> </w:t>
+      </w:r>
+      <w:proofErr w:type="spellStart"/>
+      <w:r>
+        <w:rPr>
+          <w:rFonts w:ascii="Arial" w:hAnsi="Arial" w:cs="Arial"/>
+          <w:color w:val="000000"/>
+          <w:sz w:val="28"/>
+          <w:szCs w:val="28"/>
+        </w:rPr>
+        <w:t>bAhu</w:t>
+      </w:r>
+      <w:proofErr w:type="spellEnd"/>
+      <w:r>
+        <w:rPr>
+          <w:rFonts w:ascii="Arial" w:hAnsi="Arial" w:cs="Arial"/>
+          <w:color w:val="000000"/>
+          <w:sz w:val="28"/>
+          <w:szCs w:val="28"/>
+        </w:rPr>
+        <w:t xml:space="preserve"> - </w:t>
+      </w:r>
+      <w:proofErr w:type="spellStart"/>
+      <w:r>
+        <w:rPr>
+          <w:rFonts w:ascii="Arial" w:hAnsi="Arial" w:cs="Arial"/>
+          <w:color w:val="000000"/>
+          <w:sz w:val="28"/>
+          <w:szCs w:val="28"/>
+        </w:rPr>
+        <w:t>byAm</w:t>
+      </w:r>
+      <w:proofErr w:type="spellEnd"/>
+      <w:r>
+        <w:rPr>
+          <w:rFonts w:ascii="Arial" w:hAnsi="Arial" w:cs="Arial"/>
+          <w:color w:val="000000"/>
+          <w:sz w:val="28"/>
+          <w:szCs w:val="28"/>
+        </w:rPr>
+        <w:t xml:space="preserve">) or a </w:t>
+      </w:r>
+      <w:proofErr w:type="spellStart"/>
+      <w:r>
+        <w:rPr>
+          <w:rFonts w:ascii="Arial" w:hAnsi="Arial" w:cs="Arial"/>
+          <w:color w:val="000000"/>
+          <w:sz w:val="28"/>
+          <w:szCs w:val="28"/>
+        </w:rPr>
+        <w:t>Pragraha</w:t>
+      </w:r>
+      <w:proofErr w:type="spellEnd"/>
+      <w:r>
+        <w:rPr>
+          <w:rFonts w:ascii="Arial" w:hAnsi="Arial" w:cs="Arial"/>
+          <w:color w:val="000000"/>
+          <w:sz w:val="28"/>
+          <w:szCs w:val="28"/>
+        </w:rPr>
+        <w:t xml:space="preserve">. (Like, </w:t>
+      </w:r>
+      <w:proofErr w:type="spellStart"/>
+      <w:r>
+        <w:rPr>
+          <w:rFonts w:ascii="Arial" w:hAnsi="Arial" w:cs="Arial"/>
+          <w:color w:val="000000"/>
+          <w:sz w:val="28"/>
+          <w:szCs w:val="28"/>
+        </w:rPr>
+        <w:t>uqtO</w:t>
+      </w:r>
+      <w:proofErr w:type="spellEnd"/>
+      <w:r>
+        <w:rPr>
+          <w:rFonts w:ascii="Arial" w:hAnsi="Arial" w:cs="Arial"/>
+          <w:color w:val="000000"/>
+          <w:sz w:val="28"/>
+          <w:szCs w:val="28"/>
+        </w:rPr>
+        <w:t xml:space="preserve"> </w:t>
+      </w:r>
+      <w:proofErr w:type="spellStart"/>
+      <w:r>
+        <w:rPr>
+          <w:rFonts w:ascii="Arial" w:hAnsi="Arial" w:cs="Arial"/>
+          <w:color w:val="000000"/>
+          <w:sz w:val="28"/>
+          <w:szCs w:val="28"/>
+        </w:rPr>
+        <w:t>iti</w:t>
+      </w:r>
+      <w:proofErr w:type="spellEnd"/>
+      <w:r>
+        <w:rPr>
+          <w:rFonts w:ascii="Arial" w:hAnsi="Arial" w:cs="Arial"/>
+          <w:color w:val="000000"/>
+          <w:sz w:val="28"/>
+          <w:szCs w:val="28"/>
+        </w:rPr>
+        <w:t xml:space="preserve">#, </w:t>
+      </w:r>
+      <w:proofErr w:type="spellStart"/>
+      <w:r>
+        <w:rPr>
+          <w:rFonts w:ascii="Arial" w:hAnsi="Arial" w:cs="Arial"/>
+          <w:color w:val="000000"/>
+          <w:sz w:val="28"/>
+          <w:szCs w:val="28"/>
+        </w:rPr>
+        <w:t>athOq</w:t>
+      </w:r>
+      <w:proofErr w:type="spellEnd"/>
+      <w:r>
+        <w:rPr>
+          <w:rFonts w:ascii="Arial" w:hAnsi="Arial" w:cs="Arial"/>
+          <w:color w:val="000000"/>
+          <w:sz w:val="28"/>
+          <w:szCs w:val="28"/>
+        </w:rPr>
+        <w:t xml:space="preserve"> </w:t>
+      </w:r>
+      <w:proofErr w:type="spellStart"/>
+      <w:r>
+        <w:rPr>
+          <w:rFonts w:ascii="Arial" w:hAnsi="Arial" w:cs="Arial"/>
+          <w:color w:val="000000"/>
+          <w:sz w:val="28"/>
+          <w:szCs w:val="28"/>
+        </w:rPr>
+        <w:t>iti</w:t>
+      </w:r>
+      <w:proofErr w:type="spellEnd"/>
+      <w:r>
+        <w:rPr>
+          <w:rFonts w:ascii="Arial" w:hAnsi="Arial" w:cs="Arial"/>
+          <w:color w:val="000000"/>
+          <w:sz w:val="28"/>
+          <w:szCs w:val="28"/>
+        </w:rPr>
+        <w:t xml:space="preserve">#). </w:t>
       </w:r>
       <w:r>
         <w:rPr>
@@ -1401,7 +1882,27 @@
                 <w:sz w:val="28"/>
                 <w:szCs w:val="28"/>
               </w:rPr>
-              <w:t xml:space="preserve">Pada paatam </w:t>
+              <w:t xml:space="preserve">Pada </w:t>
+            </w:r>
+            <w:proofErr w:type="spellStart"/>
+            <w:r>
+              <w:rPr>
+                <w:rFonts w:ascii="Arial" w:hAnsi="Arial" w:cs="Arial"/>
+                <w:color w:val="000000"/>
+                <w:sz w:val="28"/>
+                <w:szCs w:val="28"/>
+              </w:rPr>
+              <w:t>paatam</w:t>
+            </w:r>
+            <w:proofErr w:type="spellEnd"/>
+            <w:r>
+              <w:rPr>
+                <w:rFonts w:ascii="Arial" w:hAnsi="Arial" w:cs="Arial"/>
+                <w:color w:val="000000"/>
+                <w:sz w:val="28"/>
+                <w:szCs w:val="28"/>
+              </w:rPr>
+              <w:t xml:space="preserve"> </w:t>
             </w:r>
           </w:p>
           <w:p>
@@ -1487,7 +1988,27 @@
                 <w:sz w:val="28"/>
                 <w:szCs w:val="28"/>
               </w:rPr>
-              <w:t xml:space="preserve">krama paatam </w:t>
+              <w:t xml:space="preserve">krama </w:t>
+            </w:r>
+            <w:proofErr w:type="spellStart"/>
+            <w:r>
+              <w:rPr>
+                <w:rFonts w:ascii="Arial" w:hAnsi="Arial" w:cs="Arial"/>
+                <w:color w:val="000000"/>
+                <w:sz w:val="28"/>
+                <w:szCs w:val="28"/>
+              </w:rPr>
+              <w:t>paatam</w:t>
+            </w:r>
+            <w:proofErr w:type="spellEnd"/>
+            <w:r>
+              <w:rPr>
+                <w:rFonts w:ascii="Arial" w:hAnsi="Arial" w:cs="Arial"/>
+                <w:color w:val="000000"/>
+                <w:sz w:val="28"/>
+                <w:szCs w:val="28"/>
+              </w:rPr>
+              <w:t xml:space="preserve"> </w:t>
             </w:r>
           </w:p>
           <w:p>
@@ -1532,8 +2053,9 @@
                 <w:sz w:val="28"/>
                 <w:szCs w:val="28"/>
               </w:rPr>
-              <w:t xml:space="preserve">(1,2), (2,3), (3,4) (4.5) (5,6) (6,7) and 7 iti 7 </w:t>
-            </w:r>
+              <w:t xml:space="preserve">(1,2), (2,3), (3,4) (4.5) (5,6) (6,7) and 7 </w:t>
+            </w:r>
+            <w:proofErr w:type="spellStart"/>
             <w:r>
               <w:rPr>
                 <w:rFonts w:ascii="Arial" w:hAnsi="Arial" w:cs="Arial"/>
@@ -1541,6 +2063,25 @@
                 <w:sz w:val="28"/>
                 <w:szCs w:val="28"/>
               </w:rPr>
+              <w:t>iti</w:t>
+            </w:r>
+            <w:proofErr w:type="spellEnd"/>
+            <w:r>
+              <w:rPr>
+                <w:rFonts w:ascii="Arial" w:hAnsi="Arial" w:cs="Arial"/>
+                <w:color w:val="000000"/>
+                <w:sz w:val="28"/>
+                <w:szCs w:val="28"/>
+              </w:rPr>
+              <w:t xml:space="preserve"> 7 </w:t>
+            </w:r>
+            <w:r>
+              <w:rPr>
+                <w:rFonts w:ascii="Arial" w:hAnsi="Arial" w:cs="Arial"/>
+                <w:color w:val="000000"/>
+                <w:sz w:val="28"/>
+                <w:szCs w:val="28"/>
+              </w:rPr>
               <w:br/>
             </w:r>
             <w:r>
@@ -1582,8 +2123,19 @@
                 <w:sz w:val="28"/>
                 <w:szCs w:val="28"/>
               </w:rPr>
-              <w:t>Jata paatam</w:t>
-            </w:r>
+              <w:t xml:space="preserve">Jata </w:t>
+            </w:r>
+            <w:proofErr w:type="spellStart"/>
+            <w:r>
+              <w:rPr>
+                <w:rFonts w:ascii="Arial" w:hAnsi="Arial" w:cs="Arial"/>
+                <w:color w:val="000000"/>
+                <w:sz w:val="28"/>
+                <w:szCs w:val="28"/>
+              </w:rPr>
+              <w:t>paatam</w:t>
+            </w:r>
+            <w:proofErr w:type="spellEnd"/>
           </w:p>
         </w:tc>
         <w:tc>
@@ -1653,8 +2205,9 @@
                 <w:sz w:val="28"/>
                 <w:szCs w:val="28"/>
               </w:rPr>
-              <w:t xml:space="preserve">(1,2), (2,3), (3,4) (4.5) (5,6) (6,7) and 7 iti 7 </w:t>
-            </w:r>
+              <w:t xml:space="preserve">(1,2), (2,3), (3,4) (4.5) (5,6) (6,7) and 7 </w:t>
+            </w:r>
+            <w:proofErr w:type="spellStart"/>
             <w:r>
               <w:rPr>
                 <w:rFonts w:ascii="Arial" w:hAnsi="Arial" w:cs="Arial"/>
@@ -1662,29 +2215,61 @@
                 <w:sz w:val="28"/>
                 <w:szCs w:val="28"/>
               </w:rPr>
-              <w:br/>
-            </w:r>
+              <w:t>iti</w:t>
+            </w:r>
+            <w:proofErr w:type="spellEnd"/>
             <w:r>
               <w:rPr>
                 <w:rFonts w:ascii="Arial" w:hAnsi="Arial" w:cs="Arial"/>
-                <w:b/>
-                <w:bCs/>
                 <w:color w:val="000000"/>
                 <w:sz w:val="28"/>
                 <w:szCs w:val="28"/>
               </w:rPr>
-              <w:t xml:space="preserve">(Total 7 </w:t>
+              <w:t xml:space="preserve"> 7 </w:t>
             </w:r>
             <w:r>
               <w:rPr>
                 <w:rFonts w:ascii="Arial" w:hAnsi="Arial" w:cs="Arial"/>
-                <w:b/>
-                <w:bCs/>
                 <w:color w:val="000000"/>
                 <w:sz w:val="28"/>
                 <w:szCs w:val="28"/>
               </w:rPr>
-              <w:t xml:space="preserve">jata </w:t>
+              <w:br/>
+            </w:r>
+            <w:r>
+              <w:rPr>
+                <w:rFonts w:ascii="Arial" w:hAnsi="Arial" w:cs="Arial"/>
+                <w:b/>
+                <w:bCs/>
+                <w:color w:val="000000"/>
+                <w:sz w:val="28"/>
+                <w:szCs w:val="28"/>
+              </w:rPr>
+              <w:t xml:space="preserve">(Total 7 </w:t>
+            </w:r>
+            <w:proofErr w:type="spellStart"/>
+            <w:r>
+              <w:rPr>
+                <w:rFonts w:ascii="Arial" w:hAnsi="Arial" w:cs="Arial"/>
+                <w:b/>
+                <w:bCs/>
+                <w:color w:val="000000"/>
+                <w:sz w:val="28"/>
+                <w:szCs w:val="28"/>
+              </w:rPr>
+              <w:t>jata</w:t>
+            </w:r>
+            <w:proofErr w:type="spellEnd"/>
+            <w:r>
+              <w:rPr>
+                <w:rFonts w:ascii="Arial" w:hAnsi="Arial" w:cs="Arial"/>
+                <w:b/>
+                <w:bCs/>
+                <w:color w:val="000000"/>
+                <w:sz w:val="28"/>
+                <w:szCs w:val="28"/>
+              </w:rPr>
+              <w:t xml:space="preserve"> </w:t>
             </w:r>
             <w:r>
               <w:rPr>
@@ -1725,8 +2310,19 @@
                 <w:sz w:val="28"/>
                 <w:szCs w:val="28"/>
               </w:rPr>
-              <w:t>Ghana paatam</w:t>
-            </w:r>
+              <w:t xml:space="preserve">Ghana </w:t>
+            </w:r>
+            <w:proofErr w:type="spellStart"/>
+            <w:r>
+              <w:rPr>
+                <w:rFonts w:ascii="Arial" w:hAnsi="Arial" w:cs="Arial"/>
+                <w:color w:val="000000"/>
+                <w:sz w:val="28"/>
+                <w:szCs w:val="28"/>
+              </w:rPr>
+              <w:t>paatam</w:t>
+            </w:r>
+            <w:proofErr w:type="spellEnd"/>
           </w:p>
         </w:tc>
         <w:tc>
@@ -1818,7 +2414,27 @@
                 <w:sz w:val="28"/>
                 <w:szCs w:val="28"/>
               </w:rPr>
-              <w:t xml:space="preserve">(1,2,3), (2,3,4), (3,4,5) (4.5,6) (5,6,7) (6,7) and 7 iti 7 </w:t>
+              <w:t xml:space="preserve">(1,2,3), (2,3,4), (3,4,5) (4.5,6) (5,6,7) (6,7) and 7 </w:t>
+            </w:r>
+            <w:proofErr w:type="spellStart"/>
+            <w:r>
+              <w:rPr>
+                <w:rFonts w:ascii="Arial" w:hAnsi="Arial" w:cs="Arial"/>
+                <w:color w:val="000000"/>
+                <w:sz w:val="28"/>
+                <w:szCs w:val="28"/>
+              </w:rPr>
+              <w:t>iti</w:t>
+            </w:r>
+            <w:proofErr w:type="spellEnd"/>
+            <w:r>
+              <w:rPr>
+                <w:rFonts w:ascii="Arial" w:hAnsi="Arial" w:cs="Arial"/>
+                <w:color w:val="000000"/>
+                <w:sz w:val="28"/>
+                <w:szCs w:val="28"/>
+              </w:rPr>
+              <w:t xml:space="preserve"> 7 </w:t>
             </w:r>
             <w:r>
               <w:rPr>
@@ -1923,7 +2539,87 @@
           <w:sz w:val="28"/>
           <w:szCs w:val="28"/>
         </w:rPr>
-        <w:t>Note: it is can be treated as a common formula that the number of krama, jata and ghana vAkyas = number of padams+ number of PS+number of PGs minus PSs and PGs which are Ruk (||) endings</w:t>
+        <w:t xml:space="preserve">Note: it is can be treated as a common formula that the number of krama, </w:t>
+      </w:r>
+      <w:proofErr w:type="spellStart"/>
+      <w:r>
+        <w:rPr>
+          <w:rFonts w:ascii="Arial" w:hAnsi="Arial" w:cs="Arial"/>
+          <w:b/>
+          <w:sz w:val="28"/>
+          <w:szCs w:val="28"/>
+        </w:rPr>
+        <w:t>jata</w:t>
+      </w:r>
+      <w:proofErr w:type="spellEnd"/>
+      <w:r>
+        <w:rPr>
+          <w:rFonts w:ascii="Arial" w:hAnsi="Arial" w:cs="Arial"/>
+          <w:b/>
+          <w:sz w:val="28"/>
+          <w:szCs w:val="28"/>
+        </w:rPr>
+        <w:t xml:space="preserve"> and </w:t>
+      </w:r>
+      <w:proofErr w:type="spellStart"/>
+      <w:r>
+        <w:rPr>
+          <w:rFonts w:ascii="Arial" w:hAnsi="Arial" w:cs="Arial"/>
+          <w:b/>
+          <w:sz w:val="28"/>
+          <w:szCs w:val="28"/>
+        </w:rPr>
+        <w:t>ghana</w:t>
+      </w:r>
+      <w:proofErr w:type="spellEnd"/>
+      <w:r>
+        <w:rPr>
+          <w:rFonts w:ascii="Arial" w:hAnsi="Arial" w:cs="Arial"/>
+          <w:b/>
+          <w:sz w:val="28"/>
+          <w:szCs w:val="28"/>
+        </w:rPr>
+        <w:t xml:space="preserve"> </w:t>
+      </w:r>
+      <w:proofErr w:type="spellStart"/>
+      <w:r>
+        <w:rPr>
+          <w:rFonts w:ascii="Arial" w:hAnsi="Arial" w:cs="Arial"/>
+          <w:b/>
+          <w:sz w:val="28"/>
+          <w:szCs w:val="28"/>
+        </w:rPr>
+        <w:t>vAkyas</w:t>
+      </w:r>
+      <w:proofErr w:type="spellEnd"/>
+      <w:r>
+        <w:rPr>
+          <w:rFonts w:ascii="Arial" w:hAnsi="Arial" w:cs="Arial"/>
+          <w:b/>
+          <w:sz w:val="28"/>
+          <w:szCs w:val="28"/>
+        </w:rPr>
+        <w:t xml:space="preserve"> = number of padams+ number of </w:t>
+      </w:r>
+      <w:proofErr w:type="spellStart"/>
+      <w:r>
+        <w:rPr>
+          <w:rFonts w:ascii="Arial" w:hAnsi="Arial" w:cs="Arial"/>
+          <w:b/>
+          <w:sz w:val="28"/>
+          <w:szCs w:val="28"/>
+        </w:rPr>
+        <w:t>PS+number</w:t>
+      </w:r>
+      <w:proofErr w:type="spellEnd"/>
+      <w:r>
+        <w:rPr>
+          <w:rFonts w:ascii="Arial" w:hAnsi="Arial" w:cs="Arial"/>
+          <w:b/>
+          <w:sz w:val="28"/>
+          <w:szCs w:val="28"/>
+        </w:rPr>
+        <w:t xml:space="preserve"> of PGs minus PSs and PGs which are Ruk (||) endings</w:t>
       </w:r>
       <w:r>
         <w:rPr>
@@ -1943,21 +2639,6 @@
         </w:rPr>
         <w:t>(Ruk Stops)</w:t>
       </w:r>
-    </w:p>
-    <w:p>
-      <w:pPr>
-        <w:widowControl w:val="0"/>
-        <w:autoSpaceDE w:val="0"/>
-        <w:autoSpaceDN w:val="0"/>
-        <w:adjustRightInd w:val="0"/>
-        <w:spacing w:after="0" w:line="240" w:lineRule="auto"/>
-        <w:rPr>
-          <w:rFonts w:ascii="Arial" w:hAnsi="Arial" w:cs="BRH Devanagari Extra"/>
-          <w:color w:val="000000"/>
-          <w:sz w:val="24"/>
-          <w:szCs w:val="40"/>
-        </w:rPr>
-      </w:pPr>
     </w:p>
     <w:p>
       <w:pPr>
@@ -2057,7 +2738,27 @@
           <w:sz w:val="28"/>
           <w:szCs w:val="28"/>
         </w:rPr>
-        <w:t>In this document we have given the Control Statistics below and this should enable to the users to cross-check and validate the number of jatA/Ghana vAkyams generated.</w:t>
+        <w:t xml:space="preserve">In this document we have given the Control Statistics below and this should enable to the users to cross-check and validate the number of </w:t>
+      </w:r>
+      <w:proofErr w:type="spellStart"/>
+      <w:r>
+        <w:rPr>
+          <w:rFonts w:ascii="Arial" w:hAnsi="Arial" w:cs="Arial"/>
+          <w:color w:val="000000"/>
+          <w:sz w:val="28"/>
+          <w:szCs w:val="28"/>
+        </w:rPr>
+        <w:t>jatA</w:t>
+      </w:r>
+      <w:proofErr w:type="spellEnd"/>
+      <w:r>
+        <w:rPr>
+          <w:rFonts w:ascii="Arial" w:hAnsi="Arial" w:cs="Arial"/>
+          <w:color w:val="000000"/>
+          <w:sz w:val="28"/>
+          <w:szCs w:val="28"/>
+        </w:rPr>
+        <w:t>/Ghana vAkyams generated.</w:t>
       </w:r>
     </w:p>
     <w:p>
@@ -2086,8 +2787,44 @@
           <w:sz w:val="28"/>
           <w:szCs w:val="28"/>
         </w:rPr>
-        <w:t>In future, the Control Statistics will be given at the end of the document after the jatA/Ghana vAkyams.</w:t>
+        <w:t xml:space="preserve">In future, the Control Statistics will be given at the end of the document after the </w:t>
       </w:r>
+      <w:proofErr w:type="spellStart"/>
+      <w:r>
+        <w:rPr>
+          <w:rFonts w:ascii="Arial" w:hAnsi="Arial" w:cs="Arial"/>
+          <w:color w:val="000000"/>
+          <w:sz w:val="28"/>
+          <w:szCs w:val="28"/>
+        </w:rPr>
+        <w:t>jatA</w:t>
+      </w:r>
+      <w:proofErr w:type="spellEnd"/>
+      <w:r>
+        <w:rPr>
+          <w:rFonts w:ascii="Arial" w:hAnsi="Arial" w:cs="Arial"/>
+          <w:color w:val="000000"/>
+          <w:sz w:val="28"/>
+          <w:szCs w:val="28"/>
+        </w:rPr>
+        <w:t>/Ghana vAkyams.</w:t>
+      </w:r>
+    </w:p>
+    <w:p>
+      <w:pPr>
+        <w:pStyle w:val="ListParagraph"/>
+        <w:widowControl w:val="0"/>
+        <w:autoSpaceDE w:val="0"/>
+        <w:autoSpaceDN w:val="0"/>
+        <w:adjustRightInd w:val="0"/>
+        <w:spacing w:after="0" w:line="240" w:lineRule="auto"/>
+        <w:rPr>
+          <w:rFonts w:ascii="Arial" w:hAnsi="Arial" w:cs="Arial"/>
+          <w:color w:val="000000"/>
+          <w:sz w:val="32"/>
+          <w:szCs w:val="32"/>
+        </w:rPr>
+      </w:pPr>
     </w:p>
     <w:p>
       <w:pPr>
@@ -2184,6 +2921,7 @@
                 <w:szCs w:val="28"/>
               </w:rPr>
             </w:pPr>
+            <w:proofErr w:type="spellStart"/>
             <w:r>
               <w:rPr>
                 <w:rFonts w:ascii="Arial" w:hAnsi="Arial" w:cs="Arial"/>
@@ -2195,6 +2933,7 @@
               </w:rPr>
               <w:t>Pan.ref</w:t>
             </w:r>
+            <w:proofErr w:type="spellEnd"/>
           </w:p>
         </w:tc>
         <w:tc>
@@ -2279,18 +3018,10 @@
                 <w:sz w:val="28"/>
                 <w:szCs w:val="28"/>
               </w:rPr>
-              <w:t>Padam which are split in Pada PaaTam with iti explanation</w:t>
-            </w:r>
-          </w:p>
-        </w:tc>
-      </w:tr>
-      <w:tr>
-        <w:tc>
-          <w:tcPr>
-            <w:tcW w:w="2695" w:type="dxa"/>
-          </w:tcPr>
-          <w:p>
-            <w:pPr>
+              <w:t xml:space="preserve">Padam which are split in Pada </w:t>
+            </w:r>
+            <w:proofErr w:type="spellStart"/>
+            <w:r>
               <w:rPr>
                 <w:rFonts w:ascii="Arial" w:hAnsi="Arial" w:cs="Arial"/>
                 <w:b/>
@@ -2299,7 +3030,9 @@
                 <w:sz w:val="28"/>
                 <w:szCs w:val="28"/>
               </w:rPr>
-            </w:pPr>
+              <w:t>PaaTam</w:t>
+            </w:r>
+            <w:proofErr w:type="spellEnd"/>
             <w:r>
               <w:rPr>
                 <w:rFonts w:ascii="Arial" w:hAnsi="Arial" w:cs="Arial"/>
@@ -2309,16 +3042,10 @@
                 <w:sz w:val="28"/>
                 <w:szCs w:val="28"/>
               </w:rPr>
-              <w:t>PS + Ruk</w:t>
-            </w:r>
-          </w:p>
-        </w:tc>
-        <w:tc>
-          <w:tcPr>
-            <w:tcW w:w="6655" w:type="dxa"/>
-          </w:tcPr>
-          <w:p>
-            <w:pPr>
+              <w:t xml:space="preserve"> with </w:t>
+            </w:r>
+            <w:proofErr w:type="spellStart"/>
+            <w:r>
               <w:rPr>
                 <w:rFonts w:ascii="Arial" w:hAnsi="Arial" w:cs="Arial"/>
                 <w:b/>
@@ -2327,7 +3054,9 @@
                 <w:sz w:val="28"/>
                 <w:szCs w:val="28"/>
               </w:rPr>
-            </w:pPr>
+              <w:t>iti</w:t>
+            </w:r>
+            <w:proofErr w:type="spellEnd"/>
             <w:r>
               <w:rPr>
                 <w:rFonts w:ascii="Arial" w:hAnsi="Arial" w:cs="Arial"/>
@@ -2337,7 +3066,7 @@
                 <w:sz w:val="28"/>
                 <w:szCs w:val="28"/>
               </w:rPr>
-              <w:t>PS which are also Ruk ending (Ruk Stops)</w:t>
+              <w:t xml:space="preserve"> explanation</w:t>
             </w:r>
           </w:p>
         </w:tc>
@@ -2367,7 +3096,7 @@
                 <w:sz w:val="28"/>
                 <w:szCs w:val="28"/>
               </w:rPr>
-              <w:t>PG</w:t>
+              <w:t>PS + Ruk</w:t>
             </w:r>
           </w:p>
         </w:tc>
@@ -2395,7 +3124,7 @@
                 <w:sz w:val="28"/>
                 <w:szCs w:val="28"/>
               </w:rPr>
-              <w:t xml:space="preserve">Pragrahas which have a split with iti </w:t>
+              <w:t>PS which are also Ruk ending (Ruk Stops)</w:t>
             </w:r>
           </w:p>
         </w:tc>
@@ -2425,7 +3154,7 @@
                 <w:sz w:val="28"/>
                 <w:szCs w:val="28"/>
               </w:rPr>
-              <w:t>PG + Ruk</w:t>
+              <w:t>PG</w:t>
             </w:r>
           </w:p>
         </w:tc>
@@ -2453,8 +3182,9 @@
                 <w:sz w:val="28"/>
                 <w:szCs w:val="28"/>
               </w:rPr>
-              <w:t xml:space="preserve">Pragrahas which are also Ruk ending </w:t>
-            </w:r>
+              <w:t xml:space="preserve">Pragrahas which have a split with </w:t>
+            </w:r>
+            <w:proofErr w:type="spellStart"/>
             <w:r>
               <w:rPr>
                 <w:rFonts w:ascii="Arial" w:hAnsi="Arial" w:cs="Arial"/>
@@ -2464,19 +3194,10 @@
                 <w:sz w:val="28"/>
                 <w:szCs w:val="28"/>
               </w:rPr>
-              <w:br/>
-              <w:t>(Ruk Stops)</w:t>
-            </w:r>
-          </w:p>
-        </w:tc>
-      </w:tr>
-      <w:tr>
-        <w:tc>
-          <w:tcPr>
-            <w:tcW w:w="2695" w:type="dxa"/>
-          </w:tcPr>
-          <w:p>
-            <w:pPr>
+              <w:t>iti</w:t>
+            </w:r>
+            <w:proofErr w:type="spellEnd"/>
+            <w:r>
               <w:rPr>
                 <w:rFonts w:ascii="Arial" w:hAnsi="Arial" w:cs="Arial"/>
                 <w:b/>
@@ -2485,8 +3206,18 @@
                 <w:sz w:val="28"/>
                 <w:szCs w:val="28"/>
               </w:rPr>
-            </w:pPr>
-            <w:r>
+              <w:t xml:space="preserve"> </w:t>
+            </w:r>
+          </w:p>
+        </w:tc>
+      </w:tr>
+      <w:tr>
+        <w:tc>
+          <w:tcPr>
+            <w:tcW w:w="2695" w:type="dxa"/>
+          </w:tcPr>
+          <w:p>
+            <w:pPr>
               <w:rPr>
                 <w:rFonts w:ascii="Arial" w:hAnsi="Arial" w:cs="Arial"/>
                 <w:b/>
@@ -2495,16 +3226,8 @@
                 <w:sz w:val="28"/>
                 <w:szCs w:val="28"/>
               </w:rPr>
-              <w:t>Total Ruks</w:t>
-            </w:r>
-          </w:p>
-        </w:tc>
-        <w:tc>
-          <w:tcPr>
-            <w:tcW w:w="6655" w:type="dxa"/>
-          </w:tcPr>
-          <w:p>
-            <w:pPr>
+            </w:pPr>
+            <w:r>
               <w:rPr>
                 <w:rFonts w:ascii="Arial" w:hAnsi="Arial" w:cs="Arial"/>
                 <w:b/>
@@ -2513,8 +3236,16 @@
                 <w:sz w:val="28"/>
                 <w:szCs w:val="28"/>
               </w:rPr>
-            </w:pPr>
-            <w:r>
+              <w:t>PG + Ruk</w:t>
+            </w:r>
+          </w:p>
+        </w:tc>
+        <w:tc>
+          <w:tcPr>
+            <w:tcW w:w="6655" w:type="dxa"/>
+          </w:tcPr>
+          <w:p>
+            <w:pPr>
               <w:rPr>
                 <w:rFonts w:ascii="Arial" w:hAnsi="Arial" w:cs="Arial"/>
                 <w:b/>
@@ -2523,7 +3254,29 @@
                 <w:sz w:val="28"/>
                 <w:szCs w:val="28"/>
               </w:rPr>
-              <w:t>Total number of Ruk endings (Ruk Stops)</w:t>
+            </w:pPr>
+            <w:r>
+              <w:rPr>
+                <w:rFonts w:ascii="Arial" w:hAnsi="Arial" w:cs="Arial"/>
+                <w:b/>
+                <w:bCs/>
+                <w:color w:val="000000"/>
+                <w:sz w:val="28"/>
+                <w:szCs w:val="28"/>
+              </w:rPr>
+              <w:t xml:space="preserve">Pragrahas which are also Ruk ending </w:t>
+            </w:r>
+            <w:r>
+              <w:rPr>
+                <w:rFonts w:ascii="Arial" w:hAnsi="Arial" w:cs="Arial"/>
+                <w:b/>
+                <w:bCs/>
+                <w:color w:val="000000"/>
+                <w:sz w:val="28"/>
+                <w:szCs w:val="28"/>
+              </w:rPr>
+              <w:br/>
+              <w:t>(Ruk Stops)</w:t>
             </w:r>
           </w:p>
         </w:tc>
@@ -2539,6 +3292,7 @@
                 <w:rFonts w:ascii="Arial" w:hAnsi="Arial" w:cs="Arial"/>
                 <w:b/>
                 <w:bCs/>
+                <w:color w:val="000000"/>
                 <w:sz w:val="28"/>
                 <w:szCs w:val="28"/>
               </w:rPr>
@@ -2548,10 +3302,11 @@
                 <w:rFonts w:ascii="Arial" w:hAnsi="Arial" w:cs="Arial"/>
                 <w:b/>
                 <w:bCs/>
+                <w:color w:val="000000"/>
                 <w:sz w:val="28"/>
                 <w:szCs w:val="28"/>
               </w:rPr>
-              <w:t>PRE</w:t>
+              <w:t>Total Ruks</w:t>
             </w:r>
           </w:p>
         </w:tc>
@@ -2565,6 +3320,7 @@
                 <w:rFonts w:ascii="Arial" w:hAnsi="Arial" w:cs="Arial"/>
                 <w:b/>
                 <w:bCs/>
+                <w:color w:val="000000"/>
                 <w:sz w:val="28"/>
                 <w:szCs w:val="28"/>
               </w:rPr>
@@ -2574,12 +3330,22 @@
                 <w:rFonts w:ascii="Arial" w:hAnsi="Arial" w:cs="Arial"/>
                 <w:b/>
                 <w:bCs/>
+                <w:color w:val="000000"/>
                 <w:sz w:val="28"/>
                 <w:szCs w:val="28"/>
               </w:rPr>
-              <w:t>Total Number of Prepos</w:t>
-            </w:r>
-            <w:r>
+              <w:t>Total number of Ruk endings (Ruk Stops)</w:t>
+            </w:r>
+          </w:p>
+        </w:tc>
+      </w:tr>
+      <w:tr>
+        <w:tc>
+          <w:tcPr>
+            <w:tcW w:w="2695" w:type="dxa"/>
+          </w:tcPr>
+          <w:p>
+            <w:pPr>
               <w:rPr>
                 <w:rFonts w:ascii="Arial" w:hAnsi="Arial" w:cs="Arial"/>
                 <w:b/>
@@ -2587,8 +3353,7 @@
                 <w:sz w:val="28"/>
                 <w:szCs w:val="28"/>
               </w:rPr>
-              <w:t>i</w:t>
-            </w:r>
+            </w:pPr>
             <w:r>
               <w:rPr>
                 <w:rFonts w:ascii="Arial" w:hAnsi="Arial" w:cs="Arial"/>
@@ -2597,6 +3362,52 @@
                 <w:sz w:val="28"/>
                 <w:szCs w:val="28"/>
               </w:rPr>
+              <w:t>PRE</w:t>
+            </w:r>
+          </w:p>
+        </w:tc>
+        <w:tc>
+          <w:tcPr>
+            <w:tcW w:w="6655" w:type="dxa"/>
+          </w:tcPr>
+          <w:p>
+            <w:pPr>
+              <w:rPr>
+                <w:rFonts w:ascii="Arial" w:hAnsi="Arial" w:cs="Arial"/>
+                <w:b/>
+                <w:bCs/>
+                <w:sz w:val="28"/>
+                <w:szCs w:val="28"/>
+              </w:rPr>
+            </w:pPr>
+            <w:r>
+              <w:rPr>
+                <w:rFonts w:ascii="Arial" w:hAnsi="Arial" w:cs="Arial"/>
+                <w:b/>
+                <w:bCs/>
+                <w:sz w:val="28"/>
+                <w:szCs w:val="28"/>
+              </w:rPr>
+              <w:t>Total Number of Prepos</w:t>
+            </w:r>
+            <w:r>
+              <w:rPr>
+                <w:rFonts w:ascii="Arial" w:hAnsi="Arial" w:cs="Arial"/>
+                <w:b/>
+                <w:bCs/>
+                <w:sz w:val="28"/>
+                <w:szCs w:val="28"/>
+              </w:rPr>
+              <w:t>i</w:t>
+            </w:r>
+            <w:r>
+              <w:rPr>
+                <w:rFonts w:ascii="Arial" w:hAnsi="Arial" w:cs="Arial"/>
+                <w:b/>
+                <w:bCs/>
+                <w:sz w:val="28"/>
+                <w:szCs w:val="28"/>
+              </w:rPr>
               <w:t>tions</w:t>
             </w:r>
           </w:p>
@@ -2725,7 +3536,29 @@
                 <w:sz w:val="28"/>
                 <w:szCs w:val="28"/>
               </w:rPr>
-              <w:t>Number of Padams with elongated vowel sound as per SamhitA (Ref PratiSakyam Chapter 3). Can be verified with Pada Paatam</w:t>
+              <w:t xml:space="preserve">Number of Padams with elongated vowel sound as per SamhitA (Ref </w:t>
+            </w:r>
+            <w:proofErr w:type="spellStart"/>
+            <w:r>
+              <w:rPr>
+                <w:rFonts w:ascii="Arial" w:hAnsi="Arial" w:cs="Arial"/>
+                <w:b/>
+                <w:bCs/>
+                <w:sz w:val="28"/>
+                <w:szCs w:val="28"/>
+              </w:rPr>
+              <w:t>PratiSakyam</w:t>
+            </w:r>
+            <w:proofErr w:type="spellEnd"/>
+            <w:r>
+              <w:rPr>
+                <w:rFonts w:ascii="Arial" w:hAnsi="Arial" w:cs="Arial"/>
+                <w:b/>
+                <w:bCs/>
+                <w:sz w:val="28"/>
+                <w:szCs w:val="28"/>
+              </w:rPr>
+              <w:t xml:space="preserve"> Chapter 3). Can be verified with Pada Paatam</w:t>
             </w:r>
           </w:p>
         </w:tc>
@@ -2833,7 +3666,29 @@
                 <w:sz w:val="28"/>
                 <w:szCs w:val="28"/>
               </w:rPr>
-              <w:t>Number of Padams as per Pada PaaTam (Control number given for each Padam in the vAkyam)</w:t>
+              <w:t xml:space="preserve">Number of Padams as per Pada </w:t>
+            </w:r>
+            <w:proofErr w:type="spellStart"/>
+            <w:r>
+              <w:rPr>
+                <w:rFonts w:ascii="Arial" w:hAnsi="Arial" w:cs="Arial"/>
+                <w:b/>
+                <w:bCs/>
+                <w:sz w:val="28"/>
+                <w:szCs w:val="28"/>
+              </w:rPr>
+              <w:t>PaaTam</w:t>
+            </w:r>
+            <w:proofErr w:type="spellEnd"/>
+            <w:r>
+              <w:rPr>
+                <w:rFonts w:ascii="Arial" w:hAnsi="Arial" w:cs="Arial"/>
+                <w:b/>
+                <w:bCs/>
+                <w:sz w:val="28"/>
+                <w:szCs w:val="28"/>
+              </w:rPr>
+              <w:t xml:space="preserve"> (Control number given for each Padam in the vAkyam)</w:t>
             </w:r>
           </w:p>
         </w:tc>
@@ -3140,15 +3995,27 @@
                 <w:szCs w:val="20"/>
               </w:rPr>
             </w:pPr>
-            <w:r>
-              <w:rPr>
-                <w:rFonts w:ascii="Calibri" w:eastAsia="Times New Roman" w:hAnsi="Calibri" w:cs="Calibri"/>
-                <w:b/>
-                <w:bCs/>
-                <w:sz w:val="20"/>
-                <w:szCs w:val="20"/>
-              </w:rPr>
-              <w:t>PG+RuK ending Padams (REP)</w:t>
+            <w:proofErr w:type="spellStart"/>
+            <w:r>
+              <w:rPr>
+                <w:rFonts w:ascii="Calibri" w:eastAsia="Times New Roman" w:hAnsi="Calibri" w:cs="Calibri"/>
+                <w:b/>
+                <w:bCs/>
+                <w:sz w:val="20"/>
+                <w:szCs w:val="20"/>
+              </w:rPr>
+              <w:t>PG+RuK</w:t>
+            </w:r>
+            <w:proofErr w:type="spellEnd"/>
+            <w:r>
+              <w:rPr>
+                <w:rFonts w:ascii="Calibri" w:eastAsia="Times New Roman" w:hAnsi="Calibri" w:cs="Calibri"/>
+                <w:b/>
+                <w:bCs/>
+                <w:sz w:val="20"/>
+                <w:szCs w:val="20"/>
+              </w:rPr>
+              <w:t xml:space="preserve"> ending Padams (REP)</w:t>
             </w:r>
           </w:p>
         </w:tc>
@@ -3328,7 +4195,29 @@
                 <w:sz w:val="20"/>
                 <w:szCs w:val="20"/>
               </w:rPr>
-              <w:t>Ordinary Padams (with out PS,PG REP )and including "PRE"</w:t>
+              <w:t>Ordinary Padams (</w:t>
+            </w:r>
+            <w:proofErr w:type="spellStart"/>
+            <w:r>
+              <w:rPr>
+                <w:rFonts w:ascii="Calibri" w:eastAsia="Times New Roman" w:hAnsi="Calibri" w:cs="Calibri"/>
+                <w:b/>
+                <w:bCs/>
+                <w:sz w:val="20"/>
+                <w:szCs w:val="20"/>
+              </w:rPr>
+              <w:t>with out</w:t>
+            </w:r>
+            <w:proofErr w:type="spellEnd"/>
+            <w:r>
+              <w:rPr>
+                <w:rFonts w:ascii="Calibri" w:eastAsia="Times New Roman" w:hAnsi="Calibri" w:cs="Calibri"/>
+                <w:b/>
+                <w:bCs/>
+                <w:sz w:val="20"/>
+                <w:szCs w:val="20"/>
+              </w:rPr>
+              <w:t xml:space="preserve"> PS,PG REP )and including "PRE"</w:t>
             </w:r>
           </w:p>
         </w:tc>
@@ -3364,8 +4253,20 @@
                 <w:sz w:val="20"/>
                 <w:szCs w:val="20"/>
               </w:rPr>
-              <w:t>Total Padams as per Pada PaaTam</w:t>
-            </w:r>
+              <w:t xml:space="preserve">Total Padams as per Pada </w:t>
+            </w:r>
+            <w:proofErr w:type="spellStart"/>
+            <w:r>
+              <w:rPr>
+                <w:rFonts w:ascii="Calibri" w:eastAsia="Times New Roman" w:hAnsi="Calibri" w:cs="Calibri"/>
+                <w:b/>
+                <w:bCs/>
+                <w:sz w:val="20"/>
+                <w:szCs w:val="20"/>
+              </w:rPr>
+              <w:t>PaaTam</w:t>
+            </w:r>
+            <w:proofErr w:type="spellEnd"/>
           </w:p>
         </w:tc>
         <w:tc>
@@ -3418,7 +4319,6 @@
               <w:bottom w:val="single" w:sz="4" w:space="0" w:color="auto"/>
               <w:right w:val="single" w:sz="4" w:space="0" w:color="auto"/>
             </w:tcBorders>
-            <w:shd w:val="clear" w:color="auto" w:fill="auto"/>
             <w:noWrap/>
             <w:vAlign w:val="bottom"/>
             <w:hideMark/>
@@ -3455,7 +4355,6 @@
               <w:bottom w:val="single" w:sz="4" w:space="0" w:color="auto"/>
               <w:right w:val="single" w:sz="4" w:space="0" w:color="auto"/>
             </w:tcBorders>
-            <w:shd w:val="clear" w:color="auto" w:fill="auto"/>
             <w:noWrap/>
             <w:vAlign w:val="bottom"/>
             <w:hideMark/>
@@ -3493,7 +4392,6 @@
               <w:bottom w:val="single" w:sz="4" w:space="0" w:color="auto"/>
               <w:right w:val="single" w:sz="4" w:space="0" w:color="auto"/>
             </w:tcBorders>
-            <w:shd w:val="clear" w:color="auto" w:fill="auto"/>
             <w:noWrap/>
             <w:vAlign w:val="bottom"/>
             <w:hideMark/>
@@ -3531,7 +4429,6 @@
               <w:bottom w:val="single" w:sz="4" w:space="0" w:color="auto"/>
               <w:right w:val="single" w:sz="4" w:space="0" w:color="auto"/>
             </w:tcBorders>
-            <w:shd w:val="clear" w:color="auto" w:fill="auto"/>
             <w:noWrap/>
             <w:vAlign w:val="bottom"/>
             <w:hideMark/>
@@ -3569,7 +4466,6 @@
               <w:bottom w:val="single" w:sz="4" w:space="0" w:color="auto"/>
               <w:right w:val="single" w:sz="4" w:space="0" w:color="auto"/>
             </w:tcBorders>
-            <w:shd w:val="clear" w:color="auto" w:fill="auto"/>
             <w:noWrap/>
             <w:vAlign w:val="bottom"/>
             <w:hideMark/>
@@ -3607,7 +4503,6 @@
               <w:bottom w:val="single" w:sz="4" w:space="0" w:color="auto"/>
               <w:right w:val="single" w:sz="4" w:space="0" w:color="auto"/>
             </w:tcBorders>
-            <w:shd w:val="clear" w:color="auto" w:fill="auto"/>
             <w:noWrap/>
             <w:vAlign w:val="bottom"/>
             <w:hideMark/>
@@ -3645,7 +4540,6 @@
               <w:bottom w:val="single" w:sz="4" w:space="0" w:color="auto"/>
               <w:right w:val="single" w:sz="4" w:space="0" w:color="auto"/>
             </w:tcBorders>
-            <w:shd w:val="clear" w:color="auto" w:fill="auto"/>
             <w:noWrap/>
             <w:vAlign w:val="bottom"/>
             <w:hideMark/>
@@ -3683,7 +4577,6 @@
               <w:bottom w:val="single" w:sz="4" w:space="0" w:color="auto"/>
               <w:right w:val="single" w:sz="4" w:space="0" w:color="auto"/>
             </w:tcBorders>
-            <w:shd w:val="clear" w:color="auto" w:fill="auto"/>
             <w:noWrap/>
             <w:vAlign w:val="bottom"/>
             <w:hideMark/>
@@ -3721,7 +4614,6 @@
               <w:bottom w:val="single" w:sz="4" w:space="0" w:color="auto"/>
               <w:right w:val="single" w:sz="4" w:space="0" w:color="auto"/>
             </w:tcBorders>
-            <w:shd w:val="clear" w:color="auto" w:fill="auto"/>
             <w:noWrap/>
             <w:vAlign w:val="bottom"/>
             <w:hideMark/>
@@ -3759,7 +4651,6 @@
               <w:bottom w:val="single" w:sz="4" w:space="0" w:color="auto"/>
               <w:right w:val="single" w:sz="4" w:space="0" w:color="auto"/>
             </w:tcBorders>
-            <w:shd w:val="clear" w:color="auto" w:fill="auto"/>
             <w:noWrap/>
             <w:vAlign w:val="bottom"/>
             <w:hideMark/>
@@ -3797,7 +4688,6 @@
               <w:bottom w:val="single" w:sz="4" w:space="0" w:color="auto"/>
               <w:right w:val="single" w:sz="4" w:space="0" w:color="auto"/>
             </w:tcBorders>
-            <w:shd w:val="clear" w:color="auto" w:fill="auto"/>
             <w:noWrap/>
             <w:vAlign w:val="bottom"/>
             <w:hideMark/>
@@ -3835,7 +4725,6 @@
               <w:bottom w:val="single" w:sz="4" w:space="0" w:color="auto"/>
               <w:right w:val="single" w:sz="4" w:space="0" w:color="auto"/>
             </w:tcBorders>
-            <w:shd w:val="clear" w:color="auto" w:fill="auto"/>
             <w:noWrap/>
             <w:vAlign w:val="bottom"/>
             <w:hideMark/>
@@ -3878,7 +4767,6 @@
               <w:bottom w:val="single" w:sz="4" w:space="0" w:color="auto"/>
               <w:right w:val="single" w:sz="4" w:space="0" w:color="auto"/>
             </w:tcBorders>
-            <w:shd w:val="clear" w:color="auto" w:fill="auto"/>
             <w:noWrap/>
             <w:vAlign w:val="bottom"/>
             <w:hideMark/>
@@ -3915,7 +4803,6 @@
               <w:bottom w:val="single" w:sz="4" w:space="0" w:color="auto"/>
               <w:right w:val="single" w:sz="4" w:space="0" w:color="auto"/>
             </w:tcBorders>
-            <w:shd w:val="clear" w:color="auto" w:fill="auto"/>
             <w:noWrap/>
             <w:vAlign w:val="bottom"/>
             <w:hideMark/>
@@ -3953,7 +4840,6 @@
               <w:bottom w:val="single" w:sz="4" w:space="0" w:color="auto"/>
               <w:right w:val="single" w:sz="4" w:space="0" w:color="auto"/>
             </w:tcBorders>
-            <w:shd w:val="clear" w:color="auto" w:fill="auto"/>
             <w:noWrap/>
             <w:vAlign w:val="bottom"/>
             <w:hideMark/>
@@ -3991,7 +4877,6 @@
               <w:bottom w:val="single" w:sz="4" w:space="0" w:color="auto"/>
               <w:right w:val="single" w:sz="4" w:space="0" w:color="auto"/>
             </w:tcBorders>
-            <w:shd w:val="clear" w:color="auto" w:fill="auto"/>
             <w:noWrap/>
             <w:vAlign w:val="bottom"/>
             <w:hideMark/>
@@ -4029,7 +4914,6 @@
               <w:bottom w:val="single" w:sz="4" w:space="0" w:color="auto"/>
               <w:right w:val="single" w:sz="4" w:space="0" w:color="auto"/>
             </w:tcBorders>
-            <w:shd w:val="clear" w:color="auto" w:fill="auto"/>
             <w:noWrap/>
             <w:vAlign w:val="bottom"/>
             <w:hideMark/>
@@ -4067,7 +4951,6 @@
               <w:bottom w:val="single" w:sz="4" w:space="0" w:color="auto"/>
               <w:right w:val="single" w:sz="4" w:space="0" w:color="auto"/>
             </w:tcBorders>
-            <w:shd w:val="clear" w:color="auto" w:fill="auto"/>
             <w:noWrap/>
             <w:vAlign w:val="bottom"/>
             <w:hideMark/>
@@ -4105,7 +4988,6 @@
               <w:bottom w:val="single" w:sz="4" w:space="0" w:color="auto"/>
               <w:right w:val="single" w:sz="4" w:space="0" w:color="auto"/>
             </w:tcBorders>
-            <w:shd w:val="clear" w:color="auto" w:fill="auto"/>
             <w:noWrap/>
             <w:vAlign w:val="bottom"/>
             <w:hideMark/>
@@ -4143,7 +5025,6 @@
               <w:bottom w:val="single" w:sz="4" w:space="0" w:color="auto"/>
               <w:right w:val="single" w:sz="4" w:space="0" w:color="auto"/>
             </w:tcBorders>
-            <w:shd w:val="clear" w:color="auto" w:fill="auto"/>
             <w:noWrap/>
             <w:vAlign w:val="bottom"/>
             <w:hideMark/>
@@ -4181,7 +5062,6 @@
               <w:bottom w:val="single" w:sz="4" w:space="0" w:color="auto"/>
               <w:right w:val="single" w:sz="4" w:space="0" w:color="auto"/>
             </w:tcBorders>
-            <w:shd w:val="clear" w:color="auto" w:fill="auto"/>
             <w:noWrap/>
             <w:vAlign w:val="bottom"/>
             <w:hideMark/>
@@ -4219,7 +5099,6 @@
               <w:bottom w:val="single" w:sz="4" w:space="0" w:color="auto"/>
               <w:right w:val="single" w:sz="4" w:space="0" w:color="auto"/>
             </w:tcBorders>
-            <w:shd w:val="clear" w:color="auto" w:fill="auto"/>
             <w:noWrap/>
             <w:vAlign w:val="bottom"/>
             <w:hideMark/>
@@ -4257,7 +5136,6 @@
               <w:bottom w:val="single" w:sz="4" w:space="0" w:color="auto"/>
               <w:right w:val="single" w:sz="4" w:space="0" w:color="auto"/>
             </w:tcBorders>
-            <w:shd w:val="clear" w:color="auto" w:fill="auto"/>
             <w:noWrap/>
             <w:vAlign w:val="bottom"/>
             <w:hideMark/>
@@ -4295,7 +5173,6 @@
               <w:bottom w:val="single" w:sz="4" w:space="0" w:color="auto"/>
               <w:right w:val="single" w:sz="4" w:space="0" w:color="auto"/>
             </w:tcBorders>
-            <w:shd w:val="clear" w:color="auto" w:fill="auto"/>
             <w:noWrap/>
             <w:vAlign w:val="bottom"/>
             <w:hideMark/>
@@ -4338,7 +5215,6 @@
               <w:bottom w:val="single" w:sz="4" w:space="0" w:color="auto"/>
               <w:right w:val="single" w:sz="4" w:space="0" w:color="auto"/>
             </w:tcBorders>
-            <w:shd w:val="clear" w:color="auto" w:fill="auto"/>
             <w:noWrap/>
             <w:vAlign w:val="bottom"/>
             <w:hideMark/>
@@ -4375,7 +5251,6 @@
               <w:bottom w:val="single" w:sz="4" w:space="0" w:color="auto"/>
               <w:right w:val="single" w:sz="4" w:space="0" w:color="auto"/>
             </w:tcBorders>
-            <w:shd w:val="clear" w:color="auto" w:fill="auto"/>
             <w:noWrap/>
             <w:vAlign w:val="bottom"/>
             <w:hideMark/>
@@ -4413,7 +5288,6 @@
               <w:bottom w:val="single" w:sz="4" w:space="0" w:color="auto"/>
               <w:right w:val="single" w:sz="4" w:space="0" w:color="auto"/>
             </w:tcBorders>
-            <w:shd w:val="clear" w:color="auto" w:fill="auto"/>
             <w:noWrap/>
             <w:vAlign w:val="bottom"/>
             <w:hideMark/>
@@ -4451,7 +5325,6 @@
               <w:bottom w:val="single" w:sz="4" w:space="0" w:color="auto"/>
               <w:right w:val="single" w:sz="4" w:space="0" w:color="auto"/>
             </w:tcBorders>
-            <w:shd w:val="clear" w:color="auto" w:fill="auto"/>
             <w:noWrap/>
             <w:vAlign w:val="bottom"/>
             <w:hideMark/>
@@ -4489,7 +5362,6 @@
               <w:bottom w:val="single" w:sz="4" w:space="0" w:color="auto"/>
               <w:right w:val="single" w:sz="4" w:space="0" w:color="auto"/>
             </w:tcBorders>
-            <w:shd w:val="clear" w:color="auto" w:fill="auto"/>
             <w:noWrap/>
             <w:vAlign w:val="bottom"/>
             <w:hideMark/>
@@ -4527,7 +5399,6 @@
               <w:bottom w:val="single" w:sz="4" w:space="0" w:color="auto"/>
               <w:right w:val="single" w:sz="4" w:space="0" w:color="auto"/>
             </w:tcBorders>
-            <w:shd w:val="clear" w:color="auto" w:fill="auto"/>
             <w:noWrap/>
             <w:vAlign w:val="bottom"/>
             <w:hideMark/>
@@ -4565,7 +5436,6 @@
               <w:bottom w:val="single" w:sz="4" w:space="0" w:color="auto"/>
               <w:right w:val="single" w:sz="4" w:space="0" w:color="auto"/>
             </w:tcBorders>
-            <w:shd w:val="clear" w:color="auto" w:fill="auto"/>
             <w:noWrap/>
             <w:vAlign w:val="bottom"/>
             <w:hideMark/>
@@ -4603,7 +5473,6 @@
               <w:bottom w:val="single" w:sz="4" w:space="0" w:color="auto"/>
               <w:right w:val="single" w:sz="4" w:space="0" w:color="auto"/>
             </w:tcBorders>
-            <w:shd w:val="clear" w:color="auto" w:fill="auto"/>
             <w:noWrap/>
             <w:vAlign w:val="bottom"/>
             <w:hideMark/>
@@ -4641,7 +5510,6 @@
               <w:bottom w:val="single" w:sz="4" w:space="0" w:color="auto"/>
               <w:right w:val="single" w:sz="4" w:space="0" w:color="auto"/>
             </w:tcBorders>
-            <w:shd w:val="clear" w:color="auto" w:fill="auto"/>
             <w:noWrap/>
             <w:vAlign w:val="bottom"/>
             <w:hideMark/>
@@ -4679,7 +5547,6 @@
               <w:bottom w:val="single" w:sz="4" w:space="0" w:color="auto"/>
               <w:right w:val="single" w:sz="4" w:space="0" w:color="auto"/>
             </w:tcBorders>
-            <w:shd w:val="clear" w:color="auto" w:fill="auto"/>
             <w:noWrap/>
             <w:vAlign w:val="bottom"/>
             <w:hideMark/>
@@ -4717,7 +5584,6 @@
               <w:bottom w:val="single" w:sz="4" w:space="0" w:color="auto"/>
               <w:right w:val="single" w:sz="4" w:space="0" w:color="auto"/>
             </w:tcBorders>
-            <w:shd w:val="clear" w:color="auto" w:fill="auto"/>
             <w:noWrap/>
             <w:vAlign w:val="bottom"/>
             <w:hideMark/>
@@ -4755,7 +5621,6 @@
               <w:bottom w:val="single" w:sz="4" w:space="0" w:color="auto"/>
               <w:right w:val="single" w:sz="4" w:space="0" w:color="auto"/>
             </w:tcBorders>
-            <w:shd w:val="clear" w:color="auto" w:fill="auto"/>
             <w:noWrap/>
             <w:vAlign w:val="bottom"/>
             <w:hideMark/>
@@ -4798,7 +5663,6 @@
               <w:bottom w:val="single" w:sz="4" w:space="0" w:color="auto"/>
               <w:right w:val="single" w:sz="4" w:space="0" w:color="auto"/>
             </w:tcBorders>
-            <w:shd w:val="clear" w:color="auto" w:fill="auto"/>
             <w:noWrap/>
             <w:vAlign w:val="bottom"/>
             <w:hideMark/>
@@ -4835,7 +5699,6 @@
               <w:bottom w:val="single" w:sz="4" w:space="0" w:color="auto"/>
               <w:right w:val="single" w:sz="4" w:space="0" w:color="auto"/>
             </w:tcBorders>
-            <w:shd w:val="clear" w:color="auto" w:fill="auto"/>
             <w:noWrap/>
             <w:vAlign w:val="bottom"/>
             <w:hideMark/>
@@ -4873,7 +5736,6 @@
               <w:bottom w:val="single" w:sz="4" w:space="0" w:color="auto"/>
               <w:right w:val="single" w:sz="4" w:space="0" w:color="auto"/>
             </w:tcBorders>
-            <w:shd w:val="clear" w:color="auto" w:fill="auto"/>
             <w:noWrap/>
             <w:vAlign w:val="bottom"/>
             <w:hideMark/>
@@ -4911,7 +5773,6 @@
               <w:bottom w:val="single" w:sz="4" w:space="0" w:color="auto"/>
               <w:right w:val="single" w:sz="4" w:space="0" w:color="auto"/>
             </w:tcBorders>
-            <w:shd w:val="clear" w:color="auto" w:fill="auto"/>
             <w:noWrap/>
             <w:vAlign w:val="bottom"/>
             <w:hideMark/>
@@ -4949,7 +5810,6 @@
               <w:bottom w:val="single" w:sz="4" w:space="0" w:color="auto"/>
               <w:right w:val="single" w:sz="4" w:space="0" w:color="auto"/>
             </w:tcBorders>
-            <w:shd w:val="clear" w:color="auto" w:fill="auto"/>
             <w:noWrap/>
             <w:vAlign w:val="bottom"/>
             <w:hideMark/>
@@ -4987,7 +5847,6 @@
               <w:bottom w:val="single" w:sz="4" w:space="0" w:color="auto"/>
               <w:right w:val="single" w:sz="4" w:space="0" w:color="auto"/>
             </w:tcBorders>
-            <w:shd w:val="clear" w:color="auto" w:fill="auto"/>
             <w:noWrap/>
             <w:vAlign w:val="bottom"/>
             <w:hideMark/>
@@ -5025,7 +5884,6 @@
               <w:bottom w:val="single" w:sz="4" w:space="0" w:color="auto"/>
               <w:right w:val="single" w:sz="4" w:space="0" w:color="auto"/>
             </w:tcBorders>
-            <w:shd w:val="clear" w:color="auto" w:fill="auto"/>
             <w:noWrap/>
             <w:vAlign w:val="bottom"/>
             <w:hideMark/>
@@ -5063,7 +5921,6 @@
               <w:bottom w:val="single" w:sz="4" w:space="0" w:color="auto"/>
               <w:right w:val="single" w:sz="4" w:space="0" w:color="auto"/>
             </w:tcBorders>
-            <w:shd w:val="clear" w:color="auto" w:fill="auto"/>
             <w:noWrap/>
             <w:vAlign w:val="bottom"/>
             <w:hideMark/>
@@ -5101,7 +5958,6 @@
               <w:bottom w:val="single" w:sz="4" w:space="0" w:color="auto"/>
               <w:right w:val="single" w:sz="4" w:space="0" w:color="auto"/>
             </w:tcBorders>
-            <w:shd w:val="clear" w:color="auto" w:fill="auto"/>
             <w:noWrap/>
             <w:vAlign w:val="bottom"/>
             <w:hideMark/>
@@ -5139,7 +5995,6 @@
               <w:bottom w:val="single" w:sz="4" w:space="0" w:color="auto"/>
               <w:right w:val="single" w:sz="4" w:space="0" w:color="auto"/>
             </w:tcBorders>
-            <w:shd w:val="clear" w:color="auto" w:fill="auto"/>
             <w:noWrap/>
             <w:vAlign w:val="bottom"/>
             <w:hideMark/>
@@ -5177,7 +6032,6 @@
               <w:bottom w:val="single" w:sz="4" w:space="0" w:color="auto"/>
               <w:right w:val="single" w:sz="4" w:space="0" w:color="auto"/>
             </w:tcBorders>
-            <w:shd w:val="clear" w:color="auto" w:fill="auto"/>
             <w:noWrap/>
             <w:vAlign w:val="bottom"/>
             <w:hideMark/>
@@ -5215,7 +6069,6 @@
               <w:bottom w:val="single" w:sz="4" w:space="0" w:color="auto"/>
               <w:right w:val="single" w:sz="4" w:space="0" w:color="auto"/>
             </w:tcBorders>
-            <w:shd w:val="clear" w:color="auto" w:fill="auto"/>
             <w:noWrap/>
             <w:vAlign w:val="bottom"/>
             <w:hideMark/>
@@ -5258,7 +6111,6 @@
               <w:bottom w:val="single" w:sz="4" w:space="0" w:color="auto"/>
               <w:right w:val="single" w:sz="4" w:space="0" w:color="auto"/>
             </w:tcBorders>
-            <w:shd w:val="clear" w:color="auto" w:fill="auto"/>
             <w:noWrap/>
             <w:vAlign w:val="bottom"/>
             <w:hideMark/>
@@ -5295,7 +6147,6 @@
               <w:bottom w:val="single" w:sz="4" w:space="0" w:color="auto"/>
               <w:right w:val="single" w:sz="4" w:space="0" w:color="auto"/>
             </w:tcBorders>
-            <w:shd w:val="clear" w:color="auto" w:fill="auto"/>
             <w:noWrap/>
             <w:vAlign w:val="bottom"/>
             <w:hideMark/>
@@ -5333,7 +6184,6 @@
               <w:bottom w:val="single" w:sz="4" w:space="0" w:color="auto"/>
               <w:right w:val="single" w:sz="4" w:space="0" w:color="auto"/>
             </w:tcBorders>
-            <w:shd w:val="clear" w:color="auto" w:fill="auto"/>
             <w:noWrap/>
             <w:vAlign w:val="bottom"/>
             <w:hideMark/>
@@ -5371,7 +6221,6 @@
               <w:bottom w:val="single" w:sz="4" w:space="0" w:color="auto"/>
               <w:right w:val="single" w:sz="4" w:space="0" w:color="auto"/>
             </w:tcBorders>
-            <w:shd w:val="clear" w:color="auto" w:fill="auto"/>
             <w:noWrap/>
             <w:vAlign w:val="bottom"/>
             <w:hideMark/>
@@ -5409,7 +6258,6 @@
               <w:bottom w:val="single" w:sz="4" w:space="0" w:color="auto"/>
               <w:right w:val="single" w:sz="4" w:space="0" w:color="auto"/>
             </w:tcBorders>
-            <w:shd w:val="clear" w:color="auto" w:fill="auto"/>
             <w:noWrap/>
             <w:vAlign w:val="bottom"/>
             <w:hideMark/>
@@ -5447,7 +6295,6 @@
               <w:bottom w:val="single" w:sz="4" w:space="0" w:color="auto"/>
               <w:right w:val="single" w:sz="4" w:space="0" w:color="auto"/>
             </w:tcBorders>
-            <w:shd w:val="clear" w:color="auto" w:fill="auto"/>
             <w:noWrap/>
             <w:vAlign w:val="bottom"/>
             <w:hideMark/>
@@ -5485,7 +6332,6 @@
               <w:bottom w:val="single" w:sz="4" w:space="0" w:color="auto"/>
               <w:right w:val="single" w:sz="4" w:space="0" w:color="auto"/>
             </w:tcBorders>
-            <w:shd w:val="clear" w:color="auto" w:fill="auto"/>
             <w:noWrap/>
             <w:vAlign w:val="bottom"/>
             <w:hideMark/>
@@ -5523,7 +6369,6 @@
               <w:bottom w:val="single" w:sz="4" w:space="0" w:color="auto"/>
               <w:right w:val="single" w:sz="4" w:space="0" w:color="auto"/>
             </w:tcBorders>
-            <w:shd w:val="clear" w:color="auto" w:fill="auto"/>
             <w:noWrap/>
             <w:vAlign w:val="bottom"/>
             <w:hideMark/>
@@ -5561,7 +6406,6 @@
               <w:bottom w:val="single" w:sz="4" w:space="0" w:color="auto"/>
               <w:right w:val="single" w:sz="4" w:space="0" w:color="auto"/>
             </w:tcBorders>
-            <w:shd w:val="clear" w:color="auto" w:fill="auto"/>
             <w:noWrap/>
             <w:vAlign w:val="bottom"/>
             <w:hideMark/>
@@ -5599,7 +6443,6 @@
               <w:bottom w:val="single" w:sz="4" w:space="0" w:color="auto"/>
               <w:right w:val="single" w:sz="4" w:space="0" w:color="auto"/>
             </w:tcBorders>
-            <w:shd w:val="clear" w:color="auto" w:fill="auto"/>
             <w:noWrap/>
             <w:vAlign w:val="bottom"/>
             <w:hideMark/>
@@ -5637,7 +6480,6 @@
               <w:bottom w:val="single" w:sz="4" w:space="0" w:color="auto"/>
               <w:right w:val="single" w:sz="4" w:space="0" w:color="auto"/>
             </w:tcBorders>
-            <w:shd w:val="clear" w:color="auto" w:fill="auto"/>
             <w:noWrap/>
             <w:vAlign w:val="bottom"/>
             <w:hideMark/>
@@ -5675,7 +6517,6 @@
               <w:bottom w:val="single" w:sz="4" w:space="0" w:color="auto"/>
               <w:right w:val="single" w:sz="4" w:space="0" w:color="auto"/>
             </w:tcBorders>
-            <w:shd w:val="clear" w:color="auto" w:fill="auto"/>
             <w:noWrap/>
             <w:vAlign w:val="bottom"/>
             <w:hideMark/>
@@ -5718,7 +6559,6 @@
               <w:bottom w:val="single" w:sz="4" w:space="0" w:color="auto"/>
               <w:right w:val="single" w:sz="4" w:space="0" w:color="auto"/>
             </w:tcBorders>
-            <w:shd w:val="clear" w:color="auto" w:fill="auto"/>
             <w:noWrap/>
             <w:vAlign w:val="bottom"/>
             <w:hideMark/>
@@ -5755,7 +6595,6 @@
               <w:bottom w:val="single" w:sz="4" w:space="0" w:color="auto"/>
               <w:right w:val="single" w:sz="4" w:space="0" w:color="auto"/>
             </w:tcBorders>
-            <w:shd w:val="clear" w:color="auto" w:fill="auto"/>
             <w:noWrap/>
             <w:vAlign w:val="bottom"/>
             <w:hideMark/>
@@ -5793,7 +6632,6 @@
               <w:bottom w:val="single" w:sz="4" w:space="0" w:color="auto"/>
               <w:right w:val="single" w:sz="4" w:space="0" w:color="auto"/>
             </w:tcBorders>
-            <w:shd w:val="clear" w:color="auto" w:fill="auto"/>
             <w:noWrap/>
             <w:vAlign w:val="bottom"/>
             <w:hideMark/>
@@ -5831,7 +6669,6 @@
               <w:bottom w:val="single" w:sz="4" w:space="0" w:color="auto"/>
               <w:right w:val="single" w:sz="4" w:space="0" w:color="auto"/>
             </w:tcBorders>
-            <w:shd w:val="clear" w:color="auto" w:fill="auto"/>
             <w:noWrap/>
             <w:vAlign w:val="bottom"/>
             <w:hideMark/>
@@ -5869,7 +6706,6 @@
               <w:bottom w:val="single" w:sz="4" w:space="0" w:color="auto"/>
               <w:right w:val="single" w:sz="4" w:space="0" w:color="auto"/>
             </w:tcBorders>
-            <w:shd w:val="clear" w:color="auto" w:fill="auto"/>
             <w:noWrap/>
             <w:vAlign w:val="bottom"/>
             <w:hideMark/>
@@ -5907,7 +6743,6 @@
               <w:bottom w:val="single" w:sz="4" w:space="0" w:color="auto"/>
               <w:right w:val="single" w:sz="4" w:space="0" w:color="auto"/>
             </w:tcBorders>
-            <w:shd w:val="clear" w:color="auto" w:fill="auto"/>
             <w:noWrap/>
             <w:vAlign w:val="bottom"/>
             <w:hideMark/>
@@ -5945,7 +6780,6 @@
               <w:bottom w:val="single" w:sz="4" w:space="0" w:color="auto"/>
               <w:right w:val="single" w:sz="4" w:space="0" w:color="auto"/>
             </w:tcBorders>
-            <w:shd w:val="clear" w:color="auto" w:fill="auto"/>
             <w:noWrap/>
             <w:vAlign w:val="bottom"/>
             <w:hideMark/>
@@ -5983,7 +6817,6 @@
               <w:bottom w:val="single" w:sz="4" w:space="0" w:color="auto"/>
               <w:right w:val="single" w:sz="4" w:space="0" w:color="auto"/>
             </w:tcBorders>
-            <w:shd w:val="clear" w:color="auto" w:fill="auto"/>
             <w:noWrap/>
             <w:vAlign w:val="bottom"/>
             <w:hideMark/>
@@ -6021,7 +6854,6 @@
               <w:bottom w:val="single" w:sz="4" w:space="0" w:color="auto"/>
               <w:right w:val="single" w:sz="4" w:space="0" w:color="auto"/>
             </w:tcBorders>
-            <w:shd w:val="clear" w:color="auto" w:fill="auto"/>
             <w:noWrap/>
             <w:vAlign w:val="bottom"/>
             <w:hideMark/>
@@ -6059,7 +6891,6 @@
               <w:bottom w:val="single" w:sz="4" w:space="0" w:color="auto"/>
               <w:right w:val="single" w:sz="4" w:space="0" w:color="auto"/>
             </w:tcBorders>
-            <w:shd w:val="clear" w:color="auto" w:fill="auto"/>
             <w:noWrap/>
             <w:vAlign w:val="bottom"/>
             <w:hideMark/>
@@ -6097,7 +6928,6 @@
               <w:bottom w:val="single" w:sz="4" w:space="0" w:color="auto"/>
               <w:right w:val="single" w:sz="4" w:space="0" w:color="auto"/>
             </w:tcBorders>
-            <w:shd w:val="clear" w:color="auto" w:fill="auto"/>
             <w:noWrap/>
             <w:vAlign w:val="bottom"/>
             <w:hideMark/>
@@ -6135,7 +6965,6 @@
               <w:bottom w:val="single" w:sz="4" w:space="0" w:color="auto"/>
               <w:right w:val="single" w:sz="4" w:space="0" w:color="auto"/>
             </w:tcBorders>
-            <w:shd w:val="clear" w:color="auto" w:fill="auto"/>
             <w:noWrap/>
             <w:vAlign w:val="bottom"/>
             <w:hideMark/>
@@ -6178,7 +7007,6 @@
               <w:bottom w:val="single" w:sz="4" w:space="0" w:color="auto"/>
               <w:right w:val="single" w:sz="4" w:space="0" w:color="auto"/>
             </w:tcBorders>
-            <w:shd w:val="clear" w:color="auto" w:fill="auto"/>
             <w:noWrap/>
             <w:vAlign w:val="bottom"/>
             <w:hideMark/>
@@ -6215,7 +7043,6 @@
               <w:bottom w:val="single" w:sz="4" w:space="0" w:color="auto"/>
               <w:right w:val="single" w:sz="4" w:space="0" w:color="auto"/>
             </w:tcBorders>
-            <w:shd w:val="clear" w:color="auto" w:fill="auto"/>
             <w:noWrap/>
             <w:vAlign w:val="bottom"/>
             <w:hideMark/>
@@ -6253,7 +7080,6 @@
               <w:bottom w:val="single" w:sz="4" w:space="0" w:color="auto"/>
               <w:right w:val="single" w:sz="4" w:space="0" w:color="auto"/>
             </w:tcBorders>
-            <w:shd w:val="clear" w:color="auto" w:fill="auto"/>
             <w:noWrap/>
             <w:vAlign w:val="bottom"/>
             <w:hideMark/>
@@ -6291,7 +7117,6 @@
               <w:bottom w:val="single" w:sz="4" w:space="0" w:color="auto"/>
               <w:right w:val="single" w:sz="4" w:space="0" w:color="auto"/>
             </w:tcBorders>
-            <w:shd w:val="clear" w:color="auto" w:fill="auto"/>
             <w:noWrap/>
             <w:vAlign w:val="bottom"/>
             <w:hideMark/>
@@ -6329,7 +7154,6 @@
               <w:bottom w:val="single" w:sz="4" w:space="0" w:color="auto"/>
               <w:right w:val="single" w:sz="4" w:space="0" w:color="auto"/>
             </w:tcBorders>
-            <w:shd w:val="clear" w:color="auto" w:fill="auto"/>
             <w:noWrap/>
             <w:vAlign w:val="bottom"/>
             <w:hideMark/>
@@ -6367,7 +7191,6 @@
               <w:bottom w:val="single" w:sz="4" w:space="0" w:color="auto"/>
               <w:right w:val="single" w:sz="4" w:space="0" w:color="auto"/>
             </w:tcBorders>
-            <w:shd w:val="clear" w:color="auto" w:fill="auto"/>
             <w:noWrap/>
             <w:vAlign w:val="bottom"/>
             <w:hideMark/>
@@ -6405,7 +7228,6 @@
               <w:bottom w:val="single" w:sz="4" w:space="0" w:color="auto"/>
               <w:right w:val="single" w:sz="4" w:space="0" w:color="auto"/>
             </w:tcBorders>
-            <w:shd w:val="clear" w:color="auto" w:fill="auto"/>
             <w:noWrap/>
             <w:vAlign w:val="bottom"/>
             <w:hideMark/>
@@ -6443,7 +7265,6 @@
               <w:bottom w:val="single" w:sz="4" w:space="0" w:color="auto"/>
               <w:right w:val="single" w:sz="4" w:space="0" w:color="auto"/>
             </w:tcBorders>
-            <w:shd w:val="clear" w:color="auto" w:fill="auto"/>
             <w:noWrap/>
             <w:vAlign w:val="bottom"/>
             <w:hideMark/>
@@ -6481,7 +7302,6 @@
               <w:bottom w:val="single" w:sz="4" w:space="0" w:color="auto"/>
               <w:right w:val="single" w:sz="4" w:space="0" w:color="auto"/>
             </w:tcBorders>
-            <w:shd w:val="clear" w:color="auto" w:fill="auto"/>
             <w:noWrap/>
             <w:vAlign w:val="bottom"/>
             <w:hideMark/>
@@ -6519,7 +7339,6 @@
               <w:bottom w:val="single" w:sz="4" w:space="0" w:color="auto"/>
               <w:right w:val="single" w:sz="4" w:space="0" w:color="auto"/>
             </w:tcBorders>
-            <w:shd w:val="clear" w:color="auto" w:fill="auto"/>
             <w:noWrap/>
             <w:vAlign w:val="bottom"/>
             <w:hideMark/>
@@ -6557,7 +7376,6 @@
               <w:bottom w:val="single" w:sz="4" w:space="0" w:color="auto"/>
               <w:right w:val="single" w:sz="4" w:space="0" w:color="auto"/>
             </w:tcBorders>
-            <w:shd w:val="clear" w:color="auto" w:fill="auto"/>
             <w:noWrap/>
             <w:vAlign w:val="bottom"/>
             <w:hideMark/>
@@ -6595,7 +7413,6 @@
               <w:bottom w:val="single" w:sz="4" w:space="0" w:color="auto"/>
               <w:right w:val="single" w:sz="4" w:space="0" w:color="auto"/>
             </w:tcBorders>
-            <w:shd w:val="clear" w:color="auto" w:fill="auto"/>
             <w:noWrap/>
             <w:vAlign w:val="bottom"/>
             <w:hideMark/>
@@ -6638,7 +7455,6 @@
               <w:bottom w:val="single" w:sz="4" w:space="0" w:color="auto"/>
               <w:right w:val="single" w:sz="4" w:space="0" w:color="auto"/>
             </w:tcBorders>
-            <w:shd w:val="clear" w:color="auto" w:fill="auto"/>
             <w:noWrap/>
             <w:vAlign w:val="bottom"/>
             <w:hideMark/>
@@ -6675,7 +7491,6 @@
               <w:bottom w:val="single" w:sz="4" w:space="0" w:color="auto"/>
               <w:right w:val="single" w:sz="4" w:space="0" w:color="auto"/>
             </w:tcBorders>
-            <w:shd w:val="clear" w:color="auto" w:fill="auto"/>
             <w:noWrap/>
             <w:vAlign w:val="bottom"/>
             <w:hideMark/>
@@ -6713,7 +7528,6 @@
               <w:bottom w:val="single" w:sz="4" w:space="0" w:color="auto"/>
               <w:right w:val="single" w:sz="4" w:space="0" w:color="auto"/>
             </w:tcBorders>
-            <w:shd w:val="clear" w:color="auto" w:fill="auto"/>
             <w:noWrap/>
             <w:vAlign w:val="bottom"/>
             <w:hideMark/>
@@ -6751,7 +7565,6 @@
               <w:bottom w:val="single" w:sz="4" w:space="0" w:color="auto"/>
               <w:right w:val="single" w:sz="4" w:space="0" w:color="auto"/>
             </w:tcBorders>
-            <w:shd w:val="clear" w:color="auto" w:fill="auto"/>
             <w:noWrap/>
             <w:vAlign w:val="bottom"/>
             <w:hideMark/>
@@ -6789,7 +7602,6 @@
               <w:bottom w:val="single" w:sz="4" w:space="0" w:color="auto"/>
               <w:right w:val="single" w:sz="4" w:space="0" w:color="auto"/>
             </w:tcBorders>
-            <w:shd w:val="clear" w:color="auto" w:fill="auto"/>
             <w:noWrap/>
             <w:vAlign w:val="bottom"/>
             <w:hideMark/>
@@ -6827,7 +7639,6 @@
               <w:bottom w:val="single" w:sz="4" w:space="0" w:color="auto"/>
               <w:right w:val="single" w:sz="4" w:space="0" w:color="auto"/>
             </w:tcBorders>
-            <w:shd w:val="clear" w:color="auto" w:fill="auto"/>
             <w:noWrap/>
             <w:vAlign w:val="bottom"/>
             <w:hideMark/>
@@ -6865,7 +7676,6 @@
               <w:bottom w:val="single" w:sz="4" w:space="0" w:color="auto"/>
               <w:right w:val="single" w:sz="4" w:space="0" w:color="auto"/>
             </w:tcBorders>
-            <w:shd w:val="clear" w:color="auto" w:fill="auto"/>
             <w:noWrap/>
             <w:vAlign w:val="bottom"/>
             <w:hideMark/>
@@ -6903,7 +7713,6 @@
               <w:bottom w:val="single" w:sz="4" w:space="0" w:color="auto"/>
               <w:right w:val="single" w:sz="4" w:space="0" w:color="auto"/>
             </w:tcBorders>
-            <w:shd w:val="clear" w:color="auto" w:fill="auto"/>
             <w:noWrap/>
             <w:vAlign w:val="bottom"/>
             <w:hideMark/>
@@ -6941,7 +7750,6 @@
               <w:bottom w:val="single" w:sz="4" w:space="0" w:color="auto"/>
               <w:right w:val="single" w:sz="4" w:space="0" w:color="auto"/>
             </w:tcBorders>
-            <w:shd w:val="clear" w:color="auto" w:fill="auto"/>
             <w:noWrap/>
             <w:vAlign w:val="bottom"/>
             <w:hideMark/>
@@ -6979,7 +7787,6 @@
               <w:bottom w:val="single" w:sz="4" w:space="0" w:color="auto"/>
               <w:right w:val="single" w:sz="4" w:space="0" w:color="auto"/>
             </w:tcBorders>
-            <w:shd w:val="clear" w:color="auto" w:fill="auto"/>
             <w:noWrap/>
             <w:vAlign w:val="bottom"/>
             <w:hideMark/>
@@ -7017,7 +7824,6 @@
               <w:bottom w:val="single" w:sz="4" w:space="0" w:color="auto"/>
               <w:right w:val="single" w:sz="4" w:space="0" w:color="auto"/>
             </w:tcBorders>
-            <w:shd w:val="clear" w:color="auto" w:fill="auto"/>
             <w:noWrap/>
             <w:vAlign w:val="bottom"/>
             <w:hideMark/>
@@ -7055,7 +7861,6 @@
               <w:bottom w:val="single" w:sz="4" w:space="0" w:color="auto"/>
               <w:right w:val="single" w:sz="4" w:space="0" w:color="auto"/>
             </w:tcBorders>
-            <w:shd w:val="clear" w:color="auto" w:fill="auto"/>
             <w:noWrap/>
             <w:vAlign w:val="bottom"/>
             <w:hideMark/>
@@ -7098,7 +7903,6 @@
               <w:bottom w:val="single" w:sz="4" w:space="0" w:color="auto"/>
               <w:right w:val="single" w:sz="4" w:space="0" w:color="auto"/>
             </w:tcBorders>
-            <w:shd w:val="clear" w:color="auto" w:fill="auto"/>
             <w:noWrap/>
             <w:vAlign w:val="bottom"/>
             <w:hideMark/>
@@ -7135,7 +7939,6 @@
               <w:bottom w:val="single" w:sz="4" w:space="0" w:color="auto"/>
               <w:right w:val="single" w:sz="4" w:space="0" w:color="auto"/>
             </w:tcBorders>
-            <w:shd w:val="clear" w:color="auto" w:fill="auto"/>
             <w:noWrap/>
             <w:vAlign w:val="bottom"/>
             <w:hideMark/>
@@ -7173,7 +7976,6 @@
               <w:bottom w:val="single" w:sz="4" w:space="0" w:color="auto"/>
               <w:right w:val="single" w:sz="4" w:space="0" w:color="auto"/>
             </w:tcBorders>
-            <w:shd w:val="clear" w:color="auto" w:fill="auto"/>
             <w:noWrap/>
             <w:vAlign w:val="bottom"/>
             <w:hideMark/>
@@ -7211,7 +8013,6 @@
               <w:bottom w:val="single" w:sz="4" w:space="0" w:color="auto"/>
               <w:right w:val="single" w:sz="4" w:space="0" w:color="auto"/>
             </w:tcBorders>
-            <w:shd w:val="clear" w:color="auto" w:fill="auto"/>
             <w:noWrap/>
             <w:vAlign w:val="bottom"/>
             <w:hideMark/>
@@ -7249,7 +8050,6 @@
               <w:bottom w:val="single" w:sz="4" w:space="0" w:color="auto"/>
               <w:right w:val="single" w:sz="4" w:space="0" w:color="auto"/>
             </w:tcBorders>
-            <w:shd w:val="clear" w:color="auto" w:fill="auto"/>
             <w:noWrap/>
             <w:vAlign w:val="bottom"/>
             <w:hideMark/>
@@ -7287,7 +8087,6 @@
               <w:bottom w:val="single" w:sz="4" w:space="0" w:color="auto"/>
               <w:right w:val="single" w:sz="4" w:space="0" w:color="auto"/>
             </w:tcBorders>
-            <w:shd w:val="clear" w:color="auto" w:fill="auto"/>
             <w:noWrap/>
             <w:vAlign w:val="bottom"/>
             <w:hideMark/>
@@ -7325,7 +8124,6 @@
               <w:bottom w:val="single" w:sz="4" w:space="0" w:color="auto"/>
               <w:right w:val="single" w:sz="4" w:space="0" w:color="auto"/>
             </w:tcBorders>
-            <w:shd w:val="clear" w:color="auto" w:fill="auto"/>
             <w:noWrap/>
             <w:vAlign w:val="bottom"/>
             <w:hideMark/>
@@ -7363,7 +8161,6 @@
               <w:bottom w:val="single" w:sz="4" w:space="0" w:color="auto"/>
               <w:right w:val="single" w:sz="4" w:space="0" w:color="auto"/>
             </w:tcBorders>
-            <w:shd w:val="clear" w:color="auto" w:fill="auto"/>
             <w:noWrap/>
             <w:vAlign w:val="bottom"/>
             <w:hideMark/>
@@ -7401,7 +8198,6 @@
               <w:bottom w:val="single" w:sz="4" w:space="0" w:color="auto"/>
               <w:right w:val="single" w:sz="4" w:space="0" w:color="auto"/>
             </w:tcBorders>
-            <w:shd w:val="clear" w:color="auto" w:fill="auto"/>
             <w:noWrap/>
             <w:vAlign w:val="bottom"/>
             <w:hideMark/>
@@ -7439,7 +8235,6 @@
               <w:bottom w:val="single" w:sz="4" w:space="0" w:color="auto"/>
               <w:right w:val="single" w:sz="4" w:space="0" w:color="auto"/>
             </w:tcBorders>
-            <w:shd w:val="clear" w:color="auto" w:fill="auto"/>
             <w:noWrap/>
             <w:vAlign w:val="bottom"/>
             <w:hideMark/>
@@ -7477,7 +8272,6 @@
               <w:bottom w:val="single" w:sz="4" w:space="0" w:color="auto"/>
               <w:right w:val="single" w:sz="4" w:space="0" w:color="auto"/>
             </w:tcBorders>
-            <w:shd w:val="clear" w:color="auto" w:fill="auto"/>
             <w:noWrap/>
             <w:vAlign w:val="bottom"/>
             <w:hideMark/>
@@ -7515,7 +8309,6 @@
               <w:bottom w:val="single" w:sz="4" w:space="0" w:color="auto"/>
               <w:right w:val="single" w:sz="4" w:space="0" w:color="auto"/>
             </w:tcBorders>
-            <w:shd w:val="clear" w:color="auto" w:fill="auto"/>
             <w:noWrap/>
             <w:vAlign w:val="bottom"/>
             <w:hideMark/>
@@ -7558,7 +8351,6 @@
               <w:bottom w:val="single" w:sz="4" w:space="0" w:color="auto"/>
               <w:right w:val="single" w:sz="4" w:space="0" w:color="auto"/>
             </w:tcBorders>
-            <w:shd w:val="clear" w:color="auto" w:fill="auto"/>
             <w:noWrap/>
             <w:vAlign w:val="bottom"/>
             <w:hideMark/>
@@ -7595,7 +8387,6 @@
               <w:bottom w:val="single" w:sz="4" w:space="0" w:color="auto"/>
               <w:right w:val="single" w:sz="4" w:space="0" w:color="auto"/>
             </w:tcBorders>
-            <w:shd w:val="clear" w:color="auto" w:fill="auto"/>
             <w:noWrap/>
             <w:vAlign w:val="bottom"/>
             <w:hideMark/>
@@ -7633,7 +8424,6 @@
               <w:bottom w:val="single" w:sz="4" w:space="0" w:color="auto"/>
               <w:right w:val="single" w:sz="4" w:space="0" w:color="auto"/>
             </w:tcBorders>
-            <w:shd w:val="clear" w:color="auto" w:fill="auto"/>
             <w:noWrap/>
             <w:vAlign w:val="bottom"/>
             <w:hideMark/>
@@ -7671,7 +8461,6 @@
               <w:bottom w:val="single" w:sz="4" w:space="0" w:color="auto"/>
               <w:right w:val="single" w:sz="4" w:space="0" w:color="auto"/>
             </w:tcBorders>
-            <w:shd w:val="clear" w:color="auto" w:fill="auto"/>
             <w:noWrap/>
             <w:vAlign w:val="bottom"/>
             <w:hideMark/>
@@ -7709,7 +8498,6 @@
               <w:bottom w:val="single" w:sz="4" w:space="0" w:color="auto"/>
               <w:right w:val="single" w:sz="4" w:space="0" w:color="auto"/>
             </w:tcBorders>
-            <w:shd w:val="clear" w:color="auto" w:fill="auto"/>
             <w:noWrap/>
             <w:vAlign w:val="bottom"/>
             <w:hideMark/>
@@ -7747,7 +8535,6 @@
               <w:bottom w:val="single" w:sz="4" w:space="0" w:color="auto"/>
               <w:right w:val="single" w:sz="4" w:space="0" w:color="auto"/>
             </w:tcBorders>
-            <w:shd w:val="clear" w:color="auto" w:fill="auto"/>
             <w:noWrap/>
             <w:vAlign w:val="bottom"/>
             <w:hideMark/>
@@ -7785,7 +8572,6 @@
               <w:bottom w:val="single" w:sz="4" w:space="0" w:color="auto"/>
               <w:right w:val="single" w:sz="4" w:space="0" w:color="auto"/>
             </w:tcBorders>
-            <w:shd w:val="clear" w:color="auto" w:fill="auto"/>
             <w:noWrap/>
             <w:vAlign w:val="bottom"/>
             <w:hideMark/>
@@ -7823,7 +8609,6 @@
               <w:bottom w:val="single" w:sz="4" w:space="0" w:color="auto"/>
               <w:right w:val="single" w:sz="4" w:space="0" w:color="auto"/>
             </w:tcBorders>
-            <w:shd w:val="clear" w:color="auto" w:fill="auto"/>
             <w:noWrap/>
             <w:vAlign w:val="bottom"/>
             <w:hideMark/>
@@ -7861,7 +8646,6 @@
               <w:bottom w:val="single" w:sz="4" w:space="0" w:color="auto"/>
               <w:right w:val="single" w:sz="4" w:space="0" w:color="auto"/>
             </w:tcBorders>
-            <w:shd w:val="clear" w:color="auto" w:fill="auto"/>
             <w:noWrap/>
             <w:vAlign w:val="bottom"/>
             <w:hideMark/>
@@ -7899,7 +8683,6 @@
               <w:bottom w:val="single" w:sz="4" w:space="0" w:color="auto"/>
               <w:right w:val="single" w:sz="4" w:space="0" w:color="auto"/>
             </w:tcBorders>
-            <w:shd w:val="clear" w:color="auto" w:fill="auto"/>
             <w:noWrap/>
             <w:vAlign w:val="bottom"/>
             <w:hideMark/>
@@ -7937,7 +8720,6 @@
               <w:bottom w:val="single" w:sz="4" w:space="0" w:color="auto"/>
               <w:right w:val="single" w:sz="4" w:space="0" w:color="auto"/>
             </w:tcBorders>
-            <w:shd w:val="clear" w:color="auto" w:fill="auto"/>
             <w:noWrap/>
             <w:vAlign w:val="bottom"/>
             <w:hideMark/>
@@ -7975,7 +8757,6 @@
               <w:bottom w:val="single" w:sz="4" w:space="0" w:color="auto"/>
               <w:right w:val="single" w:sz="4" w:space="0" w:color="auto"/>
             </w:tcBorders>
-            <w:shd w:val="clear" w:color="auto" w:fill="auto"/>
             <w:noWrap/>
             <w:vAlign w:val="bottom"/>
             <w:hideMark/>
@@ -8018,7 +8799,6 @@
               <w:bottom w:val="single" w:sz="4" w:space="0" w:color="auto"/>
               <w:right w:val="single" w:sz="4" w:space="0" w:color="auto"/>
             </w:tcBorders>
-            <w:shd w:val="clear" w:color="auto" w:fill="auto"/>
             <w:noWrap/>
             <w:vAlign w:val="bottom"/>
             <w:hideMark/>
@@ -8055,7 +8835,6 @@
               <w:bottom w:val="single" w:sz="4" w:space="0" w:color="auto"/>
               <w:right w:val="single" w:sz="4" w:space="0" w:color="auto"/>
             </w:tcBorders>
-            <w:shd w:val="clear" w:color="auto" w:fill="auto"/>
             <w:noWrap/>
             <w:vAlign w:val="bottom"/>
             <w:hideMark/>
@@ -8093,7 +8872,6 @@
               <w:bottom w:val="single" w:sz="4" w:space="0" w:color="auto"/>
               <w:right w:val="single" w:sz="4" w:space="0" w:color="auto"/>
             </w:tcBorders>
-            <w:shd w:val="clear" w:color="auto" w:fill="auto"/>
             <w:noWrap/>
             <w:vAlign w:val="bottom"/>
             <w:hideMark/>
@@ -8131,7 +8909,6 @@
               <w:bottom w:val="single" w:sz="4" w:space="0" w:color="auto"/>
               <w:right w:val="single" w:sz="4" w:space="0" w:color="auto"/>
             </w:tcBorders>
-            <w:shd w:val="clear" w:color="auto" w:fill="auto"/>
             <w:noWrap/>
             <w:vAlign w:val="bottom"/>
             <w:hideMark/>
@@ -8169,7 +8946,6 @@
               <w:bottom w:val="single" w:sz="4" w:space="0" w:color="auto"/>
               <w:right w:val="single" w:sz="4" w:space="0" w:color="auto"/>
             </w:tcBorders>
-            <w:shd w:val="clear" w:color="auto" w:fill="auto"/>
             <w:noWrap/>
             <w:vAlign w:val="bottom"/>
             <w:hideMark/>
@@ -8207,7 +8983,6 @@
               <w:bottom w:val="single" w:sz="4" w:space="0" w:color="auto"/>
               <w:right w:val="single" w:sz="4" w:space="0" w:color="auto"/>
             </w:tcBorders>
-            <w:shd w:val="clear" w:color="auto" w:fill="auto"/>
             <w:noWrap/>
             <w:vAlign w:val="bottom"/>
             <w:hideMark/>
@@ -8245,7 +9020,6 @@
               <w:bottom w:val="single" w:sz="4" w:space="0" w:color="auto"/>
               <w:right w:val="single" w:sz="4" w:space="0" w:color="auto"/>
             </w:tcBorders>
-            <w:shd w:val="clear" w:color="auto" w:fill="auto"/>
             <w:noWrap/>
             <w:vAlign w:val="bottom"/>
             <w:hideMark/>
@@ -8283,7 +9057,6 @@
               <w:bottom w:val="single" w:sz="4" w:space="0" w:color="auto"/>
               <w:right w:val="single" w:sz="4" w:space="0" w:color="auto"/>
             </w:tcBorders>
-            <w:shd w:val="clear" w:color="auto" w:fill="auto"/>
             <w:noWrap/>
             <w:vAlign w:val="bottom"/>
             <w:hideMark/>
@@ -8321,7 +9094,6 @@
               <w:bottom w:val="single" w:sz="4" w:space="0" w:color="auto"/>
               <w:right w:val="single" w:sz="4" w:space="0" w:color="auto"/>
             </w:tcBorders>
-            <w:shd w:val="clear" w:color="auto" w:fill="auto"/>
             <w:noWrap/>
             <w:vAlign w:val="bottom"/>
             <w:hideMark/>
@@ -8359,7 +9131,6 @@
               <w:bottom w:val="single" w:sz="4" w:space="0" w:color="auto"/>
               <w:right w:val="single" w:sz="4" w:space="0" w:color="auto"/>
             </w:tcBorders>
-            <w:shd w:val="clear" w:color="auto" w:fill="auto"/>
             <w:noWrap/>
             <w:vAlign w:val="bottom"/>
             <w:hideMark/>
@@ -8397,7 +9168,6 @@
               <w:bottom w:val="single" w:sz="4" w:space="0" w:color="auto"/>
               <w:right w:val="single" w:sz="4" w:space="0" w:color="auto"/>
             </w:tcBorders>
-            <w:shd w:val="clear" w:color="auto" w:fill="auto"/>
             <w:noWrap/>
             <w:vAlign w:val="bottom"/>
             <w:hideMark/>
@@ -8435,7 +9205,6 @@
               <w:bottom w:val="single" w:sz="4" w:space="0" w:color="auto"/>
               <w:right w:val="single" w:sz="4" w:space="0" w:color="auto"/>
             </w:tcBorders>
-            <w:shd w:val="clear" w:color="auto" w:fill="auto"/>
             <w:noWrap/>
             <w:vAlign w:val="bottom"/>
             <w:hideMark/>
@@ -8478,7 +9247,6 @@
               <w:bottom w:val="single" w:sz="4" w:space="0" w:color="auto"/>
               <w:right w:val="single" w:sz="4" w:space="0" w:color="auto"/>
             </w:tcBorders>
-            <w:shd w:val="clear" w:color="auto" w:fill="auto"/>
             <w:noWrap/>
             <w:vAlign w:val="bottom"/>
             <w:hideMark/>
@@ -8515,7 +9283,6 @@
               <w:bottom w:val="single" w:sz="4" w:space="0" w:color="auto"/>
               <w:right w:val="single" w:sz="4" w:space="0" w:color="auto"/>
             </w:tcBorders>
-            <w:shd w:val="clear" w:color="auto" w:fill="auto"/>
             <w:noWrap/>
             <w:vAlign w:val="bottom"/>
             <w:hideMark/>
@@ -8553,7 +9320,6 @@
               <w:bottom w:val="single" w:sz="4" w:space="0" w:color="auto"/>
               <w:right w:val="single" w:sz="4" w:space="0" w:color="auto"/>
             </w:tcBorders>
-            <w:shd w:val="clear" w:color="auto" w:fill="auto"/>
             <w:noWrap/>
             <w:vAlign w:val="bottom"/>
             <w:hideMark/>
@@ -8591,7 +9357,6 @@
               <w:bottom w:val="single" w:sz="4" w:space="0" w:color="auto"/>
               <w:right w:val="single" w:sz="4" w:space="0" w:color="auto"/>
             </w:tcBorders>
-            <w:shd w:val="clear" w:color="auto" w:fill="auto"/>
             <w:noWrap/>
             <w:vAlign w:val="bottom"/>
             <w:hideMark/>
@@ -8629,7 +9394,6 @@
               <w:bottom w:val="single" w:sz="4" w:space="0" w:color="auto"/>
               <w:right w:val="single" w:sz="4" w:space="0" w:color="auto"/>
             </w:tcBorders>
-            <w:shd w:val="clear" w:color="auto" w:fill="auto"/>
             <w:noWrap/>
             <w:vAlign w:val="bottom"/>
             <w:hideMark/>
@@ -8667,7 +9431,6 @@
               <w:bottom w:val="single" w:sz="4" w:space="0" w:color="auto"/>
               <w:right w:val="single" w:sz="4" w:space="0" w:color="auto"/>
             </w:tcBorders>
-            <w:shd w:val="clear" w:color="auto" w:fill="auto"/>
             <w:noWrap/>
             <w:vAlign w:val="bottom"/>
             <w:hideMark/>
@@ -8705,7 +9468,6 @@
               <w:bottom w:val="single" w:sz="4" w:space="0" w:color="auto"/>
               <w:right w:val="single" w:sz="4" w:space="0" w:color="auto"/>
             </w:tcBorders>
-            <w:shd w:val="clear" w:color="auto" w:fill="auto"/>
             <w:noWrap/>
             <w:vAlign w:val="bottom"/>
             <w:hideMark/>
@@ -8743,7 +9505,6 @@
               <w:bottom w:val="single" w:sz="4" w:space="0" w:color="auto"/>
               <w:right w:val="single" w:sz="4" w:space="0" w:color="auto"/>
             </w:tcBorders>
-            <w:shd w:val="clear" w:color="auto" w:fill="auto"/>
             <w:noWrap/>
             <w:vAlign w:val="bottom"/>
             <w:hideMark/>
@@ -8781,7 +9542,6 @@
               <w:bottom w:val="single" w:sz="4" w:space="0" w:color="auto"/>
               <w:right w:val="single" w:sz="4" w:space="0" w:color="auto"/>
             </w:tcBorders>
-            <w:shd w:val="clear" w:color="auto" w:fill="auto"/>
             <w:noWrap/>
             <w:vAlign w:val="bottom"/>
             <w:hideMark/>
@@ -8819,7 +9579,6 @@
               <w:bottom w:val="single" w:sz="4" w:space="0" w:color="auto"/>
               <w:right w:val="single" w:sz="4" w:space="0" w:color="auto"/>
             </w:tcBorders>
-            <w:shd w:val="clear" w:color="auto" w:fill="auto"/>
             <w:noWrap/>
             <w:vAlign w:val="bottom"/>
             <w:hideMark/>
@@ -8857,7 +9616,6 @@
               <w:bottom w:val="single" w:sz="4" w:space="0" w:color="auto"/>
               <w:right w:val="single" w:sz="4" w:space="0" w:color="auto"/>
             </w:tcBorders>
-            <w:shd w:val="clear" w:color="auto" w:fill="auto"/>
             <w:noWrap/>
             <w:vAlign w:val="bottom"/>
             <w:hideMark/>
@@ -8895,7 +9653,6 @@
               <w:bottom w:val="single" w:sz="4" w:space="0" w:color="auto"/>
               <w:right w:val="single" w:sz="4" w:space="0" w:color="auto"/>
             </w:tcBorders>
-            <w:shd w:val="clear" w:color="auto" w:fill="auto"/>
             <w:noWrap/>
             <w:vAlign w:val="bottom"/>
             <w:hideMark/>
@@ -8938,7 +9695,6 @@
               <w:bottom w:val="single" w:sz="4" w:space="0" w:color="auto"/>
               <w:right w:val="single" w:sz="4" w:space="0" w:color="auto"/>
             </w:tcBorders>
-            <w:shd w:val="clear" w:color="auto" w:fill="auto"/>
             <w:noWrap/>
             <w:vAlign w:val="bottom"/>
             <w:hideMark/>
@@ -8975,7 +9731,6 @@
               <w:bottom w:val="single" w:sz="4" w:space="0" w:color="auto"/>
               <w:right w:val="single" w:sz="4" w:space="0" w:color="auto"/>
             </w:tcBorders>
-            <w:shd w:val="clear" w:color="auto" w:fill="auto"/>
             <w:noWrap/>
             <w:vAlign w:val="bottom"/>
             <w:hideMark/>
@@ -9013,7 +9768,6 @@
               <w:bottom w:val="single" w:sz="4" w:space="0" w:color="auto"/>
               <w:right w:val="single" w:sz="4" w:space="0" w:color="auto"/>
             </w:tcBorders>
-            <w:shd w:val="clear" w:color="auto" w:fill="auto"/>
             <w:noWrap/>
             <w:vAlign w:val="bottom"/>
             <w:hideMark/>
@@ -9051,7 +9805,6 @@
               <w:bottom w:val="single" w:sz="4" w:space="0" w:color="auto"/>
               <w:right w:val="single" w:sz="4" w:space="0" w:color="auto"/>
             </w:tcBorders>
-            <w:shd w:val="clear" w:color="auto" w:fill="auto"/>
             <w:noWrap/>
             <w:vAlign w:val="bottom"/>
             <w:hideMark/>
@@ -9089,7 +9842,6 @@
               <w:bottom w:val="single" w:sz="4" w:space="0" w:color="auto"/>
               <w:right w:val="single" w:sz="4" w:space="0" w:color="auto"/>
             </w:tcBorders>
-            <w:shd w:val="clear" w:color="auto" w:fill="auto"/>
             <w:noWrap/>
             <w:vAlign w:val="bottom"/>
             <w:hideMark/>
@@ -9127,7 +9879,6 @@
               <w:bottom w:val="single" w:sz="4" w:space="0" w:color="auto"/>
               <w:right w:val="single" w:sz="4" w:space="0" w:color="auto"/>
             </w:tcBorders>
-            <w:shd w:val="clear" w:color="auto" w:fill="auto"/>
             <w:noWrap/>
             <w:vAlign w:val="bottom"/>
             <w:hideMark/>
@@ -9165,7 +9916,6 @@
               <w:bottom w:val="single" w:sz="4" w:space="0" w:color="auto"/>
               <w:right w:val="single" w:sz="4" w:space="0" w:color="auto"/>
             </w:tcBorders>
-            <w:shd w:val="clear" w:color="auto" w:fill="auto"/>
             <w:noWrap/>
             <w:vAlign w:val="bottom"/>
             <w:hideMark/>
@@ -9203,7 +9953,6 @@
               <w:bottom w:val="single" w:sz="4" w:space="0" w:color="auto"/>
               <w:right w:val="single" w:sz="4" w:space="0" w:color="auto"/>
             </w:tcBorders>
-            <w:shd w:val="clear" w:color="auto" w:fill="auto"/>
             <w:noWrap/>
             <w:vAlign w:val="bottom"/>
             <w:hideMark/>
@@ -9241,7 +9990,6 @@
               <w:bottom w:val="single" w:sz="4" w:space="0" w:color="auto"/>
               <w:right w:val="single" w:sz="4" w:space="0" w:color="auto"/>
             </w:tcBorders>
-            <w:shd w:val="clear" w:color="auto" w:fill="auto"/>
             <w:noWrap/>
             <w:vAlign w:val="bottom"/>
             <w:hideMark/>
@@ -9279,7 +10027,6 @@
               <w:bottom w:val="single" w:sz="4" w:space="0" w:color="auto"/>
               <w:right w:val="single" w:sz="4" w:space="0" w:color="auto"/>
             </w:tcBorders>
-            <w:shd w:val="clear" w:color="auto" w:fill="auto"/>
             <w:noWrap/>
             <w:vAlign w:val="bottom"/>
             <w:hideMark/>
@@ -9317,7 +10064,6 @@
               <w:bottom w:val="single" w:sz="4" w:space="0" w:color="auto"/>
               <w:right w:val="single" w:sz="4" w:space="0" w:color="auto"/>
             </w:tcBorders>
-            <w:shd w:val="clear" w:color="auto" w:fill="auto"/>
             <w:noWrap/>
             <w:vAlign w:val="bottom"/>
             <w:hideMark/>
@@ -9355,7 +10101,6 @@
               <w:bottom w:val="single" w:sz="4" w:space="0" w:color="auto"/>
               <w:right w:val="single" w:sz="4" w:space="0" w:color="auto"/>
             </w:tcBorders>
-            <w:shd w:val="clear" w:color="auto" w:fill="auto"/>
             <w:noWrap/>
             <w:vAlign w:val="bottom"/>
             <w:hideMark/>
@@ -9398,7 +10143,6 @@
               <w:bottom w:val="single" w:sz="4" w:space="0" w:color="auto"/>
               <w:right w:val="single" w:sz="4" w:space="0" w:color="auto"/>
             </w:tcBorders>
-            <w:shd w:val="clear" w:color="auto" w:fill="auto"/>
             <w:noWrap/>
             <w:vAlign w:val="bottom"/>
             <w:hideMark/>
@@ -9435,7 +10179,6 @@
               <w:bottom w:val="single" w:sz="4" w:space="0" w:color="auto"/>
               <w:right w:val="single" w:sz="4" w:space="0" w:color="auto"/>
             </w:tcBorders>
-            <w:shd w:val="clear" w:color="auto" w:fill="auto"/>
             <w:noWrap/>
             <w:vAlign w:val="bottom"/>
             <w:hideMark/>
@@ -9473,7 +10216,6 @@
               <w:bottom w:val="single" w:sz="4" w:space="0" w:color="auto"/>
               <w:right w:val="single" w:sz="4" w:space="0" w:color="auto"/>
             </w:tcBorders>
-            <w:shd w:val="clear" w:color="auto" w:fill="auto"/>
             <w:noWrap/>
             <w:vAlign w:val="bottom"/>
             <w:hideMark/>
@@ -9511,7 +10253,6 @@
               <w:bottom w:val="single" w:sz="4" w:space="0" w:color="auto"/>
               <w:right w:val="single" w:sz="4" w:space="0" w:color="auto"/>
             </w:tcBorders>
-            <w:shd w:val="clear" w:color="auto" w:fill="auto"/>
             <w:noWrap/>
             <w:vAlign w:val="bottom"/>
             <w:hideMark/>
@@ -9549,7 +10290,6 @@
               <w:bottom w:val="single" w:sz="4" w:space="0" w:color="auto"/>
               <w:right w:val="single" w:sz="4" w:space="0" w:color="auto"/>
             </w:tcBorders>
-            <w:shd w:val="clear" w:color="auto" w:fill="auto"/>
             <w:noWrap/>
             <w:vAlign w:val="bottom"/>
             <w:hideMark/>
@@ -9587,7 +10327,6 @@
               <w:bottom w:val="single" w:sz="4" w:space="0" w:color="auto"/>
               <w:right w:val="single" w:sz="4" w:space="0" w:color="auto"/>
             </w:tcBorders>
-            <w:shd w:val="clear" w:color="auto" w:fill="auto"/>
             <w:noWrap/>
             <w:vAlign w:val="bottom"/>
             <w:hideMark/>
@@ -9625,7 +10364,6 @@
               <w:bottom w:val="single" w:sz="4" w:space="0" w:color="auto"/>
               <w:right w:val="single" w:sz="4" w:space="0" w:color="auto"/>
             </w:tcBorders>
-            <w:shd w:val="clear" w:color="auto" w:fill="auto"/>
             <w:noWrap/>
             <w:vAlign w:val="bottom"/>
             <w:hideMark/>
@@ -9663,7 +10401,6 @@
               <w:bottom w:val="single" w:sz="4" w:space="0" w:color="auto"/>
               <w:right w:val="single" w:sz="4" w:space="0" w:color="auto"/>
             </w:tcBorders>
-            <w:shd w:val="clear" w:color="auto" w:fill="auto"/>
             <w:noWrap/>
             <w:vAlign w:val="bottom"/>
             <w:hideMark/>
@@ -9701,7 +10438,6 @@
               <w:bottom w:val="single" w:sz="4" w:space="0" w:color="auto"/>
               <w:right w:val="single" w:sz="4" w:space="0" w:color="auto"/>
             </w:tcBorders>
-            <w:shd w:val="clear" w:color="auto" w:fill="auto"/>
             <w:noWrap/>
             <w:vAlign w:val="bottom"/>
             <w:hideMark/>
@@ -9739,7 +10475,6 @@
               <w:bottom w:val="single" w:sz="4" w:space="0" w:color="auto"/>
               <w:right w:val="single" w:sz="4" w:space="0" w:color="auto"/>
             </w:tcBorders>
-            <w:shd w:val="clear" w:color="auto" w:fill="auto"/>
             <w:noWrap/>
             <w:vAlign w:val="bottom"/>
             <w:hideMark/>
@@ -9777,7 +10512,6 @@
               <w:bottom w:val="single" w:sz="4" w:space="0" w:color="auto"/>
               <w:right w:val="single" w:sz="4" w:space="0" w:color="auto"/>
             </w:tcBorders>
-            <w:shd w:val="clear" w:color="auto" w:fill="auto"/>
             <w:noWrap/>
             <w:vAlign w:val="bottom"/>
             <w:hideMark/>
@@ -9815,7 +10549,6 @@
               <w:bottom w:val="single" w:sz="4" w:space="0" w:color="auto"/>
               <w:right w:val="single" w:sz="4" w:space="0" w:color="auto"/>
             </w:tcBorders>
-            <w:shd w:val="clear" w:color="auto" w:fill="auto"/>
             <w:noWrap/>
             <w:vAlign w:val="bottom"/>
             <w:hideMark/>
@@ -9858,7 +10591,6 @@
               <w:bottom w:val="single" w:sz="4" w:space="0" w:color="auto"/>
               <w:right w:val="single" w:sz="4" w:space="0" w:color="auto"/>
             </w:tcBorders>
-            <w:shd w:val="clear" w:color="auto" w:fill="auto"/>
             <w:noWrap/>
             <w:vAlign w:val="bottom"/>
             <w:hideMark/>
@@ -9895,7 +10627,6 @@
               <w:bottom w:val="single" w:sz="4" w:space="0" w:color="auto"/>
               <w:right w:val="single" w:sz="4" w:space="0" w:color="auto"/>
             </w:tcBorders>
-            <w:shd w:val="clear" w:color="auto" w:fill="auto"/>
             <w:noWrap/>
             <w:vAlign w:val="bottom"/>
             <w:hideMark/>
@@ -9933,7 +10664,6 @@
               <w:bottom w:val="single" w:sz="4" w:space="0" w:color="auto"/>
               <w:right w:val="single" w:sz="4" w:space="0" w:color="auto"/>
             </w:tcBorders>
-            <w:shd w:val="clear" w:color="auto" w:fill="auto"/>
             <w:noWrap/>
             <w:vAlign w:val="bottom"/>
             <w:hideMark/>
@@ -9971,7 +10701,6 @@
               <w:bottom w:val="single" w:sz="4" w:space="0" w:color="auto"/>
               <w:right w:val="single" w:sz="4" w:space="0" w:color="auto"/>
             </w:tcBorders>
-            <w:shd w:val="clear" w:color="auto" w:fill="auto"/>
             <w:noWrap/>
             <w:vAlign w:val="bottom"/>
             <w:hideMark/>
@@ -10009,7 +10738,6 @@
               <w:bottom w:val="single" w:sz="4" w:space="0" w:color="auto"/>
               <w:right w:val="single" w:sz="4" w:space="0" w:color="auto"/>
             </w:tcBorders>
-            <w:shd w:val="clear" w:color="auto" w:fill="auto"/>
             <w:noWrap/>
             <w:vAlign w:val="bottom"/>
             <w:hideMark/>
@@ -10047,7 +10775,6 @@
               <w:bottom w:val="single" w:sz="4" w:space="0" w:color="auto"/>
               <w:right w:val="single" w:sz="4" w:space="0" w:color="auto"/>
             </w:tcBorders>
-            <w:shd w:val="clear" w:color="auto" w:fill="auto"/>
             <w:noWrap/>
             <w:vAlign w:val="bottom"/>
             <w:hideMark/>
@@ -10085,7 +10812,6 @@
               <w:bottom w:val="single" w:sz="4" w:space="0" w:color="auto"/>
               <w:right w:val="single" w:sz="4" w:space="0" w:color="auto"/>
             </w:tcBorders>
-            <w:shd w:val="clear" w:color="auto" w:fill="auto"/>
             <w:noWrap/>
             <w:vAlign w:val="bottom"/>
             <w:hideMark/>
@@ -10123,7 +10849,6 @@
               <w:bottom w:val="single" w:sz="4" w:space="0" w:color="auto"/>
               <w:right w:val="single" w:sz="4" w:space="0" w:color="auto"/>
             </w:tcBorders>
-            <w:shd w:val="clear" w:color="auto" w:fill="auto"/>
             <w:noWrap/>
             <w:vAlign w:val="bottom"/>
             <w:hideMark/>
@@ -10161,7 +10886,6 @@
               <w:bottom w:val="single" w:sz="4" w:space="0" w:color="auto"/>
               <w:right w:val="single" w:sz="4" w:space="0" w:color="auto"/>
             </w:tcBorders>
-            <w:shd w:val="clear" w:color="auto" w:fill="auto"/>
             <w:noWrap/>
             <w:vAlign w:val="bottom"/>
             <w:hideMark/>
@@ -10199,7 +10923,6 @@
               <w:bottom w:val="single" w:sz="4" w:space="0" w:color="auto"/>
               <w:right w:val="single" w:sz="4" w:space="0" w:color="auto"/>
             </w:tcBorders>
-            <w:shd w:val="clear" w:color="auto" w:fill="auto"/>
             <w:noWrap/>
             <w:vAlign w:val="bottom"/>
             <w:hideMark/>
@@ -10237,7 +10960,6 @@
               <w:bottom w:val="single" w:sz="4" w:space="0" w:color="auto"/>
               <w:right w:val="single" w:sz="4" w:space="0" w:color="auto"/>
             </w:tcBorders>
-            <w:shd w:val="clear" w:color="auto" w:fill="auto"/>
             <w:noWrap/>
             <w:vAlign w:val="bottom"/>
             <w:hideMark/>
@@ -10275,7 +10997,6 @@
               <w:bottom w:val="single" w:sz="4" w:space="0" w:color="auto"/>
               <w:right w:val="single" w:sz="4" w:space="0" w:color="auto"/>
             </w:tcBorders>
-            <w:shd w:val="clear" w:color="auto" w:fill="auto"/>
             <w:noWrap/>
             <w:vAlign w:val="bottom"/>
             <w:hideMark/>
@@ -10318,7 +11039,6 @@
               <w:bottom w:val="single" w:sz="4" w:space="0" w:color="auto"/>
               <w:right w:val="single" w:sz="4" w:space="0" w:color="auto"/>
             </w:tcBorders>
-            <w:shd w:val="clear" w:color="auto" w:fill="auto"/>
             <w:noWrap/>
             <w:vAlign w:val="bottom"/>
             <w:hideMark/>
@@ -10355,7 +11075,6 @@
               <w:bottom w:val="single" w:sz="4" w:space="0" w:color="auto"/>
               <w:right w:val="single" w:sz="4" w:space="0" w:color="auto"/>
             </w:tcBorders>
-            <w:shd w:val="clear" w:color="auto" w:fill="auto"/>
             <w:noWrap/>
             <w:vAlign w:val="bottom"/>
             <w:hideMark/>
@@ -10393,7 +11112,6 @@
               <w:bottom w:val="single" w:sz="4" w:space="0" w:color="auto"/>
               <w:right w:val="single" w:sz="4" w:space="0" w:color="auto"/>
             </w:tcBorders>
-            <w:shd w:val="clear" w:color="auto" w:fill="auto"/>
             <w:noWrap/>
             <w:vAlign w:val="bottom"/>
             <w:hideMark/>
@@ -10431,7 +11149,6 @@
               <w:bottom w:val="single" w:sz="4" w:space="0" w:color="auto"/>
               <w:right w:val="single" w:sz="4" w:space="0" w:color="auto"/>
             </w:tcBorders>
-            <w:shd w:val="clear" w:color="auto" w:fill="auto"/>
             <w:noWrap/>
             <w:vAlign w:val="bottom"/>
             <w:hideMark/>
@@ -10469,7 +11186,6 @@
               <w:bottom w:val="single" w:sz="4" w:space="0" w:color="auto"/>
               <w:right w:val="single" w:sz="4" w:space="0" w:color="auto"/>
             </w:tcBorders>
-            <w:shd w:val="clear" w:color="auto" w:fill="auto"/>
             <w:noWrap/>
             <w:vAlign w:val="bottom"/>
             <w:hideMark/>
@@ -10507,7 +11223,6 @@
               <w:bottom w:val="single" w:sz="4" w:space="0" w:color="auto"/>
               <w:right w:val="single" w:sz="4" w:space="0" w:color="auto"/>
             </w:tcBorders>
-            <w:shd w:val="clear" w:color="auto" w:fill="auto"/>
             <w:noWrap/>
             <w:vAlign w:val="bottom"/>
             <w:hideMark/>
@@ -10545,7 +11260,6 @@
               <w:bottom w:val="single" w:sz="4" w:space="0" w:color="auto"/>
               <w:right w:val="single" w:sz="4" w:space="0" w:color="auto"/>
             </w:tcBorders>
-            <w:shd w:val="clear" w:color="auto" w:fill="auto"/>
             <w:noWrap/>
             <w:vAlign w:val="bottom"/>
             <w:hideMark/>
@@ -10583,7 +11297,6 @@
               <w:bottom w:val="single" w:sz="4" w:space="0" w:color="auto"/>
               <w:right w:val="single" w:sz="4" w:space="0" w:color="auto"/>
             </w:tcBorders>
-            <w:shd w:val="clear" w:color="auto" w:fill="auto"/>
             <w:noWrap/>
             <w:vAlign w:val="bottom"/>
             <w:hideMark/>
@@ -10621,7 +11334,6 @@
               <w:bottom w:val="single" w:sz="4" w:space="0" w:color="auto"/>
               <w:right w:val="single" w:sz="4" w:space="0" w:color="auto"/>
             </w:tcBorders>
-            <w:shd w:val="clear" w:color="auto" w:fill="auto"/>
             <w:noWrap/>
             <w:vAlign w:val="bottom"/>
             <w:hideMark/>
@@ -10659,7 +11371,6 @@
               <w:bottom w:val="single" w:sz="4" w:space="0" w:color="auto"/>
               <w:right w:val="single" w:sz="4" w:space="0" w:color="auto"/>
             </w:tcBorders>
-            <w:shd w:val="clear" w:color="auto" w:fill="auto"/>
             <w:noWrap/>
             <w:vAlign w:val="bottom"/>
             <w:hideMark/>
@@ -10697,7 +11408,6 @@
               <w:bottom w:val="single" w:sz="4" w:space="0" w:color="auto"/>
               <w:right w:val="single" w:sz="4" w:space="0" w:color="auto"/>
             </w:tcBorders>
-            <w:shd w:val="clear" w:color="auto" w:fill="auto"/>
             <w:noWrap/>
             <w:vAlign w:val="bottom"/>
             <w:hideMark/>
@@ -10735,7 +11445,6 @@
               <w:bottom w:val="single" w:sz="4" w:space="0" w:color="auto"/>
               <w:right w:val="single" w:sz="4" w:space="0" w:color="auto"/>
             </w:tcBorders>
-            <w:shd w:val="clear" w:color="auto" w:fill="auto"/>
             <w:noWrap/>
             <w:vAlign w:val="bottom"/>
             <w:hideMark/>
@@ -10778,7 +11487,6 @@
               <w:bottom w:val="single" w:sz="4" w:space="0" w:color="auto"/>
               <w:right w:val="single" w:sz="4" w:space="0" w:color="auto"/>
             </w:tcBorders>
-            <w:shd w:val="clear" w:color="auto" w:fill="auto"/>
             <w:noWrap/>
             <w:vAlign w:val="bottom"/>
             <w:hideMark/>
@@ -10815,7 +11523,6 @@
               <w:bottom w:val="single" w:sz="4" w:space="0" w:color="auto"/>
               <w:right w:val="single" w:sz="4" w:space="0" w:color="auto"/>
             </w:tcBorders>
-            <w:shd w:val="clear" w:color="auto" w:fill="auto"/>
             <w:noWrap/>
             <w:vAlign w:val="bottom"/>
             <w:hideMark/>
@@ -10853,7 +11560,6 @@
               <w:bottom w:val="single" w:sz="4" w:space="0" w:color="auto"/>
               <w:right w:val="single" w:sz="4" w:space="0" w:color="auto"/>
             </w:tcBorders>
-            <w:shd w:val="clear" w:color="auto" w:fill="auto"/>
             <w:noWrap/>
             <w:vAlign w:val="bottom"/>
             <w:hideMark/>
@@ -10891,7 +11597,6 @@
               <w:bottom w:val="single" w:sz="4" w:space="0" w:color="auto"/>
               <w:right w:val="single" w:sz="4" w:space="0" w:color="auto"/>
             </w:tcBorders>
-            <w:shd w:val="clear" w:color="auto" w:fill="auto"/>
             <w:noWrap/>
             <w:vAlign w:val="bottom"/>
             <w:hideMark/>
@@ -10929,7 +11634,6 @@
               <w:bottom w:val="single" w:sz="4" w:space="0" w:color="auto"/>
               <w:right w:val="single" w:sz="4" w:space="0" w:color="auto"/>
             </w:tcBorders>
-            <w:shd w:val="clear" w:color="auto" w:fill="auto"/>
             <w:noWrap/>
             <w:vAlign w:val="bottom"/>
             <w:hideMark/>
@@ -10967,7 +11671,6 @@
               <w:bottom w:val="single" w:sz="4" w:space="0" w:color="auto"/>
               <w:right w:val="single" w:sz="4" w:space="0" w:color="auto"/>
             </w:tcBorders>
-            <w:shd w:val="clear" w:color="auto" w:fill="auto"/>
             <w:noWrap/>
             <w:vAlign w:val="bottom"/>
             <w:hideMark/>
@@ -11005,7 +11708,6 @@
               <w:bottom w:val="single" w:sz="4" w:space="0" w:color="auto"/>
               <w:right w:val="single" w:sz="4" w:space="0" w:color="auto"/>
             </w:tcBorders>
-            <w:shd w:val="clear" w:color="auto" w:fill="auto"/>
             <w:noWrap/>
             <w:vAlign w:val="bottom"/>
             <w:hideMark/>
@@ -11043,7 +11745,6 @@
               <w:bottom w:val="single" w:sz="4" w:space="0" w:color="auto"/>
               <w:right w:val="single" w:sz="4" w:space="0" w:color="auto"/>
             </w:tcBorders>
-            <w:shd w:val="clear" w:color="auto" w:fill="auto"/>
             <w:noWrap/>
             <w:vAlign w:val="bottom"/>
             <w:hideMark/>
@@ -11081,7 +11782,6 @@
               <w:bottom w:val="single" w:sz="4" w:space="0" w:color="auto"/>
               <w:right w:val="single" w:sz="4" w:space="0" w:color="auto"/>
             </w:tcBorders>
-            <w:shd w:val="clear" w:color="auto" w:fill="auto"/>
             <w:noWrap/>
             <w:vAlign w:val="bottom"/>
             <w:hideMark/>
@@ -11119,7 +11819,6 @@
               <w:bottom w:val="single" w:sz="4" w:space="0" w:color="auto"/>
               <w:right w:val="single" w:sz="4" w:space="0" w:color="auto"/>
             </w:tcBorders>
-            <w:shd w:val="clear" w:color="auto" w:fill="auto"/>
             <w:noWrap/>
             <w:vAlign w:val="bottom"/>
             <w:hideMark/>
@@ -11157,7 +11856,6 @@
               <w:bottom w:val="single" w:sz="4" w:space="0" w:color="auto"/>
               <w:right w:val="single" w:sz="4" w:space="0" w:color="auto"/>
             </w:tcBorders>
-            <w:shd w:val="clear" w:color="auto" w:fill="auto"/>
             <w:noWrap/>
             <w:vAlign w:val="bottom"/>
             <w:hideMark/>
@@ -11195,7 +11893,6 @@
               <w:bottom w:val="single" w:sz="4" w:space="0" w:color="auto"/>
               <w:right w:val="single" w:sz="4" w:space="0" w:color="auto"/>
             </w:tcBorders>
-            <w:shd w:val="clear" w:color="auto" w:fill="auto"/>
             <w:noWrap/>
             <w:vAlign w:val="bottom"/>
             <w:hideMark/>
@@ -11238,7 +11935,6 @@
               <w:bottom w:val="single" w:sz="4" w:space="0" w:color="auto"/>
               <w:right w:val="single" w:sz="4" w:space="0" w:color="auto"/>
             </w:tcBorders>
-            <w:shd w:val="clear" w:color="auto" w:fill="auto"/>
             <w:noWrap/>
             <w:vAlign w:val="bottom"/>
             <w:hideMark/>
@@ -11275,7 +11971,6 @@
               <w:bottom w:val="single" w:sz="4" w:space="0" w:color="auto"/>
               <w:right w:val="single" w:sz="4" w:space="0" w:color="auto"/>
             </w:tcBorders>
-            <w:shd w:val="clear" w:color="auto" w:fill="auto"/>
             <w:noWrap/>
             <w:vAlign w:val="bottom"/>
             <w:hideMark/>
@@ -11313,7 +12008,6 @@
               <w:bottom w:val="single" w:sz="4" w:space="0" w:color="auto"/>
               <w:right w:val="single" w:sz="4" w:space="0" w:color="auto"/>
             </w:tcBorders>
-            <w:shd w:val="clear" w:color="auto" w:fill="auto"/>
             <w:noWrap/>
             <w:vAlign w:val="bottom"/>
             <w:hideMark/>
@@ -11351,7 +12045,6 @@
               <w:bottom w:val="single" w:sz="4" w:space="0" w:color="auto"/>
               <w:right w:val="single" w:sz="4" w:space="0" w:color="auto"/>
             </w:tcBorders>
-            <w:shd w:val="clear" w:color="auto" w:fill="auto"/>
             <w:noWrap/>
             <w:vAlign w:val="bottom"/>
             <w:hideMark/>
@@ -11389,7 +12082,6 @@
               <w:bottom w:val="single" w:sz="4" w:space="0" w:color="auto"/>
               <w:right w:val="single" w:sz="4" w:space="0" w:color="auto"/>
             </w:tcBorders>
-            <w:shd w:val="clear" w:color="auto" w:fill="auto"/>
             <w:noWrap/>
             <w:vAlign w:val="bottom"/>
             <w:hideMark/>
@@ -11427,7 +12119,6 @@
               <w:bottom w:val="single" w:sz="4" w:space="0" w:color="auto"/>
               <w:right w:val="single" w:sz="4" w:space="0" w:color="auto"/>
             </w:tcBorders>
-            <w:shd w:val="clear" w:color="auto" w:fill="auto"/>
             <w:noWrap/>
             <w:vAlign w:val="bottom"/>
             <w:hideMark/>
@@ -11465,7 +12156,6 @@
               <w:bottom w:val="single" w:sz="4" w:space="0" w:color="auto"/>
               <w:right w:val="single" w:sz="4" w:space="0" w:color="auto"/>
             </w:tcBorders>
-            <w:shd w:val="clear" w:color="auto" w:fill="auto"/>
             <w:noWrap/>
             <w:vAlign w:val="bottom"/>
             <w:hideMark/>
@@ -11503,7 +12193,6 @@
               <w:bottom w:val="single" w:sz="4" w:space="0" w:color="auto"/>
               <w:right w:val="single" w:sz="4" w:space="0" w:color="auto"/>
             </w:tcBorders>
-            <w:shd w:val="clear" w:color="auto" w:fill="auto"/>
             <w:noWrap/>
             <w:vAlign w:val="bottom"/>
             <w:hideMark/>
@@ -11541,7 +12230,6 @@
               <w:bottom w:val="single" w:sz="4" w:space="0" w:color="auto"/>
               <w:right w:val="single" w:sz="4" w:space="0" w:color="auto"/>
             </w:tcBorders>
-            <w:shd w:val="clear" w:color="auto" w:fill="auto"/>
             <w:noWrap/>
             <w:vAlign w:val="bottom"/>
             <w:hideMark/>
@@ -11579,7 +12267,6 @@
               <w:bottom w:val="single" w:sz="4" w:space="0" w:color="auto"/>
               <w:right w:val="single" w:sz="4" w:space="0" w:color="auto"/>
             </w:tcBorders>
-            <w:shd w:val="clear" w:color="auto" w:fill="auto"/>
             <w:noWrap/>
             <w:vAlign w:val="bottom"/>
             <w:hideMark/>
@@ -11617,7 +12304,6 @@
               <w:bottom w:val="single" w:sz="4" w:space="0" w:color="auto"/>
               <w:right w:val="single" w:sz="4" w:space="0" w:color="auto"/>
             </w:tcBorders>
-            <w:shd w:val="clear" w:color="auto" w:fill="auto"/>
             <w:noWrap/>
             <w:vAlign w:val="bottom"/>
             <w:hideMark/>
@@ -11655,7 +12341,6 @@
               <w:bottom w:val="single" w:sz="4" w:space="0" w:color="auto"/>
               <w:right w:val="single" w:sz="4" w:space="0" w:color="auto"/>
             </w:tcBorders>
-            <w:shd w:val="clear" w:color="auto" w:fill="auto"/>
             <w:noWrap/>
             <w:vAlign w:val="bottom"/>
             <w:hideMark/>
@@ -11698,7 +12383,6 @@
               <w:bottom w:val="single" w:sz="4" w:space="0" w:color="auto"/>
               <w:right w:val="single" w:sz="4" w:space="0" w:color="auto"/>
             </w:tcBorders>
-            <w:shd w:val="clear" w:color="auto" w:fill="auto"/>
             <w:noWrap/>
             <w:vAlign w:val="bottom"/>
             <w:hideMark/>
@@ -11735,7 +12419,6 @@
               <w:bottom w:val="single" w:sz="4" w:space="0" w:color="auto"/>
               <w:right w:val="single" w:sz="4" w:space="0" w:color="auto"/>
             </w:tcBorders>
-            <w:shd w:val="clear" w:color="auto" w:fill="auto"/>
             <w:noWrap/>
             <w:vAlign w:val="bottom"/>
             <w:hideMark/>
@@ -11773,7 +12456,6 @@
               <w:bottom w:val="single" w:sz="4" w:space="0" w:color="auto"/>
               <w:right w:val="single" w:sz="4" w:space="0" w:color="auto"/>
             </w:tcBorders>
-            <w:shd w:val="clear" w:color="auto" w:fill="auto"/>
             <w:noWrap/>
             <w:vAlign w:val="bottom"/>
             <w:hideMark/>
@@ -11811,7 +12493,6 @@
               <w:bottom w:val="single" w:sz="4" w:space="0" w:color="auto"/>
               <w:right w:val="single" w:sz="4" w:space="0" w:color="auto"/>
             </w:tcBorders>
-            <w:shd w:val="clear" w:color="auto" w:fill="auto"/>
             <w:noWrap/>
             <w:vAlign w:val="bottom"/>
             <w:hideMark/>
@@ -11849,7 +12530,6 @@
               <w:bottom w:val="single" w:sz="4" w:space="0" w:color="auto"/>
               <w:right w:val="single" w:sz="4" w:space="0" w:color="auto"/>
             </w:tcBorders>
-            <w:shd w:val="clear" w:color="auto" w:fill="auto"/>
             <w:noWrap/>
             <w:vAlign w:val="bottom"/>
             <w:hideMark/>
@@ -11887,7 +12567,6 @@
               <w:bottom w:val="single" w:sz="4" w:space="0" w:color="auto"/>
               <w:right w:val="single" w:sz="4" w:space="0" w:color="auto"/>
             </w:tcBorders>
-            <w:shd w:val="clear" w:color="auto" w:fill="auto"/>
             <w:noWrap/>
             <w:vAlign w:val="bottom"/>
             <w:hideMark/>
@@ -11925,7 +12604,6 @@
               <w:bottom w:val="single" w:sz="4" w:space="0" w:color="auto"/>
               <w:right w:val="single" w:sz="4" w:space="0" w:color="auto"/>
             </w:tcBorders>
-            <w:shd w:val="clear" w:color="auto" w:fill="auto"/>
             <w:noWrap/>
             <w:vAlign w:val="bottom"/>
             <w:hideMark/>
@@ -11963,7 +12641,6 @@
               <w:bottom w:val="single" w:sz="4" w:space="0" w:color="auto"/>
               <w:right w:val="single" w:sz="4" w:space="0" w:color="auto"/>
             </w:tcBorders>
-            <w:shd w:val="clear" w:color="auto" w:fill="auto"/>
             <w:noWrap/>
             <w:vAlign w:val="bottom"/>
             <w:hideMark/>
@@ -12001,7 +12678,6 @@
               <w:bottom w:val="single" w:sz="4" w:space="0" w:color="auto"/>
               <w:right w:val="single" w:sz="4" w:space="0" w:color="auto"/>
             </w:tcBorders>
-            <w:shd w:val="clear" w:color="auto" w:fill="auto"/>
             <w:noWrap/>
             <w:vAlign w:val="bottom"/>
             <w:hideMark/>
@@ -12039,7 +12715,6 @@
               <w:bottom w:val="single" w:sz="4" w:space="0" w:color="auto"/>
               <w:right w:val="single" w:sz="4" w:space="0" w:color="auto"/>
             </w:tcBorders>
-            <w:shd w:val="clear" w:color="auto" w:fill="auto"/>
             <w:noWrap/>
             <w:vAlign w:val="bottom"/>
             <w:hideMark/>
@@ -12077,7 +12752,6 @@
               <w:bottom w:val="single" w:sz="4" w:space="0" w:color="auto"/>
               <w:right w:val="single" w:sz="4" w:space="0" w:color="auto"/>
             </w:tcBorders>
-            <w:shd w:val="clear" w:color="auto" w:fill="auto"/>
             <w:noWrap/>
             <w:vAlign w:val="bottom"/>
             <w:hideMark/>
@@ -12115,7 +12789,6 @@
               <w:bottom w:val="single" w:sz="4" w:space="0" w:color="auto"/>
               <w:right w:val="single" w:sz="4" w:space="0" w:color="auto"/>
             </w:tcBorders>
-            <w:shd w:val="clear" w:color="auto" w:fill="auto"/>
             <w:noWrap/>
             <w:vAlign w:val="bottom"/>
             <w:hideMark/>
@@ -12158,7 +12831,6 @@
               <w:bottom w:val="single" w:sz="4" w:space="0" w:color="auto"/>
               <w:right w:val="single" w:sz="4" w:space="0" w:color="auto"/>
             </w:tcBorders>
-            <w:shd w:val="clear" w:color="auto" w:fill="auto"/>
             <w:noWrap/>
             <w:vAlign w:val="bottom"/>
             <w:hideMark/>
@@ -12195,7 +12867,6 @@
               <w:bottom w:val="single" w:sz="4" w:space="0" w:color="auto"/>
               <w:right w:val="single" w:sz="4" w:space="0" w:color="auto"/>
             </w:tcBorders>
-            <w:shd w:val="clear" w:color="auto" w:fill="auto"/>
             <w:noWrap/>
             <w:vAlign w:val="bottom"/>
             <w:hideMark/>
@@ -12233,7 +12904,6 @@
               <w:bottom w:val="single" w:sz="4" w:space="0" w:color="auto"/>
               <w:right w:val="single" w:sz="4" w:space="0" w:color="auto"/>
             </w:tcBorders>
-            <w:shd w:val="clear" w:color="auto" w:fill="auto"/>
             <w:noWrap/>
             <w:vAlign w:val="bottom"/>
             <w:hideMark/>
@@ -12271,7 +12941,6 @@
               <w:bottom w:val="single" w:sz="4" w:space="0" w:color="auto"/>
               <w:right w:val="single" w:sz="4" w:space="0" w:color="auto"/>
             </w:tcBorders>
-            <w:shd w:val="clear" w:color="auto" w:fill="auto"/>
             <w:noWrap/>
             <w:vAlign w:val="bottom"/>
             <w:hideMark/>
@@ -12309,7 +12978,6 @@
               <w:bottom w:val="single" w:sz="4" w:space="0" w:color="auto"/>
               <w:right w:val="single" w:sz="4" w:space="0" w:color="auto"/>
             </w:tcBorders>
-            <w:shd w:val="clear" w:color="auto" w:fill="auto"/>
             <w:noWrap/>
             <w:vAlign w:val="bottom"/>
             <w:hideMark/>
@@ -12347,7 +13015,6 @@
               <w:bottom w:val="single" w:sz="4" w:space="0" w:color="auto"/>
               <w:right w:val="single" w:sz="4" w:space="0" w:color="auto"/>
             </w:tcBorders>
-            <w:shd w:val="clear" w:color="auto" w:fill="auto"/>
             <w:noWrap/>
             <w:vAlign w:val="bottom"/>
             <w:hideMark/>
@@ -12385,7 +13052,6 @@
               <w:bottom w:val="single" w:sz="4" w:space="0" w:color="auto"/>
               <w:right w:val="single" w:sz="4" w:space="0" w:color="auto"/>
             </w:tcBorders>
-            <w:shd w:val="clear" w:color="auto" w:fill="auto"/>
             <w:noWrap/>
             <w:vAlign w:val="bottom"/>
             <w:hideMark/>
@@ -12423,7 +13089,6 @@
               <w:bottom w:val="single" w:sz="4" w:space="0" w:color="auto"/>
               <w:right w:val="single" w:sz="4" w:space="0" w:color="auto"/>
             </w:tcBorders>
-            <w:shd w:val="clear" w:color="auto" w:fill="auto"/>
             <w:noWrap/>
             <w:vAlign w:val="bottom"/>
             <w:hideMark/>
@@ -12461,7 +13126,6 @@
               <w:bottom w:val="single" w:sz="4" w:space="0" w:color="auto"/>
               <w:right w:val="single" w:sz="4" w:space="0" w:color="auto"/>
             </w:tcBorders>
-            <w:shd w:val="clear" w:color="auto" w:fill="auto"/>
             <w:noWrap/>
             <w:vAlign w:val="bottom"/>
             <w:hideMark/>
@@ -12499,7 +13163,6 @@
               <w:bottom w:val="single" w:sz="4" w:space="0" w:color="auto"/>
               <w:right w:val="single" w:sz="4" w:space="0" w:color="auto"/>
             </w:tcBorders>
-            <w:shd w:val="clear" w:color="auto" w:fill="auto"/>
             <w:noWrap/>
             <w:vAlign w:val="bottom"/>
             <w:hideMark/>
@@ -12537,7 +13200,6 @@
               <w:bottom w:val="single" w:sz="4" w:space="0" w:color="auto"/>
               <w:right w:val="single" w:sz="4" w:space="0" w:color="auto"/>
             </w:tcBorders>
-            <w:shd w:val="clear" w:color="auto" w:fill="auto"/>
             <w:noWrap/>
             <w:vAlign w:val="bottom"/>
             <w:hideMark/>
@@ -12575,7 +13237,6 @@
               <w:bottom w:val="single" w:sz="4" w:space="0" w:color="auto"/>
               <w:right w:val="single" w:sz="4" w:space="0" w:color="auto"/>
             </w:tcBorders>
-            <w:shd w:val="clear" w:color="auto" w:fill="auto"/>
             <w:noWrap/>
             <w:vAlign w:val="bottom"/>
             <w:hideMark/>
@@ -12618,7 +13279,6 @@
               <w:bottom w:val="single" w:sz="4" w:space="0" w:color="auto"/>
               <w:right w:val="single" w:sz="4" w:space="0" w:color="auto"/>
             </w:tcBorders>
-            <w:shd w:val="clear" w:color="auto" w:fill="auto"/>
             <w:noWrap/>
             <w:vAlign w:val="bottom"/>
             <w:hideMark/>
@@ -12655,7 +13315,6 @@
               <w:bottom w:val="single" w:sz="4" w:space="0" w:color="auto"/>
               <w:right w:val="single" w:sz="4" w:space="0" w:color="auto"/>
             </w:tcBorders>
-            <w:shd w:val="clear" w:color="auto" w:fill="auto"/>
             <w:noWrap/>
             <w:vAlign w:val="bottom"/>
             <w:hideMark/>
@@ -12693,7 +13352,6 @@
               <w:bottom w:val="single" w:sz="4" w:space="0" w:color="auto"/>
               <w:right w:val="single" w:sz="4" w:space="0" w:color="auto"/>
             </w:tcBorders>
-            <w:shd w:val="clear" w:color="auto" w:fill="auto"/>
             <w:noWrap/>
             <w:vAlign w:val="bottom"/>
             <w:hideMark/>
@@ -12731,7 +13389,6 @@
               <w:bottom w:val="single" w:sz="4" w:space="0" w:color="auto"/>
               <w:right w:val="single" w:sz="4" w:space="0" w:color="auto"/>
             </w:tcBorders>
-            <w:shd w:val="clear" w:color="auto" w:fill="auto"/>
             <w:noWrap/>
             <w:vAlign w:val="bottom"/>
             <w:hideMark/>
@@ -12769,7 +13426,6 @@
               <w:bottom w:val="single" w:sz="4" w:space="0" w:color="auto"/>
               <w:right w:val="single" w:sz="4" w:space="0" w:color="auto"/>
             </w:tcBorders>
-            <w:shd w:val="clear" w:color="auto" w:fill="auto"/>
             <w:noWrap/>
             <w:vAlign w:val="bottom"/>
             <w:hideMark/>
@@ -12807,7 +13463,6 @@
               <w:bottom w:val="single" w:sz="4" w:space="0" w:color="auto"/>
               <w:right w:val="single" w:sz="4" w:space="0" w:color="auto"/>
             </w:tcBorders>
-            <w:shd w:val="clear" w:color="auto" w:fill="auto"/>
             <w:noWrap/>
             <w:vAlign w:val="bottom"/>
             <w:hideMark/>
@@ -12845,7 +13500,6 @@
               <w:bottom w:val="single" w:sz="4" w:space="0" w:color="auto"/>
               <w:right w:val="single" w:sz="4" w:space="0" w:color="auto"/>
             </w:tcBorders>
-            <w:shd w:val="clear" w:color="auto" w:fill="auto"/>
             <w:noWrap/>
             <w:vAlign w:val="bottom"/>
             <w:hideMark/>
@@ -12883,7 +13537,6 @@
               <w:bottom w:val="single" w:sz="4" w:space="0" w:color="auto"/>
               <w:right w:val="single" w:sz="4" w:space="0" w:color="auto"/>
             </w:tcBorders>
-            <w:shd w:val="clear" w:color="auto" w:fill="auto"/>
             <w:noWrap/>
             <w:vAlign w:val="bottom"/>
             <w:hideMark/>
@@ -12921,7 +13574,6 @@
               <w:bottom w:val="single" w:sz="4" w:space="0" w:color="auto"/>
               <w:right w:val="single" w:sz="4" w:space="0" w:color="auto"/>
             </w:tcBorders>
-            <w:shd w:val="clear" w:color="auto" w:fill="auto"/>
             <w:noWrap/>
             <w:vAlign w:val="bottom"/>
             <w:hideMark/>
@@ -12959,7 +13611,6 @@
               <w:bottom w:val="single" w:sz="4" w:space="0" w:color="auto"/>
               <w:right w:val="single" w:sz="4" w:space="0" w:color="auto"/>
             </w:tcBorders>
-            <w:shd w:val="clear" w:color="auto" w:fill="auto"/>
             <w:noWrap/>
             <w:vAlign w:val="bottom"/>
             <w:hideMark/>
@@ -12997,7 +13648,6 @@
               <w:bottom w:val="single" w:sz="4" w:space="0" w:color="auto"/>
               <w:right w:val="single" w:sz="4" w:space="0" w:color="auto"/>
             </w:tcBorders>
-            <w:shd w:val="clear" w:color="auto" w:fill="auto"/>
             <w:noWrap/>
             <w:vAlign w:val="bottom"/>
             <w:hideMark/>
@@ -13035,7 +13685,6 @@
               <w:bottom w:val="single" w:sz="4" w:space="0" w:color="auto"/>
               <w:right w:val="single" w:sz="4" w:space="0" w:color="auto"/>
             </w:tcBorders>
-            <w:shd w:val="clear" w:color="auto" w:fill="auto"/>
             <w:noWrap/>
             <w:vAlign w:val="bottom"/>
             <w:hideMark/>
@@ -13078,7 +13727,6 @@
               <w:bottom w:val="single" w:sz="4" w:space="0" w:color="auto"/>
               <w:right w:val="single" w:sz="4" w:space="0" w:color="auto"/>
             </w:tcBorders>
-            <w:shd w:val="clear" w:color="auto" w:fill="auto"/>
             <w:noWrap/>
             <w:vAlign w:val="bottom"/>
             <w:hideMark/>
@@ -13115,7 +13763,6 @@
               <w:bottom w:val="single" w:sz="4" w:space="0" w:color="auto"/>
               <w:right w:val="single" w:sz="4" w:space="0" w:color="auto"/>
             </w:tcBorders>
-            <w:shd w:val="clear" w:color="auto" w:fill="auto"/>
             <w:noWrap/>
             <w:vAlign w:val="bottom"/>
             <w:hideMark/>
@@ -13153,7 +13800,6 @@
               <w:bottom w:val="single" w:sz="4" w:space="0" w:color="auto"/>
               <w:right w:val="single" w:sz="4" w:space="0" w:color="auto"/>
             </w:tcBorders>
-            <w:shd w:val="clear" w:color="auto" w:fill="auto"/>
             <w:noWrap/>
             <w:vAlign w:val="bottom"/>
             <w:hideMark/>
@@ -13191,7 +13837,6 @@
               <w:bottom w:val="single" w:sz="4" w:space="0" w:color="auto"/>
               <w:right w:val="single" w:sz="4" w:space="0" w:color="auto"/>
             </w:tcBorders>
-            <w:shd w:val="clear" w:color="auto" w:fill="auto"/>
             <w:noWrap/>
             <w:vAlign w:val="bottom"/>
             <w:hideMark/>
@@ -13229,7 +13874,6 @@
               <w:bottom w:val="single" w:sz="4" w:space="0" w:color="auto"/>
               <w:right w:val="single" w:sz="4" w:space="0" w:color="auto"/>
             </w:tcBorders>
-            <w:shd w:val="clear" w:color="auto" w:fill="auto"/>
             <w:noWrap/>
             <w:vAlign w:val="bottom"/>
             <w:hideMark/>
@@ -13267,7 +13911,6 @@
               <w:bottom w:val="single" w:sz="4" w:space="0" w:color="auto"/>
               <w:right w:val="single" w:sz="4" w:space="0" w:color="auto"/>
             </w:tcBorders>
-            <w:shd w:val="clear" w:color="auto" w:fill="auto"/>
             <w:noWrap/>
             <w:vAlign w:val="bottom"/>
             <w:hideMark/>
@@ -13305,7 +13948,6 @@
               <w:bottom w:val="single" w:sz="4" w:space="0" w:color="auto"/>
               <w:right w:val="single" w:sz="4" w:space="0" w:color="auto"/>
             </w:tcBorders>
-            <w:shd w:val="clear" w:color="auto" w:fill="auto"/>
             <w:noWrap/>
             <w:vAlign w:val="bottom"/>
             <w:hideMark/>
@@ -13343,7 +13985,6 @@
               <w:bottom w:val="single" w:sz="4" w:space="0" w:color="auto"/>
               <w:right w:val="single" w:sz="4" w:space="0" w:color="auto"/>
             </w:tcBorders>
-            <w:shd w:val="clear" w:color="auto" w:fill="auto"/>
             <w:noWrap/>
             <w:vAlign w:val="bottom"/>
             <w:hideMark/>
@@ -13381,7 +14022,6 @@
               <w:bottom w:val="single" w:sz="4" w:space="0" w:color="auto"/>
               <w:right w:val="single" w:sz="4" w:space="0" w:color="auto"/>
             </w:tcBorders>
-            <w:shd w:val="clear" w:color="auto" w:fill="auto"/>
             <w:noWrap/>
             <w:vAlign w:val="bottom"/>
             <w:hideMark/>
@@ -13419,7 +14059,6 @@
               <w:bottom w:val="single" w:sz="4" w:space="0" w:color="auto"/>
               <w:right w:val="single" w:sz="4" w:space="0" w:color="auto"/>
             </w:tcBorders>
-            <w:shd w:val="clear" w:color="auto" w:fill="auto"/>
             <w:noWrap/>
             <w:vAlign w:val="bottom"/>
             <w:hideMark/>
@@ -13457,7 +14096,6 @@
               <w:bottom w:val="single" w:sz="4" w:space="0" w:color="auto"/>
               <w:right w:val="single" w:sz="4" w:space="0" w:color="auto"/>
             </w:tcBorders>
-            <w:shd w:val="clear" w:color="auto" w:fill="auto"/>
             <w:noWrap/>
             <w:vAlign w:val="bottom"/>
             <w:hideMark/>
@@ -13495,7 +14133,6 @@
               <w:bottom w:val="single" w:sz="4" w:space="0" w:color="auto"/>
               <w:right w:val="single" w:sz="4" w:space="0" w:color="auto"/>
             </w:tcBorders>
-            <w:shd w:val="clear" w:color="auto" w:fill="auto"/>
             <w:noWrap/>
             <w:vAlign w:val="bottom"/>
             <w:hideMark/>
@@ -13538,7 +14175,6 @@
               <w:bottom w:val="single" w:sz="4" w:space="0" w:color="auto"/>
               <w:right w:val="single" w:sz="4" w:space="0" w:color="auto"/>
             </w:tcBorders>
-            <w:shd w:val="clear" w:color="auto" w:fill="auto"/>
             <w:noWrap/>
             <w:vAlign w:val="bottom"/>
             <w:hideMark/>
@@ -13575,7 +14211,6 @@
               <w:bottom w:val="single" w:sz="4" w:space="0" w:color="auto"/>
               <w:right w:val="single" w:sz="4" w:space="0" w:color="auto"/>
             </w:tcBorders>
-            <w:shd w:val="clear" w:color="auto" w:fill="auto"/>
             <w:noWrap/>
             <w:vAlign w:val="bottom"/>
             <w:hideMark/>
@@ -13613,7 +14248,6 @@
               <w:bottom w:val="single" w:sz="4" w:space="0" w:color="auto"/>
               <w:right w:val="single" w:sz="4" w:space="0" w:color="auto"/>
             </w:tcBorders>
-            <w:shd w:val="clear" w:color="auto" w:fill="auto"/>
             <w:noWrap/>
             <w:vAlign w:val="bottom"/>
             <w:hideMark/>
@@ -13651,7 +14285,6 @@
               <w:bottom w:val="single" w:sz="4" w:space="0" w:color="auto"/>
               <w:right w:val="single" w:sz="4" w:space="0" w:color="auto"/>
             </w:tcBorders>
-            <w:shd w:val="clear" w:color="auto" w:fill="auto"/>
             <w:noWrap/>
             <w:vAlign w:val="bottom"/>
             <w:hideMark/>
@@ -13689,7 +14322,6 @@
               <w:bottom w:val="single" w:sz="4" w:space="0" w:color="auto"/>
               <w:right w:val="single" w:sz="4" w:space="0" w:color="auto"/>
             </w:tcBorders>
-            <w:shd w:val="clear" w:color="auto" w:fill="auto"/>
             <w:noWrap/>
             <w:vAlign w:val="bottom"/>
             <w:hideMark/>
@@ -13727,7 +14359,6 @@
               <w:bottom w:val="single" w:sz="4" w:space="0" w:color="auto"/>
               <w:right w:val="single" w:sz="4" w:space="0" w:color="auto"/>
             </w:tcBorders>
-            <w:shd w:val="clear" w:color="auto" w:fill="auto"/>
             <w:noWrap/>
             <w:vAlign w:val="bottom"/>
             <w:hideMark/>
@@ -13765,7 +14396,6 @@
               <w:bottom w:val="single" w:sz="4" w:space="0" w:color="auto"/>
               <w:right w:val="single" w:sz="4" w:space="0" w:color="auto"/>
             </w:tcBorders>
-            <w:shd w:val="clear" w:color="auto" w:fill="auto"/>
             <w:noWrap/>
             <w:vAlign w:val="bottom"/>
             <w:hideMark/>
@@ -13803,7 +14433,6 @@
               <w:bottom w:val="single" w:sz="4" w:space="0" w:color="auto"/>
               <w:right w:val="single" w:sz="4" w:space="0" w:color="auto"/>
             </w:tcBorders>
-            <w:shd w:val="clear" w:color="auto" w:fill="auto"/>
             <w:noWrap/>
             <w:vAlign w:val="bottom"/>
             <w:hideMark/>
@@ -13841,7 +14470,6 @@
               <w:bottom w:val="single" w:sz="4" w:space="0" w:color="auto"/>
               <w:right w:val="single" w:sz="4" w:space="0" w:color="auto"/>
             </w:tcBorders>
-            <w:shd w:val="clear" w:color="auto" w:fill="auto"/>
             <w:noWrap/>
             <w:vAlign w:val="bottom"/>
             <w:hideMark/>
@@ -13879,7 +14507,6 @@
               <w:bottom w:val="single" w:sz="4" w:space="0" w:color="auto"/>
               <w:right w:val="single" w:sz="4" w:space="0" w:color="auto"/>
             </w:tcBorders>
-            <w:shd w:val="clear" w:color="auto" w:fill="auto"/>
             <w:noWrap/>
             <w:vAlign w:val="bottom"/>
             <w:hideMark/>
@@ -13917,7 +14544,6 @@
               <w:bottom w:val="single" w:sz="4" w:space="0" w:color="auto"/>
               <w:right w:val="single" w:sz="4" w:space="0" w:color="auto"/>
             </w:tcBorders>
-            <w:shd w:val="clear" w:color="auto" w:fill="auto"/>
             <w:noWrap/>
             <w:vAlign w:val="bottom"/>
             <w:hideMark/>
@@ -13955,7 +14581,6 @@
               <w:bottom w:val="single" w:sz="4" w:space="0" w:color="auto"/>
               <w:right w:val="single" w:sz="4" w:space="0" w:color="auto"/>
             </w:tcBorders>
-            <w:shd w:val="clear" w:color="auto" w:fill="auto"/>
             <w:noWrap/>
             <w:vAlign w:val="bottom"/>
             <w:hideMark/>
@@ -13998,7 +14623,6 @@
               <w:bottom w:val="single" w:sz="4" w:space="0" w:color="auto"/>
               <w:right w:val="single" w:sz="4" w:space="0" w:color="auto"/>
             </w:tcBorders>
-            <w:shd w:val="clear" w:color="auto" w:fill="auto"/>
             <w:noWrap/>
             <w:vAlign w:val="bottom"/>
             <w:hideMark/>
@@ -14035,7 +14659,6 @@
               <w:bottom w:val="single" w:sz="4" w:space="0" w:color="auto"/>
               <w:right w:val="single" w:sz="4" w:space="0" w:color="auto"/>
             </w:tcBorders>
-            <w:shd w:val="clear" w:color="auto" w:fill="auto"/>
             <w:noWrap/>
             <w:vAlign w:val="bottom"/>
             <w:hideMark/>
@@ -14073,7 +14696,6 @@
               <w:bottom w:val="single" w:sz="4" w:space="0" w:color="auto"/>
               <w:right w:val="single" w:sz="4" w:space="0" w:color="auto"/>
             </w:tcBorders>
-            <w:shd w:val="clear" w:color="auto" w:fill="auto"/>
             <w:noWrap/>
             <w:vAlign w:val="bottom"/>
             <w:hideMark/>
@@ -14111,7 +14733,6 @@
               <w:bottom w:val="single" w:sz="4" w:space="0" w:color="auto"/>
               <w:right w:val="single" w:sz="4" w:space="0" w:color="auto"/>
             </w:tcBorders>
-            <w:shd w:val="clear" w:color="auto" w:fill="auto"/>
             <w:noWrap/>
             <w:vAlign w:val="bottom"/>
             <w:hideMark/>
@@ -14149,7 +14770,6 @@
               <w:bottom w:val="single" w:sz="4" w:space="0" w:color="auto"/>
               <w:right w:val="single" w:sz="4" w:space="0" w:color="auto"/>
             </w:tcBorders>
-            <w:shd w:val="clear" w:color="auto" w:fill="auto"/>
             <w:noWrap/>
             <w:vAlign w:val="bottom"/>
             <w:hideMark/>
@@ -14187,7 +14807,6 @@
               <w:bottom w:val="single" w:sz="4" w:space="0" w:color="auto"/>
               <w:right w:val="single" w:sz="4" w:space="0" w:color="auto"/>
             </w:tcBorders>
-            <w:shd w:val="clear" w:color="auto" w:fill="auto"/>
             <w:noWrap/>
             <w:vAlign w:val="bottom"/>
             <w:hideMark/>
@@ -14225,7 +14844,6 @@
               <w:bottom w:val="single" w:sz="4" w:space="0" w:color="auto"/>
               <w:right w:val="single" w:sz="4" w:space="0" w:color="auto"/>
             </w:tcBorders>
-            <w:shd w:val="clear" w:color="auto" w:fill="auto"/>
             <w:noWrap/>
             <w:vAlign w:val="bottom"/>
             <w:hideMark/>
@@ -14263,7 +14881,6 @@
               <w:bottom w:val="single" w:sz="4" w:space="0" w:color="auto"/>
               <w:right w:val="single" w:sz="4" w:space="0" w:color="auto"/>
             </w:tcBorders>
-            <w:shd w:val="clear" w:color="auto" w:fill="auto"/>
             <w:noWrap/>
             <w:vAlign w:val="bottom"/>
             <w:hideMark/>
@@ -14301,7 +14918,6 @@
               <w:bottom w:val="single" w:sz="4" w:space="0" w:color="auto"/>
               <w:right w:val="single" w:sz="4" w:space="0" w:color="auto"/>
             </w:tcBorders>
-            <w:shd w:val="clear" w:color="auto" w:fill="auto"/>
             <w:noWrap/>
             <w:vAlign w:val="bottom"/>
             <w:hideMark/>
@@ -14339,7 +14955,6 @@
               <w:bottom w:val="single" w:sz="4" w:space="0" w:color="auto"/>
               <w:right w:val="single" w:sz="4" w:space="0" w:color="auto"/>
             </w:tcBorders>
-            <w:shd w:val="clear" w:color="auto" w:fill="auto"/>
             <w:noWrap/>
             <w:vAlign w:val="bottom"/>
             <w:hideMark/>
@@ -14377,7 +14992,6 @@
               <w:bottom w:val="single" w:sz="4" w:space="0" w:color="auto"/>
               <w:right w:val="single" w:sz="4" w:space="0" w:color="auto"/>
             </w:tcBorders>
-            <w:shd w:val="clear" w:color="auto" w:fill="auto"/>
             <w:noWrap/>
             <w:vAlign w:val="bottom"/>
             <w:hideMark/>
@@ -14415,7 +15029,6 @@
               <w:bottom w:val="single" w:sz="4" w:space="0" w:color="auto"/>
               <w:right w:val="single" w:sz="4" w:space="0" w:color="auto"/>
             </w:tcBorders>
-            <w:shd w:val="clear" w:color="auto" w:fill="auto"/>
             <w:noWrap/>
             <w:vAlign w:val="bottom"/>
             <w:hideMark/>
@@ -14458,7 +15071,6 @@
               <w:bottom w:val="single" w:sz="4" w:space="0" w:color="auto"/>
               <w:right w:val="single" w:sz="4" w:space="0" w:color="auto"/>
             </w:tcBorders>
-            <w:shd w:val="clear" w:color="auto" w:fill="auto"/>
             <w:noWrap/>
             <w:vAlign w:val="bottom"/>
             <w:hideMark/>
@@ -14495,7 +15107,6 @@
               <w:bottom w:val="single" w:sz="4" w:space="0" w:color="auto"/>
               <w:right w:val="single" w:sz="4" w:space="0" w:color="auto"/>
             </w:tcBorders>
-            <w:shd w:val="clear" w:color="auto" w:fill="auto"/>
             <w:noWrap/>
             <w:vAlign w:val="bottom"/>
             <w:hideMark/>
@@ -14533,7 +15144,6 @@
               <w:bottom w:val="single" w:sz="4" w:space="0" w:color="auto"/>
               <w:right w:val="single" w:sz="4" w:space="0" w:color="auto"/>
             </w:tcBorders>
-            <w:shd w:val="clear" w:color="auto" w:fill="auto"/>
             <w:noWrap/>
             <w:vAlign w:val="bottom"/>
             <w:hideMark/>
@@ -14571,7 +15181,6 @@
               <w:bottom w:val="single" w:sz="4" w:space="0" w:color="auto"/>
               <w:right w:val="single" w:sz="4" w:space="0" w:color="auto"/>
             </w:tcBorders>
-            <w:shd w:val="clear" w:color="auto" w:fill="auto"/>
             <w:noWrap/>
             <w:vAlign w:val="bottom"/>
             <w:hideMark/>
@@ -14609,7 +15218,6 @@
               <w:bottom w:val="single" w:sz="4" w:space="0" w:color="auto"/>
               <w:right w:val="single" w:sz="4" w:space="0" w:color="auto"/>
             </w:tcBorders>
-            <w:shd w:val="clear" w:color="auto" w:fill="auto"/>
             <w:noWrap/>
             <w:vAlign w:val="bottom"/>
             <w:hideMark/>
@@ -14647,7 +15255,6 @@
               <w:bottom w:val="single" w:sz="4" w:space="0" w:color="auto"/>
               <w:right w:val="single" w:sz="4" w:space="0" w:color="auto"/>
             </w:tcBorders>
-            <w:shd w:val="clear" w:color="auto" w:fill="auto"/>
             <w:noWrap/>
             <w:vAlign w:val="bottom"/>
             <w:hideMark/>
@@ -14685,7 +15292,6 @@
               <w:bottom w:val="single" w:sz="4" w:space="0" w:color="auto"/>
               <w:right w:val="single" w:sz="4" w:space="0" w:color="auto"/>
             </w:tcBorders>
-            <w:shd w:val="clear" w:color="auto" w:fill="auto"/>
             <w:noWrap/>
             <w:vAlign w:val="bottom"/>
             <w:hideMark/>
@@ -14723,7 +15329,6 @@
               <w:bottom w:val="single" w:sz="4" w:space="0" w:color="auto"/>
               <w:right w:val="single" w:sz="4" w:space="0" w:color="auto"/>
             </w:tcBorders>
-            <w:shd w:val="clear" w:color="auto" w:fill="auto"/>
             <w:noWrap/>
             <w:vAlign w:val="bottom"/>
             <w:hideMark/>
@@ -14761,7 +15366,6 @@
               <w:bottom w:val="single" w:sz="4" w:space="0" w:color="auto"/>
               <w:right w:val="single" w:sz="4" w:space="0" w:color="auto"/>
             </w:tcBorders>
-            <w:shd w:val="clear" w:color="auto" w:fill="auto"/>
             <w:noWrap/>
             <w:vAlign w:val="bottom"/>
             <w:hideMark/>
@@ -14799,7 +15403,6 @@
               <w:bottom w:val="single" w:sz="4" w:space="0" w:color="auto"/>
               <w:right w:val="single" w:sz="4" w:space="0" w:color="auto"/>
             </w:tcBorders>
-            <w:shd w:val="clear" w:color="auto" w:fill="auto"/>
             <w:noWrap/>
             <w:vAlign w:val="bottom"/>
             <w:hideMark/>
@@ -14837,7 +15440,6 @@
               <w:bottom w:val="single" w:sz="4" w:space="0" w:color="auto"/>
               <w:right w:val="single" w:sz="4" w:space="0" w:color="auto"/>
             </w:tcBorders>
-            <w:shd w:val="clear" w:color="auto" w:fill="auto"/>
             <w:noWrap/>
             <w:vAlign w:val="bottom"/>
             <w:hideMark/>
@@ -14875,7 +15477,6 @@
               <w:bottom w:val="single" w:sz="4" w:space="0" w:color="auto"/>
               <w:right w:val="single" w:sz="4" w:space="0" w:color="auto"/>
             </w:tcBorders>
-            <w:shd w:val="clear" w:color="auto" w:fill="auto"/>
             <w:noWrap/>
             <w:vAlign w:val="bottom"/>
             <w:hideMark/>
@@ -14918,7 +15519,6 @@
               <w:bottom w:val="single" w:sz="4" w:space="0" w:color="auto"/>
               <w:right w:val="single" w:sz="4" w:space="0" w:color="auto"/>
             </w:tcBorders>
-            <w:shd w:val="clear" w:color="auto" w:fill="auto"/>
             <w:noWrap/>
             <w:vAlign w:val="bottom"/>
             <w:hideMark/>
@@ -14955,7 +15555,6 @@
               <w:bottom w:val="single" w:sz="4" w:space="0" w:color="auto"/>
               <w:right w:val="single" w:sz="4" w:space="0" w:color="auto"/>
             </w:tcBorders>
-            <w:shd w:val="clear" w:color="auto" w:fill="auto"/>
             <w:noWrap/>
             <w:vAlign w:val="bottom"/>
             <w:hideMark/>
@@ -14993,7 +15592,6 @@
               <w:bottom w:val="single" w:sz="4" w:space="0" w:color="auto"/>
               <w:right w:val="single" w:sz="4" w:space="0" w:color="auto"/>
             </w:tcBorders>
-            <w:shd w:val="clear" w:color="auto" w:fill="auto"/>
             <w:noWrap/>
             <w:vAlign w:val="bottom"/>
             <w:hideMark/>
@@ -15031,7 +15629,6 @@
               <w:bottom w:val="single" w:sz="4" w:space="0" w:color="auto"/>
               <w:right w:val="single" w:sz="4" w:space="0" w:color="auto"/>
             </w:tcBorders>
-            <w:shd w:val="clear" w:color="auto" w:fill="auto"/>
             <w:noWrap/>
             <w:vAlign w:val="bottom"/>
             <w:hideMark/>
@@ -15069,7 +15666,6 @@
               <w:bottom w:val="single" w:sz="4" w:space="0" w:color="auto"/>
               <w:right w:val="single" w:sz="4" w:space="0" w:color="auto"/>
             </w:tcBorders>
-            <w:shd w:val="clear" w:color="auto" w:fill="auto"/>
             <w:noWrap/>
             <w:vAlign w:val="bottom"/>
             <w:hideMark/>
@@ -15107,7 +15703,6 @@
               <w:bottom w:val="single" w:sz="4" w:space="0" w:color="auto"/>
               <w:right w:val="single" w:sz="4" w:space="0" w:color="auto"/>
             </w:tcBorders>
-            <w:shd w:val="clear" w:color="auto" w:fill="auto"/>
             <w:noWrap/>
             <w:vAlign w:val="bottom"/>
             <w:hideMark/>
@@ -15145,7 +15740,6 @@
               <w:bottom w:val="single" w:sz="4" w:space="0" w:color="auto"/>
               <w:right w:val="single" w:sz="4" w:space="0" w:color="auto"/>
             </w:tcBorders>
-            <w:shd w:val="clear" w:color="auto" w:fill="auto"/>
             <w:noWrap/>
             <w:vAlign w:val="bottom"/>
             <w:hideMark/>
@@ -15183,7 +15777,6 @@
               <w:bottom w:val="single" w:sz="4" w:space="0" w:color="auto"/>
               <w:right w:val="single" w:sz="4" w:space="0" w:color="auto"/>
             </w:tcBorders>
-            <w:shd w:val="clear" w:color="auto" w:fill="auto"/>
             <w:noWrap/>
             <w:vAlign w:val="bottom"/>
             <w:hideMark/>
@@ -15221,7 +15814,6 @@
               <w:bottom w:val="single" w:sz="4" w:space="0" w:color="auto"/>
               <w:right w:val="single" w:sz="4" w:space="0" w:color="auto"/>
             </w:tcBorders>
-            <w:shd w:val="clear" w:color="auto" w:fill="auto"/>
             <w:noWrap/>
             <w:vAlign w:val="bottom"/>
             <w:hideMark/>
@@ -15259,7 +15851,6 @@
               <w:bottom w:val="single" w:sz="4" w:space="0" w:color="auto"/>
               <w:right w:val="single" w:sz="4" w:space="0" w:color="auto"/>
             </w:tcBorders>
-            <w:shd w:val="clear" w:color="auto" w:fill="auto"/>
             <w:noWrap/>
             <w:vAlign w:val="bottom"/>
             <w:hideMark/>
@@ -15297,7 +15888,6 @@
               <w:bottom w:val="single" w:sz="4" w:space="0" w:color="auto"/>
               <w:right w:val="single" w:sz="4" w:space="0" w:color="auto"/>
             </w:tcBorders>
-            <w:shd w:val="clear" w:color="auto" w:fill="auto"/>
             <w:noWrap/>
             <w:vAlign w:val="bottom"/>
             <w:hideMark/>
@@ -15335,7 +15925,6 @@
               <w:bottom w:val="single" w:sz="4" w:space="0" w:color="auto"/>
               <w:right w:val="single" w:sz="4" w:space="0" w:color="auto"/>
             </w:tcBorders>
-            <w:shd w:val="clear" w:color="auto" w:fill="auto"/>
             <w:noWrap/>
             <w:vAlign w:val="bottom"/>
             <w:hideMark/>
@@ -15378,7 +15967,6 @@
               <w:bottom w:val="single" w:sz="4" w:space="0" w:color="auto"/>
               <w:right w:val="single" w:sz="4" w:space="0" w:color="auto"/>
             </w:tcBorders>
-            <w:shd w:val="clear" w:color="auto" w:fill="auto"/>
             <w:noWrap/>
             <w:vAlign w:val="bottom"/>
             <w:hideMark/>
@@ -15415,7 +16003,6 @@
               <w:bottom w:val="single" w:sz="4" w:space="0" w:color="auto"/>
               <w:right w:val="single" w:sz="4" w:space="0" w:color="auto"/>
             </w:tcBorders>
-            <w:shd w:val="clear" w:color="auto" w:fill="auto"/>
             <w:noWrap/>
             <w:vAlign w:val="bottom"/>
             <w:hideMark/>
@@ -15453,7 +16040,6 @@
               <w:bottom w:val="single" w:sz="4" w:space="0" w:color="auto"/>
               <w:right w:val="single" w:sz="4" w:space="0" w:color="auto"/>
             </w:tcBorders>
-            <w:shd w:val="clear" w:color="auto" w:fill="auto"/>
             <w:noWrap/>
             <w:vAlign w:val="bottom"/>
             <w:hideMark/>
@@ -15491,7 +16077,6 @@
               <w:bottom w:val="single" w:sz="4" w:space="0" w:color="auto"/>
               <w:right w:val="single" w:sz="4" w:space="0" w:color="auto"/>
             </w:tcBorders>
-            <w:shd w:val="clear" w:color="auto" w:fill="auto"/>
             <w:noWrap/>
             <w:vAlign w:val="bottom"/>
             <w:hideMark/>
@@ -15529,7 +16114,6 @@
               <w:bottom w:val="single" w:sz="4" w:space="0" w:color="auto"/>
               <w:right w:val="single" w:sz="4" w:space="0" w:color="auto"/>
             </w:tcBorders>
-            <w:shd w:val="clear" w:color="auto" w:fill="auto"/>
             <w:noWrap/>
             <w:vAlign w:val="bottom"/>
             <w:hideMark/>
@@ -15567,7 +16151,6 @@
               <w:bottom w:val="single" w:sz="4" w:space="0" w:color="auto"/>
               <w:right w:val="single" w:sz="4" w:space="0" w:color="auto"/>
             </w:tcBorders>
-            <w:shd w:val="clear" w:color="auto" w:fill="auto"/>
             <w:noWrap/>
             <w:vAlign w:val="bottom"/>
             <w:hideMark/>
@@ -15605,7 +16188,6 @@
               <w:bottom w:val="single" w:sz="4" w:space="0" w:color="auto"/>
               <w:right w:val="single" w:sz="4" w:space="0" w:color="auto"/>
             </w:tcBorders>
-            <w:shd w:val="clear" w:color="auto" w:fill="auto"/>
             <w:noWrap/>
             <w:vAlign w:val="bottom"/>
             <w:hideMark/>
@@ -15643,7 +16225,6 @@
               <w:bottom w:val="single" w:sz="4" w:space="0" w:color="auto"/>
               <w:right w:val="single" w:sz="4" w:space="0" w:color="auto"/>
             </w:tcBorders>
-            <w:shd w:val="clear" w:color="auto" w:fill="auto"/>
             <w:noWrap/>
             <w:vAlign w:val="bottom"/>
             <w:hideMark/>
@@ -15681,7 +16262,6 @@
               <w:bottom w:val="single" w:sz="4" w:space="0" w:color="auto"/>
               <w:right w:val="single" w:sz="4" w:space="0" w:color="auto"/>
             </w:tcBorders>
-            <w:shd w:val="clear" w:color="auto" w:fill="auto"/>
             <w:noWrap/>
             <w:vAlign w:val="bottom"/>
             <w:hideMark/>
@@ -15719,7 +16299,6 @@
               <w:bottom w:val="single" w:sz="4" w:space="0" w:color="auto"/>
               <w:right w:val="single" w:sz="4" w:space="0" w:color="auto"/>
             </w:tcBorders>
-            <w:shd w:val="clear" w:color="auto" w:fill="auto"/>
             <w:noWrap/>
             <w:vAlign w:val="bottom"/>
             <w:hideMark/>
@@ -15757,7 +16336,6 @@
               <w:bottom w:val="single" w:sz="4" w:space="0" w:color="auto"/>
               <w:right w:val="single" w:sz="4" w:space="0" w:color="auto"/>
             </w:tcBorders>
-            <w:shd w:val="clear" w:color="auto" w:fill="auto"/>
             <w:noWrap/>
             <w:vAlign w:val="bottom"/>
             <w:hideMark/>
@@ -15795,7 +16373,6 @@
               <w:bottom w:val="single" w:sz="4" w:space="0" w:color="auto"/>
               <w:right w:val="single" w:sz="4" w:space="0" w:color="auto"/>
             </w:tcBorders>
-            <w:shd w:val="clear" w:color="auto" w:fill="auto"/>
             <w:noWrap/>
             <w:vAlign w:val="bottom"/>
             <w:hideMark/>
@@ -15838,7 +16415,6 @@
               <w:bottom w:val="single" w:sz="4" w:space="0" w:color="auto"/>
               <w:right w:val="single" w:sz="4" w:space="0" w:color="auto"/>
             </w:tcBorders>
-            <w:shd w:val="clear" w:color="auto" w:fill="auto"/>
             <w:noWrap/>
             <w:vAlign w:val="bottom"/>
             <w:hideMark/>
@@ -15875,7 +16451,6 @@
               <w:bottom w:val="single" w:sz="4" w:space="0" w:color="auto"/>
               <w:right w:val="single" w:sz="4" w:space="0" w:color="auto"/>
             </w:tcBorders>
-            <w:shd w:val="clear" w:color="auto" w:fill="auto"/>
             <w:noWrap/>
             <w:vAlign w:val="bottom"/>
             <w:hideMark/>
@@ -15913,7 +16488,6 @@
               <w:bottom w:val="single" w:sz="4" w:space="0" w:color="auto"/>
               <w:right w:val="single" w:sz="4" w:space="0" w:color="auto"/>
             </w:tcBorders>
-            <w:shd w:val="clear" w:color="auto" w:fill="auto"/>
             <w:noWrap/>
             <w:vAlign w:val="bottom"/>
             <w:hideMark/>
@@ -15951,7 +16525,6 @@
               <w:bottom w:val="single" w:sz="4" w:space="0" w:color="auto"/>
               <w:right w:val="single" w:sz="4" w:space="0" w:color="auto"/>
             </w:tcBorders>
-            <w:shd w:val="clear" w:color="auto" w:fill="auto"/>
             <w:noWrap/>
             <w:vAlign w:val="bottom"/>
             <w:hideMark/>
@@ -15989,7 +16562,6 @@
               <w:bottom w:val="single" w:sz="4" w:space="0" w:color="auto"/>
               <w:right w:val="single" w:sz="4" w:space="0" w:color="auto"/>
             </w:tcBorders>
-            <w:shd w:val="clear" w:color="auto" w:fill="auto"/>
             <w:noWrap/>
             <w:vAlign w:val="bottom"/>
             <w:hideMark/>
@@ -16027,7 +16599,6 @@
               <w:bottom w:val="single" w:sz="4" w:space="0" w:color="auto"/>
               <w:right w:val="single" w:sz="4" w:space="0" w:color="auto"/>
             </w:tcBorders>
-            <w:shd w:val="clear" w:color="auto" w:fill="auto"/>
             <w:noWrap/>
             <w:vAlign w:val="bottom"/>
             <w:hideMark/>
@@ -16065,7 +16636,6 @@
               <w:bottom w:val="single" w:sz="4" w:space="0" w:color="auto"/>
               <w:right w:val="single" w:sz="4" w:space="0" w:color="auto"/>
             </w:tcBorders>
-            <w:shd w:val="clear" w:color="auto" w:fill="auto"/>
             <w:noWrap/>
             <w:vAlign w:val="bottom"/>
             <w:hideMark/>
@@ -16103,7 +16673,6 @@
               <w:bottom w:val="single" w:sz="4" w:space="0" w:color="auto"/>
               <w:right w:val="single" w:sz="4" w:space="0" w:color="auto"/>
             </w:tcBorders>
-            <w:shd w:val="clear" w:color="auto" w:fill="auto"/>
             <w:noWrap/>
             <w:vAlign w:val="bottom"/>
             <w:hideMark/>
@@ -16141,7 +16710,6 @@
               <w:bottom w:val="single" w:sz="4" w:space="0" w:color="auto"/>
               <w:right w:val="single" w:sz="4" w:space="0" w:color="auto"/>
             </w:tcBorders>
-            <w:shd w:val="clear" w:color="auto" w:fill="auto"/>
             <w:noWrap/>
             <w:vAlign w:val="bottom"/>
             <w:hideMark/>
@@ -16179,7 +16747,6 @@
               <w:bottom w:val="single" w:sz="4" w:space="0" w:color="auto"/>
               <w:right w:val="single" w:sz="4" w:space="0" w:color="auto"/>
             </w:tcBorders>
-            <w:shd w:val="clear" w:color="auto" w:fill="auto"/>
             <w:noWrap/>
             <w:vAlign w:val="bottom"/>
             <w:hideMark/>
@@ -16217,7 +16784,6 @@
               <w:bottom w:val="single" w:sz="4" w:space="0" w:color="auto"/>
               <w:right w:val="single" w:sz="4" w:space="0" w:color="auto"/>
             </w:tcBorders>
-            <w:shd w:val="clear" w:color="auto" w:fill="auto"/>
             <w:noWrap/>
             <w:vAlign w:val="bottom"/>
             <w:hideMark/>
@@ -16255,7 +16821,6 @@
               <w:bottom w:val="single" w:sz="4" w:space="0" w:color="auto"/>
               <w:right w:val="single" w:sz="4" w:space="0" w:color="auto"/>
             </w:tcBorders>
-            <w:shd w:val="clear" w:color="auto" w:fill="auto"/>
             <w:noWrap/>
             <w:vAlign w:val="bottom"/>
             <w:hideMark/>
@@ -16775,7 +17340,27 @@
           <w:sz w:val="28"/>
           <w:szCs w:val="32"/>
         </w:rPr>
-        <w:t xml:space="preserve">The learners/users may reconcile the total vAkyams generated at Panchaati, anuvAkam and praSna level. </w:t>
+        <w:t xml:space="preserve">The learners/users may reconcile the total vAkyams generated at Panchaati, anuvAkam and </w:t>
+      </w:r>
+      <w:proofErr w:type="spellStart"/>
+      <w:r>
+        <w:rPr>
+          <w:rFonts w:ascii="Arial" w:hAnsi="Arial" w:cs="Arial"/>
+          <w:color w:val="000000"/>
+          <w:sz w:val="28"/>
+          <w:szCs w:val="32"/>
+        </w:rPr>
+        <w:t>praSna</w:t>
+      </w:r>
+      <w:proofErr w:type="spellEnd"/>
+      <w:r>
+        <w:rPr>
+          <w:rFonts w:ascii="Arial" w:hAnsi="Arial" w:cs="Arial"/>
+          <w:color w:val="000000"/>
+          <w:sz w:val="28"/>
+          <w:szCs w:val="32"/>
+        </w:rPr>
+        <w:t xml:space="preserve"> level. </w:t>
       </w:r>
     </w:p>
     <w:sectPr>
@@ -16789,7 +17374,7 @@
 </file>
 
 <file path=word/numbering.xml><?xml version="1.0" encoding="utf-8"?>
-<w:numbering xmlns:wpc="http://schemas.microsoft.com/office/word/2010/wordprocessingCanvas" xmlns:cx="http://schemas.microsoft.com/office/drawing/2014/chartex" xmlns:cx1="http://schemas.microsoft.com/office/drawing/2015/9/8/chartex" xmlns:cx2="http://schemas.microsoft.com/office/drawing/2015/10/21/chartex" xmlns:cx3="http://schemas.microsoft.com/office/drawing/2016/5/9/chartex" xmlns:cx4="http://schemas.microsoft.com/office/drawing/2016/5/10/chartex" xmlns:cx5="http://schemas.microsoft.com/office/drawing/2016/5/11/chartex" xmlns:cx6="http://schemas.microsoft.com/office/drawing/2016/5/12/chartex" xmlns:cx7="http://schemas.microsoft.com/office/drawing/2016/5/13/chartex" xmlns:cx8="http://schemas.microsoft.com/office/drawing/2016/5/14/chartex" xmlns:mc="http://schemas.openxmlformats.org/markup-compatibility/2006" xmlns:aink="http://schemas.microsoft.com/office/drawing/2016/ink" xmlns:am3d="http://schemas.microsoft.com/office/drawing/2017/model3d" xmlns:o="urn:schemas-microsoft-com:office:office" xmlns:oel="http://schemas.microsoft.com/office/2019/extlst" xmlns:r="http://schemas.openxmlformats.org/officeDocument/2006/relationships" xmlns:m="http://schemas.openxmlformats.org/officeDocument/2006/math" xmlns:v="urn:schemas-microsoft-com:vml" xmlns:wp14="http://schemas.microsoft.com/office/word/2010/wordprocessingDrawing" xmlns:wp="http://schemas.openxmlformats.org/drawingml/2006/wordprocessingDrawing" xmlns:w10="urn:schemas-microsoft-com:office:word" xmlns:w="http://schemas.openxmlformats.org/wordprocessingml/2006/main" xmlns:w14="http://schemas.microsoft.com/office/word/2010/wordml" xmlns:w15="http://schemas.microsoft.com/office/word/2012/wordml" xmlns:w16cex="http://schemas.microsoft.com/office/word/2018/wordml/cex" xmlns:w16cid="http://schemas.microsoft.com/office/word/2016/wordml/cid" xmlns:w16="http://schemas.microsoft.com/office/word/2018/wordml" xmlns:w16sdtdh="http://schemas.microsoft.com/office/word/2020/wordml/sdtdatahash" xmlns:w16se="http://schemas.microsoft.com/office/word/2015/wordml/symex" xmlns:wpg="http://schemas.microsoft.com/office/word/2010/wordprocessingGroup" xmlns:wpi="http://schemas.microsoft.com/office/word/2010/wordprocessingInk" xmlns:wne="http://schemas.microsoft.com/office/word/2006/wordml" xmlns:wps="http://schemas.microsoft.com/office/word/2010/wordprocessingShape" mc:Ignorable="w14 w15 w16se w16cid w16 w16cex w16sdtdh wp14">
+<w:numbering xmlns:wpc="http://schemas.microsoft.com/office/word/2010/wordprocessingCanvas" xmlns:cx="http://schemas.microsoft.com/office/drawing/2014/chartex" xmlns:cx1="http://schemas.microsoft.com/office/drawing/2015/9/8/chartex" xmlns:cx2="http://schemas.microsoft.com/office/drawing/2015/10/21/chartex" xmlns:cx3="http://schemas.microsoft.com/office/drawing/2016/5/9/chartex" xmlns:cx4="http://schemas.microsoft.com/office/drawing/2016/5/10/chartex" xmlns:cx5="http://schemas.microsoft.com/office/drawing/2016/5/11/chartex" xmlns:cx6="http://schemas.microsoft.com/office/drawing/2016/5/12/chartex" xmlns:cx7="http://schemas.microsoft.com/office/drawing/2016/5/13/chartex" xmlns:cx8="http://schemas.microsoft.com/office/drawing/2016/5/14/chartex" xmlns:mc="http://schemas.openxmlformats.org/markup-compatibility/2006" xmlns:aink="http://schemas.microsoft.com/office/drawing/2016/ink" xmlns:am3d="http://schemas.microsoft.com/office/drawing/2017/model3d" xmlns:o="urn:schemas-microsoft-com:office:office" xmlns:oel="http://schemas.microsoft.com/office/2019/extlst" xmlns:r="http://schemas.openxmlformats.org/officeDocument/2006/relationships" xmlns:m="http://schemas.openxmlformats.org/officeDocument/2006/math" xmlns:v="urn:schemas-microsoft-com:vml" xmlns:wp14="http://schemas.microsoft.com/office/word/2010/wordprocessingDrawing" xmlns:wp="http://schemas.openxmlformats.org/drawingml/2006/wordprocessingDrawing" xmlns:w10="urn:schemas-microsoft-com:office:word" xmlns:w="http://schemas.openxmlformats.org/wordprocessingml/2006/main" xmlns:w14="http://schemas.microsoft.com/office/word/2010/wordml" xmlns:w15="http://schemas.microsoft.com/office/word/2012/wordml" xmlns:w16cex="http://schemas.microsoft.com/office/word/2018/wordml/cex" xmlns:w16cid="http://schemas.microsoft.com/office/word/2016/wordml/cid" xmlns:w16="http://schemas.microsoft.com/office/word/2018/wordml" xmlns:w16du="http://schemas.microsoft.com/office/word/2023/wordml/word16du" xmlns:w16sdtdh="http://schemas.microsoft.com/office/word/2020/wordml/sdtdatahash" xmlns:w16sdtfl="http://schemas.microsoft.com/office/word/2024/wordml/sdtformatlock" xmlns:w16se="http://schemas.microsoft.com/office/word/2015/wordml/symex" xmlns:wpg="http://schemas.microsoft.com/office/word/2010/wordprocessingGroup" xmlns:wpi="http://schemas.microsoft.com/office/word/2010/wordprocessingInk" xmlns:wne="http://schemas.microsoft.com/office/word/2006/wordml" xmlns:wps="http://schemas.microsoft.com/office/word/2010/wordprocessingShape" mc:Ignorable="w14 w15 w16se w16cid w16 w16cex w16sdtdh w16sdtfl w16du wp14">
   <w:abstractNum w:abstractNumId="0" w15:restartNumberingAfterBreak="0">
     <w:nsid w:val="08C407C8"/>
     <w:multiLevelType w:val="hybridMultilevel"/>
@@ -18329,7 +18914,7 @@
 </file>
 
 <file path=word/styles.xml><?xml version="1.0" encoding="utf-8"?>
-<w:styles xmlns:mc="http://schemas.openxmlformats.org/markup-compatibility/2006" xmlns:r="http://schemas.openxmlformats.org/officeDocument/2006/relationships" xmlns:w="http://schemas.openxmlformats.org/wordprocessingml/2006/main" xmlns:w14="http://schemas.microsoft.com/office/word/2010/wordml" xmlns:w15="http://schemas.microsoft.com/office/word/2012/wordml" xmlns:w16cex="http://schemas.microsoft.com/office/word/2018/wordml/cex" xmlns:w16cid="http://schemas.microsoft.com/office/word/2016/wordml/cid" xmlns:w16="http://schemas.microsoft.com/office/word/2018/wordml" xmlns:w16sdtdh="http://schemas.microsoft.com/office/word/2020/wordml/sdtdatahash" xmlns:w16se="http://schemas.microsoft.com/office/word/2015/wordml/symex" mc:Ignorable="w14 w15 w16se w16cid w16 w16cex w16sdtdh">
+<w:styles xmlns:mc="http://schemas.openxmlformats.org/markup-compatibility/2006" xmlns:r="http://schemas.openxmlformats.org/officeDocument/2006/relationships" xmlns:w="http://schemas.openxmlformats.org/wordprocessingml/2006/main" xmlns:w14="http://schemas.microsoft.com/office/word/2010/wordml" xmlns:w15="http://schemas.microsoft.com/office/word/2012/wordml" xmlns:w16cex="http://schemas.microsoft.com/office/word/2018/wordml/cex" xmlns:w16cid="http://schemas.microsoft.com/office/word/2016/wordml/cid" xmlns:w16="http://schemas.microsoft.com/office/word/2018/wordml" xmlns:w16du="http://schemas.microsoft.com/office/word/2023/wordml/word16du" xmlns:w16sdtdh="http://schemas.microsoft.com/office/word/2020/wordml/sdtdatahash" xmlns:w16sdtfl="http://schemas.microsoft.com/office/word/2024/wordml/sdtformatlock" xmlns:w16se="http://schemas.microsoft.com/office/word/2015/wordml/symex" mc:Ignorable="w14 w15 w16se w16cid w16 w16cex w16sdtdh w16sdtfl w16du">
   <w:docDefaults>
     <w:rPrDefault>
       <w:rPr>

</xml_diff>